<commit_message>
[Docs] CSRF(docx): 6장에 GET/POST 삭제 curl 실측 표 삽입
- 비교표 뒤에 "curl 검증(실측)" 표 추가: GET 302(삭제), POST 403(차단).
- 브라우저 재현 주의(file:// CORS null, 127.0.0.1 SameSite 차단, localhost 서빙) 반영.
- md(1d5eeae)와 동일 내용. XSD 검증 통과.
</commit_message>
<xml_diff>
--- a/docs/security/05_CSRF.docx
+++ b/docs/security/05_CSRF.docx
@@ -2944,6 +2944,260 @@
       <w:pPr>
         <w:spacing w:after="60"/>
       </w:pPr>
+    </w:p>
+    <w:p>
+      <w:pPr>
+        <w:pStyle w:val="3"/>
+        <w:spacing w:before="200" w:after="80"/>
+      </w:pPr>
+      <w:r>
+        <w:rPr>
+          <w:b/>
+          <w:bCs/>
+          <w:color w:val="2E5496"/>
+        </w:rPr>
+        <w:t xml:space="preserve">curl 검증 (실측, 2026-09-30)</w:t>
+      </w:r>
+    </w:p>
+    <w:p>
+      <w:pPr>
+        <w:spacing w:after="80" w:line="272" w:lineRule="auto"/>
+      </w:pPr>
+      <w:r>
+        <w:t xml:space="preserve">동일하게 세션 쿠키(JSESSIONID)만 보내고 _csrf 토큰은 없이 삭제를 시도한 대비 실험이다. 두 요청은 HTTP 메서드만 다르다.</w:t>
+      </w:r>
+    </w:p>
+    <w:tbl>
+      <w:tblPr>
+        <w:tblW w:w="9000" w:type="dxa"/>
+        <w:tblBorders>
+          <w:top w:val="single" w:sz="4" w:space="0" w:color="BFBFBF"/>
+          <w:left w:val="single" w:sz="4" w:space="0" w:color="BFBFBF"/>
+          <w:bottom w:val="single" w:sz="4" w:space="0" w:color="BFBFBF"/>
+          <w:right w:val="single" w:sz="4" w:space="0" w:color="BFBFBF"/>
+          <w:insideH w:val="single" w:sz="4" w:space="0" w:color="BFBFBF"/>
+          <w:insideV w:val="single" w:sz="4" w:space="0" w:color="BFBFBF"/>
+        </w:tblBorders>
+        <w:tblLook w:val="04A0" w:firstRow="1" w:lastRow="0" w:firstColumn="1" w:lastColumn="0" w:noHBand="0" w:noVBand="1"/>
+      </w:tblPr>
+      <w:tblGrid>
+        <w:gridCol w:w="3400"/>
+        <w:gridCol w:w="2600"/>
+        <w:gridCol w:w="3000"/>
+      </w:tblGrid>
+      <w:tr>
+        <w:tc>
+          <w:tcPr>
+            <w:tcW w:w="3400" w:type="dxa"/>
+            <w:shd w:val="clear" w:color="auto" w:fill="2E5496"/>
+            <w:tcMar>
+              <w:top w:w="40" w:type="dxa"/>
+              <w:left w:w="80" w:type="dxa"/>
+              <w:bottom w:w="40" w:type="dxa"/>
+              <w:right w:w="80" w:type="dxa"/>
+            </w:tcMar>
+          </w:tcPr>
+          <w:p>
+            <w:r>
+              <w:rPr>
+                <w:b/>
+                <w:bCs/>
+                <w:color w:val="FFFFFF"/>
+                <w:sz w:val="18"/>
+                <w:szCs w:val="18"/>
+              </w:rPr>
+              <w:t xml:space="preserve">요청</w:t>
+            </w:r>
+          </w:p>
+        </w:tc>
+        <w:tc>
+          <w:tcPr>
+            <w:tcW w:w="2600" w:type="dxa"/>
+            <w:shd w:val="clear" w:color="auto" w:fill="2E5496"/>
+            <w:tcMar>
+              <w:top w:w="40" w:type="dxa"/>
+              <w:left w:w="80" w:type="dxa"/>
+              <w:bottom w:w="40" w:type="dxa"/>
+              <w:right w:w="80" w:type="dxa"/>
+            </w:tcMar>
+          </w:tcPr>
+          <w:p>
+            <w:r>
+              <w:rPr>
+                <w:b/>
+                <w:bCs/>
+                <w:color w:val="FFFFFF"/>
+                <w:sz w:val="18"/>
+                <w:szCs w:val="18"/>
+              </w:rPr>
+              <w:t xml:space="preserve">전송</w:t>
+            </w:r>
+          </w:p>
+        </w:tc>
+        <w:tc>
+          <w:tcPr>
+            <w:tcW w:w="3000" w:type="dxa"/>
+            <w:shd w:val="clear" w:color="auto" w:fill="2E5496"/>
+            <w:tcMar>
+              <w:top w:w="40" w:type="dxa"/>
+              <w:left w:w="80" w:type="dxa"/>
+              <w:bottom w:w="40" w:type="dxa"/>
+              <w:right w:w="80" w:type="dxa"/>
+            </w:tcMar>
+          </w:tcPr>
+          <w:p>
+            <w:r>
+              <w:rPr>
+                <w:b/>
+                <w:bCs/>
+                <w:color w:val="FFFFFF"/>
+                <w:sz w:val="18"/>
+                <w:szCs w:val="18"/>
+              </w:rPr>
+              <w:t xml:space="preserve">결과</w:t>
+            </w:r>
+          </w:p>
+        </w:tc>
+      </w:tr>
+      <w:tr>
+        <w:tc>
+          <w:tcPr>
+            <w:tcW w:w="3400" w:type="dxa"/>
+            <w:tcMar>
+              <w:top w:w="40" w:type="dxa"/>
+              <w:left w:w="80" w:type="dxa"/>
+              <w:bottom w:w="40" w:type="dxa"/>
+              <w:right w:w="80" w:type="dxa"/>
+            </w:tcMar>
+          </w:tcPr>
+          <w:p>
+            <w:r>
+              <w:rPr>
+                <w:sz w:val="18"/>
+                <w:szCs w:val="18"/>
+              </w:rPr>
+              <w:t xml:space="preserve">GET /users/delete/{id}</w:t>
+            </w:r>
+          </w:p>
+        </w:tc>
+        <w:tc>
+          <w:tcPr>
+            <w:tcW w:w="2600" w:type="dxa"/>
+            <w:tcMar>
+              <w:top w:w="40" w:type="dxa"/>
+              <w:left w:w="80" w:type="dxa"/>
+              <w:bottom w:w="40" w:type="dxa"/>
+              <w:right w:w="80" w:type="dxa"/>
+            </w:tcMar>
+          </w:tcPr>
+          <w:p>
+            <w:r>
+              <w:rPr>
+                <w:sz w:val="18"/>
+                <w:szCs w:val="18"/>
+              </w:rPr>
+              <w:t xml:space="preserve">JSESSIONID만 (토큰X)</w:t>
+            </w:r>
+          </w:p>
+        </w:tc>
+        <w:tc>
+          <w:tcPr>
+            <w:tcW w:w="3000" w:type="dxa"/>
+            <w:tcMar>
+              <w:top w:w="40" w:type="dxa"/>
+              <w:left w:w="80" w:type="dxa"/>
+              <w:bottom w:w="40" w:type="dxa"/>
+              <w:right w:w="80" w:type="dxa"/>
+            </w:tcMar>
+          </w:tcPr>
+          <w:p>
+            <w:r>
+              <w:rPr>
+                <w:color w:val="C00000"/>
+                <w:sz w:val="18"/>
+                <w:szCs w:val="18"/>
+              </w:rPr>
+              <w:t xml:space="preserve">302 → 삭제됨 (GET은 CSRF 미검증)</w:t>
+            </w:r>
+          </w:p>
+        </w:tc>
+      </w:tr>
+      <w:tr>
+        <w:tc>
+          <w:tcPr>
+            <w:tcW w:w="3400" w:type="dxa"/>
+            <w:tcMar>
+              <w:top w:w="40" w:type="dxa"/>
+              <w:left w:w="80" w:type="dxa"/>
+              <w:bottom w:w="40" w:type="dxa"/>
+              <w:right w:w="80" w:type="dxa"/>
+            </w:tcMar>
+          </w:tcPr>
+          <w:p>
+            <w:r>
+              <w:rPr>
+                <w:sz w:val="18"/>
+                <w:szCs w:val="18"/>
+              </w:rPr>
+              <w:t xml:space="preserve">POST /users/delete/{id}</w:t>
+            </w:r>
+          </w:p>
+        </w:tc>
+        <w:tc>
+          <w:tcPr>
+            <w:tcW w:w="2600" w:type="dxa"/>
+            <w:tcMar>
+              <w:top w:w="40" w:type="dxa"/>
+              <w:left w:w="80" w:type="dxa"/>
+              <w:bottom w:w="40" w:type="dxa"/>
+              <w:right w:w="80" w:type="dxa"/>
+            </w:tcMar>
+          </w:tcPr>
+          <w:p>
+            <w:r>
+              <w:rPr>
+                <w:sz w:val="18"/>
+                <w:szCs w:val="18"/>
+              </w:rPr>
+              <w:t xml:space="preserve">JSESSIONID만 (토큰X)</w:t>
+            </w:r>
+          </w:p>
+        </w:tc>
+        <w:tc>
+          <w:tcPr>
+            <w:tcW w:w="3000" w:type="dxa"/>
+            <w:tcMar>
+              <w:top w:w="40" w:type="dxa"/>
+              <w:left w:w="80" w:type="dxa"/>
+              <w:bottom w:w="40" w:type="dxa"/>
+              <w:right w:w="80" w:type="dxa"/>
+            </w:tcMar>
+          </w:tcPr>
+          <w:p>
+            <w:r>
+              <w:rPr>
+                <w:color w:val="2E7D32"/>
+                <w:sz w:val="18"/>
+                <w:szCs w:val="18"/>
+              </w:rPr>
+              <w:t xml:space="preserve">403 → 차단 (POST는 토큰 필수)</w:t>
+            </w:r>
+          </w:p>
+        </w:tc>
+      </w:tr>
+    </w:tbl>
+    <w:p>
+      <w:pPr>
+        <w:spacing w:after="60"/>
+      </w:pPr>
+    </w:p>
+    <w:p>
+      <w:pPr>
+        <w:spacing w:after="80" w:line="272" w:lineRule="auto"/>
+      </w:pPr>
+      <w:r>
+        <w:t xml:space="preserve">참고(브라우저 재현) : &lt;img&gt; 자동 공격은 브라우저 방어 계층 때문에 조건이 까다롭다. file:// 는 Origin이 null 이라 CORS 필터가 거부하고, 127.0.0.1:5500 은 localhost:8080 과 다른 site 라 SameSite=Lax 가 쿠키를 막는다. 브라우저에서 성공시키려면 같은 site(호스트명 localhost)에서 서빙해야 한다. 서버 취약점만 명확히 보려면 curl 이 가장 확실하다.</w:t>
+      </w:r>
     </w:p>
     <w:p>
       <w:pPr>

</xml_diff>

<commit_message>
[Docs] CSRF: curl 재현 명령 해설 추가 (md 표 + docx 명령/해설)
- md 5-2: 5단계 명령 해설 표 추가(각 curl 이 하는 일/이유), python -c·grep 보조 설명.
- docx 6장: 그동안 없던 curl 명령 코드블록 + 5단계 해설 표를 결과표 앞에 삽입.
- 실제 공격은 마지막 GET 한 줄뿐이고 1~4는 세션·대상 준비임을 명시.
</commit_message>
<xml_diff>
--- a/docs/security/05_CSRF.docx
+++ b/docs/security/05_CSRF.docx
@@ -43,15 +43,7 @@
         <w:rPr>
           <w:color w:val="595959"/>
         </w:rPr>
-        <w:t xml:space="preserve">Cross-Site Request Forgery </w:t>
-      </w:r>
-      <w:bookmarkStart w:id="0" w:name="_GoBack"/>
-      <w:bookmarkEnd w:id="0"/>
-      <w:r>
-        <w:rPr>
-          <w:color w:val="595959"/>
-        </w:rPr>
-        <w:t xml:space="preserve"> / OWASP #1(접근제어)</w:t>
+        <w:t>Cross-Site Request Forgery  / OWASP #1(접근제어)</w:t>
       </w:r>
     </w:p>
     <w:p>
@@ -466,7 +458,16 @@
         <w:spacing w:after="90" w:line="272" w:lineRule="auto"/>
       </w:pPr>
       <w:r>
-        <w:t>SecurityConfig 의 세션(폼 로그인) 체인에 CSRF 가 비활성화되어 있었다.</w:t>
+        <w:t>SecurityConfig 의 세션(폼 로그인) 체인에 CSRF 가 비활성화</w:t>
+      </w:r>
+      <w:r>
+        <w:rPr>
+          <w:rFonts w:hint="eastAsia"/>
+        </w:rPr>
+        <w:t xml:space="preserve"> </w:t>
+      </w:r>
+      <w:r>
+        <w:t>되어 있었다.</w:t>
       </w:r>
     </w:p>
     <w:p>
@@ -2449,7 +2450,7 @@
           <w:sz w:val="18"/>
           <w:szCs w:val="18"/>
         </w:rPr>
-        <w:t xml:space="preserve">public String deleteUser(@PathVariable long id) { deleteById(id); return "redirect:/users/index"; }</w:t>
+        <w:t>public String deleteUser(@PathVariable long id) { deleteById(id); return "redirect:/users/index"; }</w:t>
       </w:r>
     </w:p>
     <w:p>
@@ -2504,7 +2505,7 @@
           <w:sz w:val="18"/>
           <w:szCs w:val="18"/>
         </w:rPr>
-        <w:t xml:space="preserve">@GetMapping("/delete/{id}")</w:t>
+        <w:t>@GetMapping("/delete/{id}")</w:t>
       </w:r>
     </w:p>
     <w:p>
@@ -2521,7 +2522,7 @@
           <w:sz w:val="18"/>
           <w:szCs w:val="18"/>
         </w:rPr>
-        <w:t xml:space="preserve">public String deleteUserLegacyVulnerable(@PathVariable long id) { deleteById(id); return "redirect:/users/index"; }</w:t>
+        <w:t>public String deleteUserLegacyVulnerable(@PathVariable long id) { deleteById(id); return "redirect:/users/index"; }</w:t>
       </w:r>
     </w:p>
     <w:p>
@@ -2563,7 +2564,7 @@
           <w:sz w:val="18"/>
           <w:szCs w:val="18"/>
         </w:rPr>
-        <w:t xml:space="preserve">&lt;img src="http://localhost:8080/users/delete/1" width="1" height="1" /&gt;</w:t>
+        <w:t>&lt;img src="http://localhost:8080/users/delete/1" width="1" height="1" /&gt;</w:t>
       </w:r>
     </w:p>
     <w:p>
@@ -2576,9 +2577,6 @@
           <w:bCs/>
         </w:rPr>
         <w:t xml:space="preserve">재현 절차 </w:t>
-      </w:r>
-      <w:r>
-        <w:t xml:space="preserve"/>
       </w:r>
     </w:p>
     <w:p>
@@ -2694,7 +2692,7 @@
                 <w:sz w:val="18"/>
                 <w:szCs w:val="18"/>
               </w:rPr>
-              <w:t xml:space="preserve">동작</w:t>
+              <w:t>동작</w:t>
             </w:r>
           </w:p>
         </w:tc>
@@ -2785,7 +2783,7 @@
                 <w:sz w:val="18"/>
                 <w:szCs w:val="18"/>
               </w:rPr>
-              <w:t xml:space="preserve">405 (거부)</w:t>
+              <w:t>405 (거부)</w:t>
             </w:r>
           </w:p>
         </w:tc>
@@ -2806,7 +2804,7 @@
                 <w:sz w:val="18"/>
                 <w:szCs w:val="18"/>
               </w:rPr>
-              <w:t xml:space="preserve">302 (삭제됨)</w:t>
+              <w:t>302 (삭제됨)</w:t>
             </w:r>
           </w:p>
         </w:tc>
@@ -2870,7 +2868,7 @@
                 <w:sz w:val="18"/>
                 <w:szCs w:val="18"/>
               </w:rPr>
-              <w:t xml:space="preserve">403 (차단)</w:t>
+              <w:t>403 (차단)</w:t>
             </w:r>
           </w:p>
         </w:tc>
@@ -2913,7 +2911,7 @@
                 <w:sz w:val="18"/>
                 <w:szCs w:val="18"/>
               </w:rPr>
-              <w:t xml:space="preserve">302 (삭제됨)</w:t>
+              <w:t>302 (삭제됨)</w:t>
             </w:r>
           </w:p>
         </w:tc>
@@ -2934,7 +2932,7 @@
                 <w:sz w:val="18"/>
                 <w:szCs w:val="18"/>
               </w:rPr>
-              <w:t xml:space="preserve">302 (삭제됨)</w:t>
+              <w:t>302 (삭제됨)</w:t>
             </w:r>
           </w:p>
         </w:tc>
@@ -2956,8 +2954,692 @@
           <w:bCs/>
           <w:color w:val="2E5496"/>
         </w:rPr>
-        <w:t xml:space="preserve">curl 검증 (실측, 2026-09-30)</w:t>
-      </w:r>
+        <w:lastRenderedPageBreak/>
+        <w:t xml:space="preserve">curl </w:t>
+      </w:r>
+      <w:r>
+        <w:rPr>
+          <w:rFonts w:hint="eastAsia"/>
+          <w:b/>
+          <w:bCs/>
+          <w:color w:val="2E5496"/>
+        </w:rPr>
+        <w:t xml:space="preserve">로 </w:t>
+      </w:r>
+      <w:r>
+        <w:rPr>
+          <w:b/>
+          <w:bCs/>
+          <w:color w:val="2E5496"/>
+        </w:rPr>
+        <w:t>검증</w:t>
+      </w:r>
+      <w:bookmarkStart w:id="0" w:name="_GoBack"/>
+      <w:bookmarkEnd w:id="0"/>
+      <w:r>
+        <w:rPr>
+          <w:rFonts w:hint="eastAsia"/>
+          <w:b/>
+          <w:bCs/>
+          <w:color w:val="2E5496"/>
+        </w:rPr>
+        <w:t>하기</w:t>
+      </w:r>
+    </w:p>
+    <w:p>
+      <w:pPr>
+        <w:spacing w:after="80" w:line="272" w:lineRule="auto"/>
+      </w:pPr>
+      <w:r>
+        <w:t xml:space="preserve">아래 curl 로 재현한다. 실제 공격은 마지막 GET 한 줄(5)뿐이고, 앞 단계(1~4)는 그 조건(로그인 세션·삭제 대상)을 curl 로 갖추는 준비다. python -c 는 응답 JSON 에서 값 하나(accessToken/id)를, grep 은 HTML 에서 _csrf 값을 뽑는다.</w:t>
+      </w:r>
+    </w:p>
+    <w:p>
+      <w:pPr>
+        <w:pBdr>
+          <w:top w:val="single" w:sz="4" w:space="3" w:color="D9D9D9"/>
+          <w:left w:val="single" w:sz="18" w:space="6" w:color="C0C0C0"/>
+        </w:pBdr>
+        <w:shd w:val="clear" w:color="auto" w:fill="F4F4F4"/>
+      </w:pPr>
+      <w:r>
+        <w:rPr>
+          <w:rFonts w:ascii="Consolas" w:hAnsi="Consolas"/>
+          <w:sz w:val="16"/>
+          <w:szCs w:val="16"/>
+        </w:rPr>
+        <w:t xml:space="preserve">B=http://localhost:8080; JAR=cookies.txt</w:t>
+      </w:r>
+    </w:p>
+    <w:p>
+      <w:pPr>
+        <w:pBdr>
+          <w:left w:val="single" w:sz="18" w:space="6" w:color="C0C0C0"/>
+        </w:pBdr>
+        <w:shd w:val="clear" w:color="auto" w:fill="F4F4F4"/>
+      </w:pPr>
+      <w:r>
+        <w:rPr>
+          <w:rFonts w:ascii="Consolas" w:hAnsi="Consolas"/>
+          <w:sz w:val="16"/>
+          <w:szCs w:val="16"/>
+        </w:rPr>
+        <w:t xml:space="preserve"># 1) JWT 발급 (admin) → /api/users 생성에 필요</w:t>
+      </w:r>
+    </w:p>
+    <w:p>
+      <w:pPr>
+        <w:pBdr>
+          <w:left w:val="single" w:sz="18" w:space="6" w:color="C0C0C0"/>
+        </w:pBdr>
+        <w:shd w:val="clear" w:color="auto" w:fill="F4F4F4"/>
+      </w:pPr>
+      <w:r>
+        <w:rPr>
+          <w:rFonts w:ascii="Consolas" w:hAnsi="Consolas"/>
+          <w:sz w:val="16"/>
+          <w:szCs w:val="16"/>
+        </w:rPr>
+        <w:t xml:space="preserve">TOKEN=$(curl -s -X POST "$B/api/userinfos/login" -H "Content-Type: application/json" \</w:t>
+      </w:r>
+    </w:p>
+    <w:p>
+      <w:pPr>
+        <w:pBdr>
+          <w:left w:val="single" w:sz="18" w:space="6" w:color="C0C0C0"/>
+        </w:pBdr>
+        <w:shd w:val="clear" w:color="auto" w:fill="F4F4F4"/>
+      </w:pPr>
+      <w:r>
+        <w:rPr>
+          <w:rFonts w:ascii="Consolas" w:hAnsi="Consolas"/>
+          <w:sz w:val="16"/>
+          <w:szCs w:val="16"/>
+        </w:rPr>
+        <w:t xml:space="preserve">  -d '{"email":"admin@aa.com","password":"pwd1"}' | python -c "...['accessToken']")</w:t>
+      </w:r>
+    </w:p>
+    <w:p>
+      <w:pPr>
+        <w:pBdr>
+          <w:left w:val="single" w:sz="18" w:space="6" w:color="C0C0C0"/>
+        </w:pBdr>
+        <w:shd w:val="clear" w:color="auto" w:fill="F4F4F4"/>
+      </w:pPr>
+      <w:r>
+        <w:rPr>
+          <w:rFonts w:ascii="Consolas" w:hAnsi="Consolas"/>
+          <w:sz w:val="16"/>
+          <w:szCs w:val="16"/>
+        </w:rPr>
+        <w:t xml:space="preserve"># 2) 삭제할 테스트 User 생성 → 생성된 id 를 $ID 에</w:t>
+      </w:r>
+    </w:p>
+    <w:p>
+      <w:pPr>
+        <w:pBdr>
+          <w:left w:val="single" w:sz="18" w:space="6" w:color="C0C0C0"/>
+        </w:pBdr>
+        <w:shd w:val="clear" w:color="auto" w:fill="F4F4F4"/>
+      </w:pPr>
+      <w:r>
+        <w:rPr>
+          <w:rFonts w:ascii="Consolas" w:hAnsi="Consolas"/>
+          <w:sz w:val="16"/>
+          <w:szCs w:val="16"/>
+        </w:rPr>
+        <w:t xml:space="preserve">ID=$(curl -s -X POST "$B/api/users" -H "Authorization: Bearer $TOKEN" -H "Content-Type: application/json" \</w:t>
+      </w:r>
+    </w:p>
+    <w:p>
+      <w:pPr>
+        <w:pBdr>
+          <w:left w:val="single" w:sz="18" w:space="6" w:color="C0C0C0"/>
+        </w:pBdr>
+        <w:shd w:val="clear" w:color="auto" w:fill="F4F4F4"/>
+      </w:pPr>
+      <w:r>
+        <w:rPr>
+          <w:rFonts w:ascii="Consolas" w:hAnsi="Consolas"/>
+          <w:sz w:val="16"/>
+          <w:szCs w:val="16"/>
+        </w:rPr>
+        <w:t xml:space="preserve">  -d '{"name":"victim","email":"victim@test.local"}' | python -c "...['id']")</w:t>
+      </w:r>
+    </w:p>
+    <w:p>
+      <w:pPr>
+        <w:pBdr>
+          <w:left w:val="single" w:sz="18" w:space="6" w:color="C0C0C0"/>
+        </w:pBdr>
+        <w:shd w:val="clear" w:color="auto" w:fill="F4F4F4"/>
+      </w:pPr>
+      <w:r>
+        <w:rPr>
+          <w:rFonts w:ascii="Consolas" w:hAnsi="Consolas"/>
+          <w:sz w:val="16"/>
+          <w:szCs w:val="16"/>
+        </w:rPr>
+        <w:t xml:space="preserve"># 3) 로그인용 _csrf 추출 (CSRF 활성이라 로그인에도 필요)</w:t>
+      </w:r>
+    </w:p>
+    <w:p>
+      <w:pPr>
+        <w:pBdr>
+          <w:left w:val="single" w:sz="18" w:space="6" w:color="C0C0C0"/>
+        </w:pBdr>
+        <w:shd w:val="clear" w:color="auto" w:fill="F4F4F4"/>
+      </w:pPr>
+      <w:r>
+        <w:rPr>
+          <w:rFonts w:ascii="Consolas" w:hAnsi="Consolas"/>
+          <w:sz w:val="16"/>
+          <w:szCs w:val="16"/>
+        </w:rPr>
+        <w:t xml:space="preserve">CSRF=$(curl -s -c $JAR "$B/login" | grep -oP 'name="_csrf"[^&gt;]*value="\K[^"]+')</w:t>
+      </w:r>
+    </w:p>
+    <w:p>
+      <w:pPr>
+        <w:pBdr>
+          <w:left w:val="single" w:sz="18" w:space="6" w:color="C0C0C0"/>
+        </w:pBdr>
+        <w:shd w:val="clear" w:color="auto" w:fill="F4F4F4"/>
+      </w:pPr>
+      <w:r>
+        <w:rPr>
+          <w:rFonts w:ascii="Consolas" w:hAnsi="Consolas"/>
+          <w:sz w:val="16"/>
+          <w:szCs w:val="16"/>
+        </w:rPr>
+        <w:t xml:space="preserve"># 4) 세션 로그인 → 응답 쿠키 JSESSIONID 저장(302)</w:t>
+      </w:r>
+    </w:p>
+    <w:p>
+      <w:pPr>
+        <w:pBdr>
+          <w:left w:val="single" w:sz="18" w:space="6" w:color="C0C0C0"/>
+        </w:pBdr>
+        <w:shd w:val="clear" w:color="auto" w:fill="F4F4F4"/>
+      </w:pPr>
+      <w:r>
+        <w:rPr>
+          <w:rFonts w:ascii="Consolas" w:hAnsi="Consolas"/>
+          <w:sz w:val="16"/>
+          <w:szCs w:val="16"/>
+        </w:rPr>
+        <w:t xml:space="preserve">curl -s -b $JAR -c $JAR -X POST "$B/login-process" \</w:t>
+      </w:r>
+    </w:p>
+    <w:p>
+      <w:pPr>
+        <w:pBdr>
+          <w:left w:val="single" w:sz="18" w:space="6" w:color="C0C0C0"/>
+        </w:pBdr>
+        <w:shd w:val="clear" w:color="auto" w:fill="F4F4F4"/>
+      </w:pPr>
+      <w:r>
+        <w:rPr>
+          <w:rFonts w:ascii="Consolas" w:hAnsi="Consolas"/>
+          <w:sz w:val="16"/>
+          <w:szCs w:val="16"/>
+        </w:rPr>
+        <w:t xml:space="preserve">  --data-urlencode "username=user@aa.com" --data-urlencode "password=pwd2" --data-urlencode "_csrf=$CSRF"</w:t>
+      </w:r>
+    </w:p>
+    <w:p>
+      <w:pPr>
+        <w:pBdr>
+          <w:left w:val="single" w:sz="18" w:space="6" w:color="C0C0C0"/>
+        </w:pBdr>
+        <w:shd w:val="clear" w:color="auto" w:fill="F4F4F4"/>
+      </w:pPr>
+      <w:r>
+        <w:rPr>
+          <w:rFonts w:ascii="Consolas" w:hAnsi="Consolas"/>
+          <w:sz w:val="16"/>
+          <w:szCs w:val="16"/>
+        </w:rPr>
+        <w:t xml:space="preserve"># 5) 세션 쿠키만으로 GET 삭제 = &lt;img&gt; 재현</w:t>
+      </w:r>
+    </w:p>
+    <w:p>
+      <w:pPr>
+        <w:pBdr>
+          <w:left w:val="single" w:sz="18" w:space="6" w:color="C0C0C0"/>
+          <w:bottom w:val="single" w:sz="4" w:space="3" w:color="D9D9D9"/>
+        </w:pBdr>
+        <w:shd w:val="clear" w:color="auto" w:fill="F4F4F4"/>
+      </w:pPr>
+      <w:r>
+        <w:rPr>
+          <w:rFonts w:ascii="Consolas" w:hAnsi="Consolas"/>
+          <w:sz w:val="16"/>
+          <w:szCs w:val="16"/>
+        </w:rPr>
+        <w:t xml:space="preserve">curl -s -o /dev/null -w "GET delete -&gt; %{http_code}\n" -b $JAR "$B/users/delete/$ID"   # 302 = 삭제됨</w:t>
+      </w:r>
+    </w:p>
+    <w:p>
+      <w:pPr>
+        <w:spacing w:after="80" w:line="272" w:lineRule="auto"/>
+      </w:pPr>
+      <w:r>
+        <w:t xml:space="preserve">명령 해설 :</w:t>
+      </w:r>
+    </w:p>
+    <w:tbl>
+      <w:tblPr>
+        <w:tblW w:w="9000" w:type="dxa"/>
+        <w:tblBorders>
+          <w:top w:val="single" w:sz="4" w:space="0" w:color="BFBFBF"/>
+          <w:left w:val="single" w:sz="4" w:space="0" w:color="BFBFBF"/>
+          <w:bottom w:val="single" w:sz="4" w:space="0" w:color="BFBFBF"/>
+          <w:right w:val="single" w:sz="4" w:space="0" w:color="BFBFBF"/>
+          <w:insideH w:val="single" w:sz="4" w:space="0" w:color="BFBFBF"/>
+          <w:insideV w:val="single" w:sz="4" w:space="0" w:color="BFBFBF"/>
+        </w:tblBorders>
+        <w:tblLook w:val="04A0" w:firstRow="1" w:lastRow="0" w:firstColumn="1" w:lastColumn="0" w:noHBand="0" w:noVBand="1"/>
+      </w:tblPr>
+      <w:tblGrid>
+        <w:gridCol w:w="700"/>
+        <w:gridCol w:w="3300"/>
+        <w:gridCol w:w="5000"/>
+      </w:tblGrid>
+      <w:tr>
+        <w:tc>
+          <w:tcPr>
+            <w:tcW w:w="700" w:type="dxa"/>
+            <w:shd w:val="clear" w:color="auto" w:fill="2E5496"/>
+            <w:tcMar>
+              <w:top w:w="30" w:type="dxa"/>
+              <w:left w:w="70" w:type="dxa"/>
+              <w:bottom w:w="30" w:type="dxa"/>
+              <w:right w:w="70" w:type="dxa"/>
+            </w:tcMar>
+          </w:tcPr>
+          <w:p>
+            <w:r>
+              <w:rPr>
+                <w:b/>
+                <w:bCs/>
+                <w:color w:val="FFFFFF"/>
+                <w:sz w:val="16"/>
+                <w:szCs w:val="16"/>
+              </w:rPr>
+              <w:t xml:space="preserve">단계</w:t>
+            </w:r>
+          </w:p>
+        </w:tc>
+        <w:tc>
+          <w:tcPr>
+            <w:tcW w:w="3300" w:type="dxa"/>
+            <w:shd w:val="clear" w:color="auto" w:fill="2E5496"/>
+            <w:tcMar>
+              <w:top w:w="30" w:type="dxa"/>
+              <w:left w:w="70" w:type="dxa"/>
+              <w:bottom w:w="30" w:type="dxa"/>
+              <w:right w:w="70" w:type="dxa"/>
+            </w:tcMar>
+          </w:tcPr>
+          <w:p>
+            <w:r>
+              <w:rPr>
+                <w:b/>
+                <w:bCs/>
+                <w:color w:val="FFFFFF"/>
+                <w:sz w:val="16"/>
+                <w:szCs w:val="16"/>
+              </w:rPr>
+              <w:t xml:space="preserve">명령</w:t>
+            </w:r>
+          </w:p>
+        </w:tc>
+        <w:tc>
+          <w:tcPr>
+            <w:tcW w:w="5000" w:type="dxa"/>
+            <w:shd w:val="clear" w:color="auto" w:fill="2E5496"/>
+            <w:tcMar>
+              <w:top w:w="30" w:type="dxa"/>
+              <w:left w:w="70" w:type="dxa"/>
+              <w:bottom w:w="30" w:type="dxa"/>
+              <w:right w:w="70" w:type="dxa"/>
+            </w:tcMar>
+          </w:tcPr>
+          <w:p>
+            <w:r>
+              <w:rPr>
+                <w:b/>
+                <w:bCs/>
+                <w:color w:val="FFFFFF"/>
+                <w:sz w:val="16"/>
+                <w:szCs w:val="16"/>
+              </w:rPr>
+              <w:t xml:space="preserve">하는 일 / 이유</w:t>
+            </w:r>
+          </w:p>
+        </w:tc>
+      </w:tr>
+      <w:tr>
+        <w:tc>
+          <w:tcPr>
+            <w:tcW w:w="700" w:type="dxa"/>
+            <w:tcMar>
+              <w:top w:w="30" w:type="dxa"/>
+              <w:left w:w="70" w:type="dxa"/>
+              <w:bottom w:w="30" w:type="dxa"/>
+              <w:right w:w="70" w:type="dxa"/>
+            </w:tcMar>
+          </w:tcPr>
+          <w:p>
+            <w:r>
+              <w:rPr>
+                <w:sz w:val="16"/>
+                <w:szCs w:val="16"/>
+              </w:rPr>
+              <w:t xml:space="preserve">1</w:t>
+            </w:r>
+          </w:p>
+        </w:tc>
+        <w:tc>
+          <w:tcPr>
+            <w:tcW w:w="3300" w:type="dxa"/>
+            <w:tcMar>
+              <w:top w:w="30" w:type="dxa"/>
+              <w:left w:w="70" w:type="dxa"/>
+              <w:bottom w:w="30" w:type="dxa"/>
+              <w:right w:w="70" w:type="dxa"/>
+            </w:tcMar>
+          </w:tcPr>
+          <w:p>
+            <w:r>
+              <w:rPr>
+                <w:rFonts w:ascii="Consolas" w:hAnsi="Consolas"/>
+                <w:sz w:val="16"/>
+                <w:szCs w:val="16"/>
+              </w:rPr>
+              <w:t xml:space="preserve">TOKEN=…/login</w:t>
+            </w:r>
+          </w:p>
+        </w:tc>
+        <w:tc>
+          <w:tcPr>
+            <w:tcW w:w="5000" w:type="dxa"/>
+            <w:tcMar>
+              <w:top w:w="30" w:type="dxa"/>
+              <w:left w:w="70" w:type="dxa"/>
+              <w:bottom w:w="30" w:type="dxa"/>
+              <w:right w:w="70" w:type="dxa"/>
+            </w:tcMar>
+          </w:tcPr>
+          <w:p>
+            <w:r>
+              <w:rPr>
+                <w:sz w:val="16"/>
+                <w:szCs w:val="16"/>
+              </w:rPr>
+              <w:t xml:space="preserve">관리자 JWT 발급. User 생성 API(/api/users)가 인증을 요구하므로 먼저 토큰을 받는다</w:t>
+            </w:r>
+          </w:p>
+        </w:tc>
+      </w:tr>
+      <w:tr>
+        <w:tc>
+          <w:tcPr>
+            <w:tcW w:w="700" w:type="dxa"/>
+            <w:tcMar>
+              <w:top w:w="30" w:type="dxa"/>
+              <w:left w:w="70" w:type="dxa"/>
+              <w:bottom w:w="30" w:type="dxa"/>
+              <w:right w:w="70" w:type="dxa"/>
+            </w:tcMar>
+          </w:tcPr>
+          <w:p>
+            <w:r>
+              <w:rPr>
+                <w:sz w:val="16"/>
+                <w:szCs w:val="16"/>
+              </w:rPr>
+              <w:t xml:space="preserve">2</w:t>
+            </w:r>
+          </w:p>
+        </w:tc>
+        <w:tc>
+          <w:tcPr>
+            <w:tcW w:w="3300" w:type="dxa"/>
+            <w:tcMar>
+              <w:top w:w="30" w:type="dxa"/>
+              <w:left w:w="70" w:type="dxa"/>
+              <w:bottom w:w="30" w:type="dxa"/>
+              <w:right w:w="70" w:type="dxa"/>
+            </w:tcMar>
+          </w:tcPr>
+          <w:p>
+            <w:r>
+              <w:rPr>
+                <w:rFonts w:ascii="Consolas" w:hAnsi="Consolas"/>
+                <w:sz w:val="16"/>
+                <w:szCs w:val="16"/>
+              </w:rPr>
+              <w:t xml:space="preserve">ID=…/api/users</w:t>
+            </w:r>
+          </w:p>
+        </w:tc>
+        <w:tc>
+          <w:tcPr>
+            <w:tcW w:w="5000" w:type="dxa"/>
+            <w:tcMar>
+              <w:top w:w="30" w:type="dxa"/>
+              <w:left w:w="70" w:type="dxa"/>
+              <w:bottom w:w="30" w:type="dxa"/>
+              <w:right w:w="70" w:type="dxa"/>
+            </w:tcMar>
+          </w:tcPr>
+          <w:p>
+            <w:r>
+              <w:rPr>
+                <w:sz w:val="16"/>
+                <w:szCs w:val="16"/>
+              </w:rPr>
+              <w:t xml:space="preserve">삭제할 테스트 User 생성, 응답 JSON 의 id 를 $ID 에 저장(실데이터 보호)</w:t>
+            </w:r>
+          </w:p>
+        </w:tc>
+      </w:tr>
+      <w:tr>
+        <w:tc>
+          <w:tcPr>
+            <w:tcW w:w="700" w:type="dxa"/>
+            <w:tcMar>
+              <w:top w:w="30" w:type="dxa"/>
+              <w:left w:w="70" w:type="dxa"/>
+              <w:bottom w:w="30" w:type="dxa"/>
+              <w:right w:w="70" w:type="dxa"/>
+            </w:tcMar>
+          </w:tcPr>
+          <w:p>
+            <w:r>
+              <w:rPr>
+                <w:sz w:val="16"/>
+                <w:szCs w:val="16"/>
+              </w:rPr>
+              <w:t xml:space="preserve">3</w:t>
+            </w:r>
+          </w:p>
+        </w:tc>
+        <w:tc>
+          <w:tcPr>
+            <w:tcW w:w="3300" w:type="dxa"/>
+            <w:tcMar>
+              <w:top w:w="30" w:type="dxa"/>
+              <w:left w:w="70" w:type="dxa"/>
+              <w:bottom w:w="30" w:type="dxa"/>
+              <w:right w:w="70" w:type="dxa"/>
+            </w:tcMar>
+          </w:tcPr>
+          <w:p>
+            <w:r>
+              <w:rPr>
+                <w:rFonts w:ascii="Consolas" w:hAnsi="Consolas"/>
+                <w:sz w:val="16"/>
+                <w:szCs w:val="16"/>
+              </w:rPr>
+              <w:t xml:space="preserve">CSRF=…/login</w:t>
+            </w:r>
+          </w:p>
+        </w:tc>
+        <w:tc>
+          <w:tcPr>
+            <w:tcW w:w="5000" w:type="dxa"/>
+            <w:tcMar>
+              <w:top w:w="30" w:type="dxa"/>
+              <w:left w:w="70" w:type="dxa"/>
+              <w:bottom w:w="30" w:type="dxa"/>
+              <w:right w:w="70" w:type="dxa"/>
+            </w:tcMar>
+          </w:tcPr>
+          <w:p>
+            <w:r>
+              <w:rPr>
+                <w:sz w:val="16"/>
+                <w:szCs w:val="16"/>
+              </w:rPr>
+              <w:t xml:space="preserve">로그인 페이지의 hidden _csrf 값 추출. CSRF 가 켜져 있어 로그인 POST 에도 토큰이 필요</w:t>
+            </w:r>
+          </w:p>
+        </w:tc>
+      </w:tr>
+      <w:tr>
+        <w:tc>
+          <w:tcPr>
+            <w:tcW w:w="700" w:type="dxa"/>
+            <w:tcMar>
+              <w:top w:w="30" w:type="dxa"/>
+              <w:left w:w="70" w:type="dxa"/>
+              <w:bottom w:w="30" w:type="dxa"/>
+              <w:right w:w="70" w:type="dxa"/>
+            </w:tcMar>
+          </w:tcPr>
+          <w:p>
+            <w:r>
+              <w:rPr>
+                <w:sz w:val="16"/>
+                <w:szCs w:val="16"/>
+              </w:rPr>
+              <w:t xml:space="preserve">4</w:t>
+            </w:r>
+          </w:p>
+        </w:tc>
+        <w:tc>
+          <w:tcPr>
+            <w:tcW w:w="3300" w:type="dxa"/>
+            <w:tcMar>
+              <w:top w:w="30" w:type="dxa"/>
+              <w:left w:w="70" w:type="dxa"/>
+              <w:bottom w:w="30" w:type="dxa"/>
+              <w:right w:w="70" w:type="dxa"/>
+            </w:tcMar>
+          </w:tcPr>
+          <w:p>
+            <w:r>
+              <w:rPr>
+                <w:rFonts w:ascii="Consolas" w:hAnsi="Consolas"/>
+                <w:sz w:val="16"/>
+                <w:szCs w:val="16"/>
+              </w:rPr>
+              <w:t xml:space="preserve">…/login-process</w:t>
+            </w:r>
+          </w:p>
+        </w:tc>
+        <w:tc>
+          <w:tcPr>
+            <w:tcW w:w="5000" w:type="dxa"/>
+            <w:tcMar>
+              <w:top w:w="30" w:type="dxa"/>
+              <w:left w:w="70" w:type="dxa"/>
+              <w:bottom w:w="30" w:type="dxa"/>
+              <w:right w:w="70" w:type="dxa"/>
+            </w:tcMar>
+          </w:tcPr>
+          <w:p>
+            <w:r>
+              <w:rPr>
+                <w:sz w:val="16"/>
+                <w:szCs w:val="16"/>
+              </w:rPr>
+              <w:t xml:space="preserve">username·password·_csrf 로 세션 로그인 → 쿠키 JSESSIONID 획득(302)</w:t>
+            </w:r>
+          </w:p>
+        </w:tc>
+      </w:tr>
+      <w:tr>
+        <w:tc>
+          <w:tcPr>
+            <w:tcW w:w="700" w:type="dxa"/>
+            <w:tcMar>
+              <w:top w:w="30" w:type="dxa"/>
+              <w:left w:w="70" w:type="dxa"/>
+              <w:bottom w:w="30" w:type="dxa"/>
+              <w:right w:w="70" w:type="dxa"/>
+            </w:tcMar>
+          </w:tcPr>
+          <w:p>
+            <w:r>
+              <w:rPr>
+                <w:sz w:val="16"/>
+                <w:szCs w:val="16"/>
+              </w:rPr>
+              <w:t xml:space="preserve">5</w:t>
+            </w:r>
+          </w:p>
+        </w:tc>
+        <w:tc>
+          <w:tcPr>
+            <w:tcW w:w="3300" w:type="dxa"/>
+            <w:tcMar>
+              <w:top w:w="30" w:type="dxa"/>
+              <w:left w:w="70" w:type="dxa"/>
+              <w:bottom w:w="30" w:type="dxa"/>
+              <w:right w:w="70" w:type="dxa"/>
+            </w:tcMar>
+          </w:tcPr>
+          <w:p>
+            <w:r>
+              <w:rPr>
+                <w:rFonts w:ascii="Consolas" w:hAnsi="Consolas"/>
+                <w:sz w:val="16"/>
+                <w:szCs w:val="16"/>
+              </w:rPr>
+              <w:t xml:space="preserve">…/users/delete/$ID</w:t>
+            </w:r>
+          </w:p>
+        </w:tc>
+        <w:tc>
+          <w:tcPr>
+            <w:tcW w:w="5000" w:type="dxa"/>
+            <w:tcMar>
+              <w:top w:w="30" w:type="dxa"/>
+              <w:left w:w="70" w:type="dxa"/>
+              <w:bottom w:w="30" w:type="dxa"/>
+              <w:right w:w="70" w:type="dxa"/>
+            </w:tcMar>
+          </w:tcPr>
+          <w:p>
+            <w:r>
+              <w:rPr>
+                <w:sz w:val="16"/>
+                <w:szCs w:val="16"/>
+              </w:rPr>
+              <w:t xml:space="preserve">세션 쿠키만(-b $JAR, _csrf 없음) 실어 GET 삭제. GET 이라 토큰 검증을 건너뛰어 302 삭제 = &lt;img&gt; 가 하는 일</w:t>
+            </w:r>
+          </w:p>
+        </w:tc>
+      </w:tr>
+    </w:tbl>
+    <w:p>
+      <w:pPr>
+        <w:spacing w:after="60"/>
+      </w:pPr>
     </w:p>
     <w:p>
       <w:pPr>
@@ -3006,7 +3688,7 @@
                 <w:sz w:val="18"/>
                 <w:szCs w:val="18"/>
               </w:rPr>
-              <w:t xml:space="preserve">요청</w:t>
+              <w:t>요청</w:t>
             </w:r>
           </w:p>
         </w:tc>
@@ -3030,7 +3712,7 @@
                 <w:sz w:val="18"/>
                 <w:szCs w:val="18"/>
               </w:rPr>
-              <w:t xml:space="preserve">전송</w:t>
+              <w:t>전송</w:t>
             </w:r>
           </w:p>
         </w:tc>
@@ -3054,7 +3736,7 @@
                 <w:sz w:val="18"/>
                 <w:szCs w:val="18"/>
               </w:rPr>
-              <w:t xml:space="preserve">결과</w:t>
+              <w:t>결과</w:t>
             </w:r>
           </w:p>
         </w:tc>
@@ -3076,7 +3758,7 @@
                 <w:sz w:val="18"/>
                 <w:szCs w:val="18"/>
               </w:rPr>
-              <w:t xml:space="preserve">GET /users/delete/{id}</w:t>
+              <w:t>GET /users/delete/{id}</w:t>
             </w:r>
           </w:p>
         </w:tc>
@@ -3139,7 +3821,7 @@
                 <w:sz w:val="18"/>
                 <w:szCs w:val="18"/>
               </w:rPr>
-              <w:t xml:space="preserve">POST /users/delete/{id}</w:t>
+              <w:t>POST /users/delete/{id}</w:t>
             </w:r>
           </w:p>
         </w:tc>
@@ -3541,7 +4223,6 @@
           <w:b/>
           <w:bCs/>
         </w:rPr>
-        <w:lastRenderedPageBreak/>
         <w:t xml:space="preserve">참고 — </w:t>
       </w:r>
       <w:r>
@@ -3639,6 +4320,7 @@
         <w:spacing w:after="50" w:line="264" w:lineRule="auto"/>
       </w:pPr>
       <w:r>
+        <w:lastRenderedPageBreak/>
         <w:t>상태 변경을 GET 으로 두면 CSRF 토큰이 적용되지 않으니, POST/PUT/DELETE 를 사용한다.</w:t>
       </w:r>
     </w:p>

</xml_diff>

<commit_message>
[Docs] CSRF: curl로 CSRF 토큰 받아 로그인하는 방법 추가 (md + docx)
GET /login 에서 세션 쿠키+_csrf 토큰을 받아 POST /login-process 에
넘기는 2단계 스크립트와 실측 결과(성공 302 -> /users/index,
실패 302 -> /login?error) 반영. docx는 페이지 번호/간격 등 기존
사용자 수정 위에 이어서 추가
</commit_message>
<xml_diff>
--- a/docs/security/05_CSRF.docx
+++ b/docs/security/05_CSRF.docx
@@ -241,7 +241,16 @@
         <w:t xml:space="preserve"> </w:t>
       </w:r>
       <w:r>
-        <w:t>된 상태에서 공격자가 보낸 링크를 눌렀더니, 내 세션으로 이체가 실행되는 것과 같다.</w:t>
+        <w:t xml:space="preserve">된 상태에서 공격자가 보낸 링크를 눌렀더니, </w:t>
+      </w:r>
+      <w:r>
+        <w:rPr>
+          <w:rFonts w:hint="eastAsia"/>
+        </w:rPr>
+        <w:t>나의 로그인 된</w:t>
+      </w:r>
+      <w:r>
+        <w:t xml:space="preserve"> 세션으로 이체가 실행되는 것과 같다.</w:t>
       </w:r>
     </w:p>
     <w:p>
@@ -619,7 +628,71 @@
           <w:sz w:val="18"/>
           <w:szCs w:val="18"/>
         </w:rPr>
-        <w:t xml:space="preserve">    user.setPassword(passwordEncoder.encode(newPassword));  // 비번 변경(상태 변경)</w:t>
+        <w:t xml:space="preserve">    user.setPassword(passwordEncoder.encode(newPassword));  // </w:t>
+      </w:r>
+      <w:r>
+        <w:rPr>
+          <w:rFonts w:ascii="Consolas" w:hAnsi="Consolas"/>
+          <w:sz w:val="18"/>
+          <w:szCs w:val="18"/>
+        </w:rPr>
+        <w:t>비번</w:t>
+      </w:r>
+      <w:r>
+        <w:rPr>
+          <w:rFonts w:ascii="Consolas" w:hAnsi="Consolas"/>
+          <w:sz w:val="18"/>
+          <w:szCs w:val="18"/>
+        </w:rPr>
+        <w:t xml:space="preserve"> </w:t>
+      </w:r>
+      <w:r>
+        <w:rPr>
+          <w:rFonts w:ascii="Consolas" w:hAnsi="Consolas"/>
+          <w:sz w:val="18"/>
+          <w:szCs w:val="18"/>
+        </w:rPr>
+        <w:t>변경</w:t>
+      </w:r>
+      <w:r>
+        <w:rPr>
+          <w:rFonts w:ascii="Consolas" w:hAnsi="Consolas"/>
+          <w:sz w:val="18"/>
+          <w:szCs w:val="18"/>
+        </w:rPr>
+        <w:t>(</w:t>
+      </w:r>
+      <w:r>
+        <w:rPr>
+          <w:rFonts w:ascii="Consolas" w:hAnsi="Consolas"/>
+          <w:sz w:val="18"/>
+          <w:szCs w:val="18"/>
+        </w:rPr>
+        <w:t>상태</w:t>
+      </w:r>
+      <w:r>
+        <w:rPr>
+          <w:rFonts w:ascii="Consolas" w:hAnsi="Consolas"/>
+          <w:sz w:val="18"/>
+          <w:szCs w:val="18"/>
+        </w:rPr>
+        <w:t xml:space="preserve"> </w:t>
+      </w:r>
+      <w:r>
+        <w:rPr>
+          <w:rFonts w:ascii="Consolas" w:hAnsi="Consolas"/>
+          <w:sz w:val="18"/>
+          <w:szCs w:val="18"/>
+        </w:rPr>
+        <w:t>변경</w:t>
+      </w:r>
+      <w:r>
+        <w:rPr>
+          <w:rFonts w:ascii="Consolas" w:hAnsi="Consolas"/>
+          <w:sz w:val="18"/>
+          <w:szCs w:val="18"/>
+        </w:rPr>
+        <w:t>)</w:t>
       </w:r>
     </w:p>
     <w:p>
@@ -748,23 +821,119 @@
           <w:sz w:val="18"/>
           <w:szCs w:val="18"/>
         </w:rPr>
-        <w:t xml:space="preserve">  &lt;button type="submit"&gt;변경&lt;/button&gt;</w:t>
-      </w:r>
-    </w:p>
-    <w:p>
-      <w:pPr>
-        <w:pBdr>
-          <w:left w:val="single" w:sz="18" w:space="6" w:color="C0C0C0"/>
-        </w:pBdr>
-        <w:shd w:val="clear" w:color="auto" w:fill="F4F4F4"/>
-      </w:pPr>
-      <w:r>
-        <w:rPr>
-          <w:rFonts w:ascii="Consolas" w:hAnsi="Consolas"/>
-          <w:sz w:val="18"/>
-          <w:szCs w:val="18"/>
-        </w:rPr>
-        <w:t xml:space="preserve">  &lt;!-- CSRF 활성 시 여기에 &lt;input type="hidden" name="_csrf" ...&gt; 자동 삽입 --&gt;</w:t>
+        <w:t xml:space="preserve">  &lt;button type="submit"&gt;</w:t>
+      </w:r>
+      <w:r>
+        <w:rPr>
+          <w:rFonts w:ascii="Consolas" w:hAnsi="Consolas"/>
+          <w:sz w:val="18"/>
+          <w:szCs w:val="18"/>
+        </w:rPr>
+        <w:t>변경</w:t>
+      </w:r>
+      <w:r>
+        <w:rPr>
+          <w:rFonts w:ascii="Consolas" w:hAnsi="Consolas"/>
+          <w:sz w:val="18"/>
+          <w:szCs w:val="18"/>
+        </w:rPr>
+        <w:t>&lt;/button&gt;</w:t>
+      </w:r>
+    </w:p>
+    <w:p>
+      <w:pPr>
+        <w:pBdr>
+          <w:left w:val="single" w:sz="18" w:space="6" w:color="C0C0C0"/>
+        </w:pBdr>
+        <w:shd w:val="clear" w:color="auto" w:fill="F4F4F4"/>
+      </w:pPr>
+      <w:r>
+        <w:rPr>
+          <w:rFonts w:ascii="Consolas" w:hAnsi="Consolas"/>
+          <w:sz w:val="18"/>
+          <w:szCs w:val="18"/>
+        </w:rPr>
+        <w:t xml:space="preserve">  &lt;!-- CSRF </w:t>
+      </w:r>
+      <w:r>
+        <w:rPr>
+          <w:rFonts w:ascii="Consolas" w:hAnsi="Consolas"/>
+          <w:sz w:val="18"/>
+          <w:szCs w:val="18"/>
+        </w:rPr>
+        <w:t>활성</w:t>
+      </w:r>
+      <w:r>
+        <w:rPr>
+          <w:rFonts w:ascii="Consolas" w:hAnsi="Consolas"/>
+          <w:sz w:val="18"/>
+          <w:szCs w:val="18"/>
+        </w:rPr>
+        <w:t xml:space="preserve"> </w:t>
+      </w:r>
+      <w:r>
+        <w:rPr>
+          <w:rFonts w:ascii="Consolas" w:hAnsi="Consolas"/>
+          <w:sz w:val="18"/>
+          <w:szCs w:val="18"/>
+        </w:rPr>
+        <w:t>시</w:t>
+      </w:r>
+      <w:r>
+        <w:rPr>
+          <w:rFonts w:ascii="Consolas" w:hAnsi="Consolas"/>
+          <w:sz w:val="18"/>
+          <w:szCs w:val="18"/>
+        </w:rPr>
+        <w:t xml:space="preserve"> </w:t>
+      </w:r>
+      <w:r>
+        <w:rPr>
+          <w:rFonts w:ascii="Consolas" w:hAnsi="Consolas"/>
+          <w:sz w:val="18"/>
+          <w:szCs w:val="18"/>
+        </w:rPr>
+        <w:t>여기에</w:t>
+      </w:r>
+      <w:r>
+        <w:rPr>
+          <w:rFonts w:ascii="Consolas" w:hAnsi="Consolas"/>
+          <w:sz w:val="18"/>
+          <w:szCs w:val="18"/>
+        </w:rPr>
+        <w:t xml:space="preserve"> &lt;input type="hidden" name="_csrf" ...&gt; </w:t>
+      </w:r>
+      <w:r>
+        <w:rPr>
+          <w:rFonts w:ascii="Consolas" w:hAnsi="Consolas"/>
+          <w:sz w:val="18"/>
+          <w:szCs w:val="18"/>
+        </w:rPr>
+        <w:t>자동</w:t>
+      </w:r>
+      <w:r>
+        <w:rPr>
+          <w:rFonts w:ascii="Consolas" w:hAnsi="Consolas"/>
+          <w:sz w:val="18"/>
+          <w:szCs w:val="18"/>
+        </w:rPr>
+        <w:t xml:space="preserve"> </w:t>
+      </w:r>
+      <w:r>
+        <w:rPr>
+          <w:rFonts w:ascii="Consolas" w:hAnsi="Consolas"/>
+          <w:sz w:val="18"/>
+          <w:szCs w:val="18"/>
+        </w:rPr>
+        <w:t>삽입</w:t>
+      </w:r>
+      <w:r>
+        <w:rPr>
+          <w:rFonts w:ascii="Consolas" w:hAnsi="Consolas"/>
+          <w:sz w:val="18"/>
+          <w:szCs w:val="18"/>
+        </w:rPr>
+        <w:t xml:space="preserve"> --&gt;</w:t>
       </w:r>
     </w:p>
     <w:p>
@@ -835,23 +1004,111 @@
           <w:sz w:val="18"/>
           <w:szCs w:val="18"/>
         </w:rPr>
-        <w:t xml:space="preserve">// 변경 처리 후</w:t>
-      </w:r>
-    </w:p>
-    <w:p>
-      <w:pPr>
-        <w:pBdr>
-          <w:left w:val="single" w:sz="18" w:space="6" w:color="C0C0C0"/>
-        </w:pBdr>
-        <w:shd w:val="clear" w:color="auto" w:fill="F4F4F4"/>
-      </w:pPr>
-      <w:r>
-        <w:rPr>
-          <w:rFonts w:ascii="Consolas" w:hAnsi="Consolas"/>
-          <w:sz w:val="18"/>
-          <w:szCs w:val="18"/>
-        </w:rPr>
-        <w:t xml:space="preserve">redirectAttributes.addFlashAttribute("msg", email + " 의 비밀번호가 변경되었습니다.");</w:t>
+        <w:t xml:space="preserve">// </w:t>
+      </w:r>
+      <w:r>
+        <w:rPr>
+          <w:rFonts w:ascii="Consolas" w:hAnsi="Consolas"/>
+          <w:sz w:val="18"/>
+          <w:szCs w:val="18"/>
+        </w:rPr>
+        <w:t>변경</w:t>
+      </w:r>
+      <w:r>
+        <w:rPr>
+          <w:rFonts w:ascii="Consolas" w:hAnsi="Consolas"/>
+          <w:sz w:val="18"/>
+          <w:szCs w:val="18"/>
+        </w:rPr>
+        <w:t xml:space="preserve"> </w:t>
+      </w:r>
+      <w:r>
+        <w:rPr>
+          <w:rFonts w:ascii="Consolas" w:hAnsi="Consolas"/>
+          <w:sz w:val="18"/>
+          <w:szCs w:val="18"/>
+        </w:rPr>
+        <w:t>처리</w:t>
+      </w:r>
+      <w:r>
+        <w:rPr>
+          <w:rFonts w:ascii="Consolas" w:hAnsi="Consolas"/>
+          <w:sz w:val="18"/>
+          <w:szCs w:val="18"/>
+        </w:rPr>
+        <w:t xml:space="preserve"> </w:t>
+      </w:r>
+      <w:r>
+        <w:rPr>
+          <w:rFonts w:ascii="Consolas" w:hAnsi="Consolas"/>
+          <w:sz w:val="18"/>
+          <w:szCs w:val="18"/>
+        </w:rPr>
+        <w:t>후</w:t>
+      </w:r>
+    </w:p>
+    <w:p>
+      <w:pPr>
+        <w:pBdr>
+          <w:left w:val="single" w:sz="18" w:space="6" w:color="C0C0C0"/>
+        </w:pBdr>
+        <w:shd w:val="clear" w:color="auto" w:fill="F4F4F4"/>
+      </w:pPr>
+      <w:r>
+        <w:rPr>
+          <w:rFonts w:ascii="Consolas" w:hAnsi="Consolas"/>
+          <w:sz w:val="18"/>
+          <w:szCs w:val="18"/>
+        </w:rPr>
+        <w:t xml:space="preserve">redirectAttributes.addFlashAttribute("msg", email + " </w:t>
+      </w:r>
+      <w:r>
+        <w:rPr>
+          <w:rFonts w:ascii="Consolas" w:hAnsi="Consolas"/>
+          <w:sz w:val="18"/>
+          <w:szCs w:val="18"/>
+        </w:rPr>
+        <w:t>의</w:t>
+      </w:r>
+      <w:r>
+        <w:rPr>
+          <w:rFonts w:ascii="Consolas" w:hAnsi="Consolas"/>
+          <w:sz w:val="18"/>
+          <w:szCs w:val="18"/>
+        </w:rPr>
+        <w:t xml:space="preserve"> </w:t>
+      </w:r>
+      <w:r>
+        <w:rPr>
+          <w:rFonts w:ascii="Consolas" w:hAnsi="Consolas"/>
+          <w:sz w:val="18"/>
+          <w:szCs w:val="18"/>
+        </w:rPr>
+        <w:t>비밀번호가</w:t>
+      </w:r>
+      <w:r>
+        <w:rPr>
+          <w:rFonts w:ascii="Consolas" w:hAnsi="Consolas"/>
+          <w:sz w:val="18"/>
+          <w:szCs w:val="18"/>
+        </w:rPr>
+        <w:t xml:space="preserve"> </w:t>
+      </w:r>
+      <w:r>
+        <w:rPr>
+          <w:rFonts w:ascii="Consolas" w:hAnsi="Consolas"/>
+          <w:sz w:val="18"/>
+          <w:szCs w:val="18"/>
+        </w:rPr>
+        <w:t>변경되었습니다</w:t>
+      </w:r>
+      <w:r>
+        <w:rPr>
+          <w:rFonts w:ascii="Consolas" w:hAnsi="Consolas"/>
+          <w:sz w:val="18"/>
+          <w:szCs w:val="18"/>
+        </w:rPr>
+        <w:t>.");</w:t>
       </w:r>
     </w:p>
     <w:p>
@@ -868,7 +1125,63 @@
           <w:sz w:val="18"/>
           <w:szCs w:val="18"/>
         </w:rPr>
-        <w:t xml:space="preserve">return "redirect:/users/index";   // 폼에 머물지 않고 이동</w:t>
+        <w:t xml:space="preserve">return "redirect:/users/index";   // </w:t>
+      </w:r>
+      <w:r>
+        <w:rPr>
+          <w:rFonts w:ascii="Consolas" w:hAnsi="Consolas"/>
+          <w:sz w:val="18"/>
+          <w:szCs w:val="18"/>
+        </w:rPr>
+        <w:t>폼에</w:t>
+      </w:r>
+      <w:r>
+        <w:rPr>
+          <w:rFonts w:ascii="Consolas" w:hAnsi="Consolas"/>
+          <w:sz w:val="18"/>
+          <w:szCs w:val="18"/>
+        </w:rPr>
+        <w:t xml:space="preserve"> </w:t>
+      </w:r>
+      <w:r>
+        <w:rPr>
+          <w:rFonts w:ascii="Consolas" w:hAnsi="Consolas"/>
+          <w:sz w:val="18"/>
+          <w:szCs w:val="18"/>
+        </w:rPr>
+        <w:t>머물지</w:t>
+      </w:r>
+      <w:r>
+        <w:rPr>
+          <w:rFonts w:ascii="Consolas" w:hAnsi="Consolas"/>
+          <w:sz w:val="18"/>
+          <w:szCs w:val="18"/>
+        </w:rPr>
+        <w:t xml:space="preserve"> </w:t>
+      </w:r>
+      <w:r>
+        <w:rPr>
+          <w:rFonts w:ascii="Consolas" w:hAnsi="Consolas"/>
+          <w:sz w:val="18"/>
+          <w:szCs w:val="18"/>
+        </w:rPr>
+        <w:t>않고</w:t>
+      </w:r>
+      <w:r>
+        <w:rPr>
+          <w:rFonts w:ascii="Consolas" w:hAnsi="Consolas"/>
+          <w:sz w:val="18"/>
+          <w:szCs w:val="18"/>
+        </w:rPr>
+        <w:t xml:space="preserve"> </w:t>
+      </w:r>
+      <w:r>
+        <w:rPr>
+          <w:rFonts w:ascii="Consolas" w:hAnsi="Consolas"/>
+          <w:sz w:val="18"/>
+          <w:szCs w:val="18"/>
+        </w:rPr>
+        <w:t>이동</w:t>
       </w:r>
     </w:p>
     <w:p>
@@ -1632,8 +1945,28 @@
       <w:pPr>
         <w:spacing w:after="80" w:line="272" w:lineRule="auto"/>
       </w:pPr>
-      <w:r>
-        <w:t>CSRF 활성 시엔 로그인조차 토큰이 필요하므로, curl 로 로그인하려면 먼저 GET /login 에서 _csrf 토큰을 받아야 한다. (브라우저 폼은 Thymeleaf 가 자동 처리)</w:t>
+      <w:bookmarkStart w:id="0" w:name="_GoBack"/>
+      <w:r>
+        <w:t xml:space="preserve">CSRF 활성 시엔 로그인조차 </w:t>
+      </w:r>
+      <w:r>
+        <w:t>CSRF</w:t>
+      </w:r>
+      <w:r>
+        <w:t>토큰이 필요</w:t>
+      </w:r>
+      <w:bookmarkEnd w:id="0"/>
+      <w:r>
+        <w:t>하므로, curl 로 로그인</w:t>
+      </w:r>
+      <w:r>
+        <w:rPr>
+          <w:rFonts w:hint="eastAsia"/>
+        </w:rPr>
+        <w:t xml:space="preserve"> </w:t>
+      </w:r>
+      <w:r>
+        <w:t>하려면 먼저 GET /login 에서 _csrf 토큰을 받아야 한다. (브라우저 폼은 Thymeleaf 가 자동 처리)</w:t>
       </w:r>
     </w:p>
     <w:p>
@@ -2029,7 +2362,7 @@
           <w:bCs/>
           <w:color w:val="1F3864"/>
         </w:rPr>
-        <w:t xml:space="preserve">교육 포인트 — </w:t>
+        <w:t xml:space="preserve">포인트 — </w:t>
       </w:r>
       <w:r>
         <w:t>"REST(JWT 헤더)는 CSRF를 꺼도 되지만, 세션+쿠키는 반드시 켜야 한다." 인증 방식에 따라 CSRF 판단이 다르다.</w:t>
@@ -2046,15 +2379,15 @@
           <w:bCs/>
           <w:color w:val="2E5496"/>
         </w:rPr>
-        <w:t>명시적 CSRF 설정</w:t>
-      </w:r>
-    </w:p>
-    <w:p>
-      <w:pPr>
-        <w:spacing w:after="80" w:line="272" w:lineRule="auto"/>
-      </w:pPr>
-      <w:r>
-        <w:t>Spring Security 는 CSRF 가 기본 활성이라 아무것도 안 하면 켜진다. 명시하거나 토큰 저장소를 바꾸려면 다음과 같다.</w:t>
+        <w:t xml:space="preserve">curl로 CSRF 토큰 받아 로그인하기</w:t>
+      </w:r>
+    </w:p>
+    <w:p>
+      <w:pPr>
+        <w:spacing w:after="90" w:line="272" w:lineRule="auto"/>
+      </w:pPr>
+      <w:r>
+        <w:t xml:space="preserve">CSRF가 켜진 상태에서는 curl로 /login-process를 바로 호출하면 토큰이 없어 403으로 거부된다. 브라우저는 Thymeleaf가 폼에 _csrf 히든 필드를 자동으로 넣어주지만, curl은 직접 두 단계를 거쳐야 한다 — ① GET /login으로 세션 쿠키와 _csrf 토큰을 받고, ② 같은 쿠키+토큰으로 POST /login-process를 호출한다.</w:t>
       </w:r>
     </w:p>
     <w:p>
@@ -2067,155 +2400,165 @@
       </w:pPr>
       <w:r>
         <w:rPr>
-          <w:rFonts w:ascii="Consolas" w:hAnsi="Consolas"/>
-          <w:sz w:val="18"/>
-          <w:szCs w:val="18"/>
-        </w:rPr>
-        <w:t xml:space="preserve">// (1) 기본값으로 명시적 활성화</w:t>
-      </w:r>
-    </w:p>
-    <w:p>
-      <w:pPr>
-        <w:pBdr>
-          <w:left w:val="single" w:sz="18" w:space="6" w:color="C0C0C0"/>
-        </w:pBdr>
-        <w:shd w:val="clear" w:color="auto" w:fill="F4F4F4"/>
-      </w:pPr>
-      <w:r>
-        <w:rPr>
-          <w:rFonts w:ascii="Consolas" w:hAnsi="Consolas"/>
-          <w:sz w:val="18"/>
-          <w:szCs w:val="18"/>
-        </w:rPr>
-        <w:t>http.csrf(Customizer.withDefaults());</w:t>
-      </w:r>
-    </w:p>
-    <w:p>
-      <w:pPr>
-        <w:pBdr>
-          <w:left w:val="single" w:sz="18" w:space="6" w:color="C0C0C0"/>
-        </w:pBdr>
-        <w:shd w:val="clear" w:color="auto" w:fill="F4F4F4"/>
-      </w:pPr>
-      <w:r>
-        <w:rPr>
-          <w:rFonts w:ascii="Consolas" w:hAnsi="Consolas"/>
-          <w:sz w:val="18"/>
-          <w:szCs w:val="18"/>
-        </w:rPr>
-        <w:t xml:space="preserve"> </w:t>
-      </w:r>
-    </w:p>
-    <w:p>
-      <w:pPr>
-        <w:pBdr>
-          <w:left w:val="single" w:sz="18" w:space="6" w:color="C0C0C0"/>
-        </w:pBdr>
-        <w:shd w:val="clear" w:color="auto" w:fill="F4F4F4"/>
-      </w:pPr>
-      <w:r>
-        <w:rPr>
-          <w:rFonts w:ascii="Consolas" w:hAnsi="Consolas"/>
-          <w:sz w:val="18"/>
-          <w:szCs w:val="18"/>
-        </w:rPr>
-        <w:t xml:space="preserve">// (2) 토큰 저장소를 세션에 (기본 동작을 명시)</w:t>
-      </w:r>
-    </w:p>
-    <w:p>
-      <w:pPr>
-        <w:pBdr>
-          <w:left w:val="single" w:sz="18" w:space="6" w:color="C0C0C0"/>
-        </w:pBdr>
-        <w:shd w:val="clear" w:color="auto" w:fill="F4F4F4"/>
-      </w:pPr>
-      <w:r>
-        <w:rPr>
-          <w:rFonts w:ascii="Consolas" w:hAnsi="Consolas"/>
-          <w:sz w:val="18"/>
-          <w:szCs w:val="18"/>
-        </w:rPr>
-        <w:t>http.csrf(csrf -&gt; csrf.csrfTokenRepository(new HttpSessionCsrfTokenRepository()));</w:t>
-      </w:r>
-    </w:p>
-    <w:p>
-      <w:pPr>
-        <w:pBdr>
-          <w:left w:val="single" w:sz="18" w:space="6" w:color="C0C0C0"/>
-        </w:pBdr>
-        <w:shd w:val="clear" w:color="auto" w:fill="F4F4F4"/>
-      </w:pPr>
-      <w:r>
-        <w:rPr>
-          <w:rFonts w:ascii="Consolas" w:hAnsi="Consolas"/>
-          <w:sz w:val="18"/>
-          <w:szCs w:val="18"/>
-        </w:rPr>
-        <w:t xml:space="preserve"> </w:t>
-      </w:r>
-    </w:p>
-    <w:p>
-      <w:pPr>
-        <w:pBdr>
-          <w:left w:val="single" w:sz="18" w:space="6" w:color="C0C0C0"/>
-        </w:pBdr>
-        <w:shd w:val="clear" w:color="auto" w:fill="F4F4F4"/>
-      </w:pPr>
-      <w:r>
-        <w:rPr>
-          <w:rFonts w:ascii="Consolas" w:hAnsi="Consolas"/>
-          <w:sz w:val="18"/>
-          <w:szCs w:val="18"/>
-        </w:rPr>
-        <w:t xml:space="preserve">// (3) SPA용: JS가 읽을 수 있는 쿠키에 토큰 저장</w:t>
-      </w:r>
-    </w:p>
-    <w:p>
-      <w:pPr>
-        <w:pBdr>
-          <w:left w:val="single" w:sz="18" w:space="6" w:color="C0C0C0"/>
-        </w:pBdr>
-        <w:shd w:val="clear" w:color="auto" w:fill="F4F4F4"/>
-      </w:pPr>
-      <w:r>
-        <w:rPr>
-          <w:rFonts w:ascii="Consolas" w:hAnsi="Consolas"/>
-          <w:sz w:val="18"/>
-          <w:szCs w:val="18"/>
-        </w:rPr>
-        <w:t>http.csrf(csrf -&gt; csrf.csrfTokenRepository(CookieCsrfTokenRepository.withHttpOnlyFalse()));</w:t>
-      </w:r>
-    </w:p>
-    <w:p>
-      <w:pPr>
-        <w:pBdr>
-          <w:left w:val="single" w:sz="18" w:space="6" w:color="C0C0C0"/>
-        </w:pBdr>
-        <w:shd w:val="clear" w:color="auto" w:fill="F4F4F4"/>
-      </w:pPr>
-      <w:r>
-        <w:rPr>
-          <w:rFonts w:ascii="Consolas" w:hAnsi="Consolas"/>
-          <w:sz w:val="18"/>
-          <w:szCs w:val="18"/>
-        </w:rPr>
-        <w:t xml:space="preserve"> </w:t>
-      </w:r>
-    </w:p>
-    <w:p>
-      <w:pPr>
-        <w:pBdr>
-          <w:left w:val="single" w:sz="18" w:space="6" w:color="C0C0C0"/>
-        </w:pBdr>
-        <w:shd w:val="clear" w:color="auto" w:fill="F4F4F4"/>
-      </w:pPr>
-      <w:r>
-        <w:rPr>
-          <w:rFonts w:ascii="Consolas" w:hAnsi="Consolas"/>
-          <w:sz w:val="18"/>
-          <w:szCs w:val="18"/>
-        </w:rPr>
-        <w:t xml:space="preserve">// (4) 특정 경로만 예외(예: 순수 REST) </w:t>
+          <w:rFonts w:ascii="Consolas" w:eastAsia="Consolas" w:hAnsi="Consolas" w:cs="Consolas"/>
+          <w:sz w:val="18"/>
+          <w:szCs w:val="18"/>
+        </w:rPr>
+        <w:t>EMAIL=admin@aa.com; PASSWORD=pwd1; B=http://localhost:8080; JAR=$(mktemp)</w:t>
+      </w:r>
+    </w:p>
+    <w:p>
+      <w:pPr>
+        <w:pBdr>
+          <w:left w:val="single" w:sz="18" w:space="6" w:color="C0C0C0"/>
+        </w:pBdr>
+        <w:shd w:val="clear" w:color="auto" w:fill="F4F4F4"/>
+        <w:rPr>
+          <w:rFonts w:ascii="Consolas" w:eastAsia="Consolas" w:hAnsi="Consolas" w:cs="Consolas"/>
+          <w:sz w:val="18"/>
+          <w:szCs w:val="18"/>
+        </w:rPr>
+      </w:pPr>
+    </w:p>
+    <w:p>
+      <w:pPr>
+        <w:pBdr>
+          <w:left w:val="single" w:sz="18" w:space="6" w:color="C0C0C0"/>
+        </w:pBdr>
+        <w:shd w:val="clear" w:color="auto" w:fill="F4F4F4"/>
+      </w:pPr>
+      <w:r>
+        <w:rPr>
+          <w:rFonts w:ascii="Consolas" w:eastAsia="Consolas" w:hAnsi="Consolas" w:cs="Consolas"/>
+          <w:sz w:val="18"/>
+          <w:szCs w:val="18"/>
+        </w:rPr>
+        <w:t># 1) 로그인 페이지에서 세션 쿠키 + _csrf 토큰 획득</w:t>
+      </w:r>
+    </w:p>
+    <w:p>
+      <w:pPr>
+        <w:pBdr>
+          <w:left w:val="single" w:sz="18" w:space="6" w:color="C0C0C0"/>
+        </w:pBdr>
+        <w:shd w:val="clear" w:color="auto" w:fill="F4F4F4"/>
+      </w:pPr>
+      <w:r>
+        <w:rPr>
+          <w:rFonts w:ascii="Consolas" w:eastAsia="Consolas" w:hAnsi="Consolas" w:cs="Consolas"/>
+          <w:sz w:val="18"/>
+          <w:szCs w:val="18"/>
+        </w:rPr>
+        <w:t>LOGIN_PAGE=$(curl -s -c "$JAR" "$B/login")</w:t>
+      </w:r>
+    </w:p>
+    <w:p>
+      <w:pPr>
+        <w:pBdr>
+          <w:left w:val="single" w:sz="18" w:space="6" w:color="C0C0C0"/>
+        </w:pBdr>
+        <w:shd w:val="clear" w:color="auto" w:fill="F4F4F4"/>
+      </w:pPr>
+      <w:r>
+        <w:rPr>
+          <w:rFonts w:ascii="Consolas" w:eastAsia="Consolas" w:hAnsi="Consolas" w:cs="Consolas"/>
+          <w:sz w:val="18"/>
+          <w:szCs w:val="18"/>
+        </w:rPr>
+        <w:t>CSRF=$(echo "$LOGIN_PAGE" | grep -o 'name="_csrf" value="[^"]*"' | sed 's/.*value="\([^"]*\)".*/\1/')</w:t>
+      </w:r>
+    </w:p>
+    <w:p>
+      <w:pPr>
+        <w:pBdr>
+          <w:left w:val="single" w:sz="18" w:space="6" w:color="C0C0C0"/>
+        </w:pBdr>
+        <w:shd w:val="clear" w:color="auto" w:fill="F4F4F4"/>
+        <w:rPr>
+          <w:rFonts w:ascii="Consolas" w:eastAsia="Consolas" w:hAnsi="Consolas" w:cs="Consolas"/>
+          <w:sz w:val="18"/>
+          <w:szCs w:val="18"/>
+        </w:rPr>
+      </w:pPr>
+    </w:p>
+    <w:p>
+      <w:pPr>
+        <w:pBdr>
+          <w:left w:val="single" w:sz="18" w:space="6" w:color="C0C0C0"/>
+        </w:pBdr>
+        <w:shd w:val="clear" w:color="auto" w:fill="F4F4F4"/>
+      </w:pPr>
+      <w:r>
+        <w:rPr>
+          <w:rFonts w:ascii="Consolas" w:eastAsia="Consolas" w:hAnsi="Consolas" w:cs="Consolas"/>
+          <w:sz w:val="18"/>
+          <w:szCs w:val="18"/>
+        </w:rPr>
+        <w:t># 2) 같은 쿠키(세션)로 로그인 시도</w:t>
+      </w:r>
+    </w:p>
+    <w:p>
+      <w:pPr>
+        <w:pBdr>
+          <w:left w:val="single" w:sz="18" w:space="6" w:color="C0C0C0"/>
+        </w:pBdr>
+        <w:shd w:val="clear" w:color="auto" w:fill="F4F4F4"/>
+      </w:pPr>
+      <w:r>
+        <w:rPr>
+          <w:rFonts w:ascii="Consolas" w:eastAsia="Consolas" w:hAnsi="Consolas" w:cs="Consolas"/>
+          <w:sz w:val="18"/>
+          <w:szCs w:val="18"/>
+        </w:rPr>
+        <w:t>curl -s -b "$JAR" -c "$JAR" -X POST "$B/login-process" \</w:t>
+      </w:r>
+    </w:p>
+    <w:p>
+      <w:pPr>
+        <w:pBdr>
+          <w:left w:val="single" w:sz="18" w:space="6" w:color="C0C0C0"/>
+        </w:pBdr>
+        <w:shd w:val="clear" w:color="auto" w:fill="F4F4F4"/>
+      </w:pPr>
+      <w:r>
+        <w:rPr>
+          <w:rFonts w:ascii="Consolas" w:eastAsia="Consolas" w:hAnsi="Consolas" w:cs="Consolas"/>
+          <w:sz w:val="18"/>
+          <w:szCs w:val="18"/>
+        </w:rPr>
+        <w:t xml:space="preserve">  --data-urlencode "username=$EMAIL" \</w:t>
+      </w:r>
+    </w:p>
+    <w:p>
+      <w:pPr>
+        <w:pBdr>
+          <w:left w:val="single" w:sz="18" w:space="6" w:color="C0C0C0"/>
+        </w:pBdr>
+        <w:shd w:val="clear" w:color="auto" w:fill="F4F4F4"/>
+      </w:pPr>
+      <w:r>
+        <w:rPr>
+          <w:rFonts w:ascii="Consolas" w:eastAsia="Consolas" w:hAnsi="Consolas" w:cs="Consolas"/>
+          <w:sz w:val="18"/>
+          <w:szCs w:val="18"/>
+        </w:rPr>
+        <w:t xml:space="preserve">  --data-urlencode "password=$PASSWORD" \</w:t>
+      </w:r>
+    </w:p>
+    <w:p>
+      <w:pPr>
+        <w:pBdr>
+          <w:left w:val="single" w:sz="18" w:space="6" w:color="C0C0C0"/>
+        </w:pBdr>
+        <w:shd w:val="clear" w:color="auto" w:fill="F4F4F4"/>
+      </w:pPr>
+      <w:r>
+        <w:rPr>
+          <w:rFonts w:ascii="Consolas" w:eastAsia="Consolas" w:hAnsi="Consolas" w:cs="Consolas"/>
+          <w:sz w:val="18"/>
+          <w:szCs w:val="18"/>
+        </w:rPr>
+        <w:t xml:space="preserve">  --data-urlencode "_csrf=$CSRF" \</w:t>
       </w:r>
     </w:p>
     <w:p>
@@ -2228,28 +2571,51 @@
       </w:pPr>
       <w:r>
         <w:rPr>
-          <w:rFonts w:ascii="Consolas" w:hAnsi="Consolas"/>
-          <w:sz w:val="18"/>
-          <w:szCs w:val="18"/>
-        </w:rPr>
-        <w:t>http.csrf(csrf -&gt; csrf.ignoringRequestMatchers("/api/**"));</w:t>
-      </w:r>
-    </w:p>
-    <w:p>
-      <w:pPr>
-        <w:spacing w:after="80" w:line="272" w:lineRule="auto"/>
-      </w:pPr>
-      <w:r>
-        <w:t xml:space="preserve">이 앱은 JWT 체인(/api/**)은 csrf.disable(), 세션 </w:t>
-      </w:r>
-      <w:r>
-        <w:rPr>
-          <w:rFonts w:hint="eastAsia"/>
-        </w:rPr>
-        <w:t>체</w:t>
-      </w:r>
-      <w:r>
-        <w:t>인은 기본 활성(disable 제거)로 두어 인증 방식별로 구분했다.</w:t>
+          <w:rFonts w:ascii="Consolas" w:eastAsia="Consolas" w:hAnsi="Consolas" w:cs="Consolas"/>
+          <w:sz w:val="18"/>
+          <w:szCs w:val="18"/>
+        </w:rPr>
+        <w:t xml:space="preserve">  -D - -o /dev/null | grep -i "^HTTP\|^Location"</w:t>
+      </w:r>
+    </w:p>
+    <w:p>
+      <w:pPr>
+        <w:spacing w:after="90" w:line="272" w:lineRule="auto"/>
+      </w:pPr>
+      <w:r>
+        <w:rPr>
+          <w:b/>
+          <w:bCs/>
+          <w:color w:val="1F3864"/>
+        </w:rPr>
+        <w:t xml:space="preserve">성공 — </w:t>
+      </w:r>
+      <w:r>
+        <w:t xml:space="preserve">admin@aa.com / pwd1 : 302 → Location: /users/index</w:t>
+      </w:r>
+    </w:p>
+    <w:p>
+      <w:pPr>
+        <w:spacing w:after="90" w:line="272" w:lineRule="auto"/>
+      </w:pPr>
+      <w:r>
+        <w:rPr>
+          <w:b/>
+          <w:bCs/>
+          <w:color w:val="1F3864"/>
+        </w:rPr>
+        <w:t xml:space="preserve">실패 — </w:t>
+      </w:r>
+      <w:r>
+        <w:t xml:space="preserve">user@aa.com / 틀린 비밀번호 : 302 → Location: /login?error</w:t>
+      </w:r>
+    </w:p>
+    <w:p>
+      <w:pPr>
+        <w:spacing w:after="90" w:line="272" w:lineRule="auto"/>
+      </w:pPr>
+      <w:r>
+        <w:t xml:space="preserve">두 경우 모두 403이 아니라 302가 나온다는 점이 중요하다 — CSRF 토큰 검증은 통과했고, 그 뒤 아이디·비밀번호 검증 결과에 따라 성공/실패 리다이렉트만 갈리는 것이다. 토큰 자체가 빠지거나 틀리면 이 단계까지 가지도 못하고 403으로 막힌다.</w:t>
       </w:r>
     </w:p>
     <w:p>
@@ -2263,6 +2629,559 @@
           <w:bCs/>
           <w:color w:val="2E5496"/>
         </w:rPr>
+        <w:t>명시적 CSRF 설정</w:t>
+      </w:r>
+    </w:p>
+    <w:p>
+      <w:pPr>
+        <w:spacing w:after="80" w:line="272" w:lineRule="auto"/>
+      </w:pPr>
+      <w:r>
+        <w:t>Spring Security 는 CSRF 가 기본 활성이라 아무것도 안 하면 켜진다. 명시하거나 토큰 저장소를 바꾸려면 다음과 같다.</w:t>
+      </w:r>
+    </w:p>
+    <w:p>
+      <w:pPr>
+        <w:pBdr>
+          <w:top w:val="single" w:sz="4" w:space="3" w:color="D9D9D9"/>
+          <w:left w:val="single" w:sz="18" w:space="6" w:color="C0C0C0"/>
+        </w:pBdr>
+        <w:shd w:val="clear" w:color="auto" w:fill="F4F4F4"/>
+      </w:pPr>
+      <w:r>
+        <w:rPr>
+          <w:rFonts w:ascii="Consolas" w:hAnsi="Consolas"/>
+          <w:sz w:val="18"/>
+          <w:szCs w:val="18"/>
+        </w:rPr>
+        <w:t xml:space="preserve">// (1) </w:t>
+      </w:r>
+      <w:r>
+        <w:rPr>
+          <w:rFonts w:ascii="Consolas" w:hAnsi="Consolas"/>
+          <w:sz w:val="18"/>
+          <w:szCs w:val="18"/>
+        </w:rPr>
+        <w:t>기본값으로</w:t>
+      </w:r>
+      <w:r>
+        <w:rPr>
+          <w:rFonts w:ascii="Consolas" w:hAnsi="Consolas"/>
+          <w:sz w:val="18"/>
+          <w:szCs w:val="18"/>
+        </w:rPr>
+        <w:t xml:space="preserve"> </w:t>
+      </w:r>
+      <w:r>
+        <w:rPr>
+          <w:rFonts w:ascii="Consolas" w:hAnsi="Consolas"/>
+          <w:sz w:val="18"/>
+          <w:szCs w:val="18"/>
+        </w:rPr>
+        <w:t>명시적</w:t>
+      </w:r>
+      <w:r>
+        <w:rPr>
+          <w:rFonts w:ascii="Consolas" w:hAnsi="Consolas"/>
+          <w:sz w:val="18"/>
+          <w:szCs w:val="18"/>
+        </w:rPr>
+        <w:t xml:space="preserve"> </w:t>
+      </w:r>
+      <w:r>
+        <w:rPr>
+          <w:rFonts w:ascii="Consolas" w:hAnsi="Consolas"/>
+          <w:sz w:val="18"/>
+          <w:szCs w:val="18"/>
+        </w:rPr>
+        <w:t>활성화</w:t>
+      </w:r>
+    </w:p>
+    <w:p>
+      <w:pPr>
+        <w:pBdr>
+          <w:left w:val="single" w:sz="18" w:space="6" w:color="C0C0C0"/>
+        </w:pBdr>
+        <w:shd w:val="clear" w:color="auto" w:fill="F4F4F4"/>
+      </w:pPr>
+      <w:r>
+        <w:rPr>
+          <w:rFonts w:ascii="Consolas" w:hAnsi="Consolas"/>
+          <w:sz w:val="18"/>
+          <w:szCs w:val="18"/>
+        </w:rPr>
+        <w:t>http.csrf(Customizer.withDefaults());</w:t>
+      </w:r>
+    </w:p>
+    <w:p>
+      <w:pPr>
+        <w:pBdr>
+          <w:left w:val="single" w:sz="18" w:space="6" w:color="C0C0C0"/>
+        </w:pBdr>
+        <w:shd w:val="clear" w:color="auto" w:fill="F4F4F4"/>
+      </w:pPr>
+      <w:r>
+        <w:rPr>
+          <w:rFonts w:ascii="Consolas" w:hAnsi="Consolas"/>
+          <w:sz w:val="18"/>
+          <w:szCs w:val="18"/>
+        </w:rPr>
+        <w:t xml:space="preserve"> </w:t>
+      </w:r>
+    </w:p>
+    <w:p>
+      <w:pPr>
+        <w:pBdr>
+          <w:left w:val="single" w:sz="18" w:space="6" w:color="C0C0C0"/>
+        </w:pBdr>
+        <w:shd w:val="clear" w:color="auto" w:fill="F4F4F4"/>
+      </w:pPr>
+      <w:r>
+        <w:rPr>
+          <w:rFonts w:ascii="Consolas" w:hAnsi="Consolas"/>
+          <w:sz w:val="18"/>
+          <w:szCs w:val="18"/>
+        </w:rPr>
+        <w:t xml:space="preserve">// (2) </w:t>
+      </w:r>
+      <w:r>
+        <w:rPr>
+          <w:rFonts w:ascii="Consolas" w:hAnsi="Consolas"/>
+          <w:sz w:val="18"/>
+          <w:szCs w:val="18"/>
+        </w:rPr>
+        <w:t>토큰</w:t>
+      </w:r>
+      <w:r>
+        <w:rPr>
+          <w:rFonts w:ascii="Consolas" w:hAnsi="Consolas"/>
+          <w:sz w:val="18"/>
+          <w:szCs w:val="18"/>
+        </w:rPr>
+        <w:t xml:space="preserve"> </w:t>
+      </w:r>
+      <w:r>
+        <w:rPr>
+          <w:rFonts w:ascii="Consolas" w:hAnsi="Consolas"/>
+          <w:sz w:val="18"/>
+          <w:szCs w:val="18"/>
+        </w:rPr>
+        <w:t>저장소를</w:t>
+      </w:r>
+      <w:r>
+        <w:rPr>
+          <w:rFonts w:ascii="Consolas" w:hAnsi="Consolas"/>
+          <w:sz w:val="18"/>
+          <w:szCs w:val="18"/>
+        </w:rPr>
+        <w:t xml:space="preserve"> </w:t>
+      </w:r>
+      <w:r>
+        <w:rPr>
+          <w:rFonts w:ascii="Consolas" w:hAnsi="Consolas"/>
+          <w:sz w:val="18"/>
+          <w:szCs w:val="18"/>
+        </w:rPr>
+        <w:t>세션에</w:t>
+      </w:r>
+      <w:r>
+        <w:rPr>
+          <w:rFonts w:ascii="Consolas" w:hAnsi="Consolas"/>
+          <w:sz w:val="18"/>
+          <w:szCs w:val="18"/>
+        </w:rPr>
+        <w:t xml:space="preserve"> (</w:t>
+      </w:r>
+      <w:r>
+        <w:rPr>
+          <w:rFonts w:ascii="Consolas" w:hAnsi="Consolas"/>
+          <w:sz w:val="18"/>
+          <w:szCs w:val="18"/>
+        </w:rPr>
+        <w:t>기본</w:t>
+      </w:r>
+      <w:r>
+        <w:rPr>
+          <w:rFonts w:ascii="Consolas" w:hAnsi="Consolas"/>
+          <w:sz w:val="18"/>
+          <w:szCs w:val="18"/>
+        </w:rPr>
+        <w:t xml:space="preserve"> </w:t>
+      </w:r>
+      <w:r>
+        <w:rPr>
+          <w:rFonts w:ascii="Consolas" w:hAnsi="Consolas"/>
+          <w:sz w:val="18"/>
+          <w:szCs w:val="18"/>
+        </w:rPr>
+        <w:t>동작을</w:t>
+      </w:r>
+      <w:r>
+        <w:rPr>
+          <w:rFonts w:ascii="Consolas" w:hAnsi="Consolas"/>
+          <w:sz w:val="18"/>
+          <w:szCs w:val="18"/>
+        </w:rPr>
+        <w:t xml:space="preserve"> </w:t>
+      </w:r>
+      <w:r>
+        <w:rPr>
+          <w:rFonts w:ascii="Consolas" w:hAnsi="Consolas"/>
+          <w:sz w:val="18"/>
+          <w:szCs w:val="18"/>
+        </w:rPr>
+        <w:t>명시</w:t>
+      </w:r>
+      <w:r>
+        <w:rPr>
+          <w:rFonts w:ascii="Consolas" w:hAnsi="Consolas"/>
+          <w:sz w:val="18"/>
+          <w:szCs w:val="18"/>
+        </w:rPr>
+        <w:t>)</w:t>
+      </w:r>
+    </w:p>
+    <w:p>
+      <w:pPr>
+        <w:pBdr>
+          <w:left w:val="single" w:sz="18" w:space="6" w:color="C0C0C0"/>
+        </w:pBdr>
+        <w:shd w:val="clear" w:color="auto" w:fill="F4F4F4"/>
+      </w:pPr>
+      <w:r>
+        <w:rPr>
+          <w:rFonts w:ascii="Consolas" w:hAnsi="Consolas"/>
+          <w:sz w:val="18"/>
+          <w:szCs w:val="18"/>
+        </w:rPr>
+        <w:t>http.csrf(csrf -&gt; csrf.csrfTokenRepository(new HttpSessionCsrfTokenRepository()));</w:t>
+      </w:r>
+    </w:p>
+    <w:p>
+      <w:pPr>
+        <w:pBdr>
+          <w:left w:val="single" w:sz="18" w:space="6" w:color="C0C0C0"/>
+        </w:pBdr>
+        <w:shd w:val="clear" w:color="auto" w:fill="F4F4F4"/>
+      </w:pPr>
+      <w:r>
+        <w:rPr>
+          <w:rFonts w:ascii="Consolas" w:hAnsi="Consolas"/>
+          <w:sz w:val="18"/>
+          <w:szCs w:val="18"/>
+        </w:rPr>
+        <w:t xml:space="preserve"> </w:t>
+      </w:r>
+    </w:p>
+    <w:p>
+      <w:pPr>
+        <w:pBdr>
+          <w:left w:val="single" w:sz="18" w:space="6" w:color="C0C0C0"/>
+        </w:pBdr>
+        <w:shd w:val="clear" w:color="auto" w:fill="F4F4F4"/>
+      </w:pPr>
+      <w:r>
+        <w:rPr>
+          <w:rFonts w:ascii="Consolas" w:hAnsi="Consolas"/>
+          <w:sz w:val="18"/>
+          <w:szCs w:val="18"/>
+        </w:rPr>
+        <w:t>// (3) SPA</w:t>
+      </w:r>
+      <w:r>
+        <w:rPr>
+          <w:rFonts w:ascii="Consolas" w:hAnsi="Consolas"/>
+          <w:sz w:val="18"/>
+          <w:szCs w:val="18"/>
+        </w:rPr>
+        <w:t>용</w:t>
+      </w:r>
+      <w:r>
+        <w:rPr>
+          <w:rFonts w:ascii="Consolas" w:hAnsi="Consolas"/>
+          <w:sz w:val="18"/>
+          <w:szCs w:val="18"/>
+        </w:rPr>
+        <w:t>: JS</w:t>
+      </w:r>
+      <w:r>
+        <w:rPr>
+          <w:rFonts w:ascii="Consolas" w:hAnsi="Consolas"/>
+          <w:sz w:val="18"/>
+          <w:szCs w:val="18"/>
+        </w:rPr>
+        <w:t>가</w:t>
+      </w:r>
+      <w:r>
+        <w:rPr>
+          <w:rFonts w:ascii="Consolas" w:hAnsi="Consolas"/>
+          <w:sz w:val="18"/>
+          <w:szCs w:val="18"/>
+        </w:rPr>
+        <w:t xml:space="preserve"> </w:t>
+      </w:r>
+      <w:r>
+        <w:rPr>
+          <w:rFonts w:ascii="Consolas" w:hAnsi="Consolas"/>
+          <w:sz w:val="18"/>
+          <w:szCs w:val="18"/>
+        </w:rPr>
+        <w:t>읽을</w:t>
+      </w:r>
+      <w:r>
+        <w:rPr>
+          <w:rFonts w:ascii="Consolas" w:hAnsi="Consolas"/>
+          <w:sz w:val="18"/>
+          <w:szCs w:val="18"/>
+        </w:rPr>
+        <w:t xml:space="preserve"> </w:t>
+      </w:r>
+      <w:r>
+        <w:rPr>
+          <w:rFonts w:ascii="Consolas" w:hAnsi="Consolas"/>
+          <w:sz w:val="18"/>
+          <w:szCs w:val="18"/>
+        </w:rPr>
+        <w:t>수</w:t>
+      </w:r>
+      <w:r>
+        <w:rPr>
+          <w:rFonts w:ascii="Consolas" w:hAnsi="Consolas"/>
+          <w:sz w:val="18"/>
+          <w:szCs w:val="18"/>
+        </w:rPr>
+        <w:t xml:space="preserve"> </w:t>
+      </w:r>
+      <w:r>
+        <w:rPr>
+          <w:rFonts w:ascii="Consolas" w:hAnsi="Consolas"/>
+          <w:sz w:val="18"/>
+          <w:szCs w:val="18"/>
+        </w:rPr>
+        <w:t>있는</w:t>
+      </w:r>
+      <w:r>
+        <w:rPr>
+          <w:rFonts w:ascii="Consolas" w:hAnsi="Consolas"/>
+          <w:sz w:val="18"/>
+          <w:szCs w:val="18"/>
+        </w:rPr>
+        <w:t xml:space="preserve"> </w:t>
+      </w:r>
+      <w:r>
+        <w:rPr>
+          <w:rFonts w:ascii="Consolas" w:hAnsi="Consolas"/>
+          <w:sz w:val="18"/>
+          <w:szCs w:val="18"/>
+        </w:rPr>
+        <w:t>쿠키에</w:t>
+      </w:r>
+      <w:r>
+        <w:rPr>
+          <w:rFonts w:ascii="Consolas" w:hAnsi="Consolas"/>
+          <w:sz w:val="18"/>
+          <w:szCs w:val="18"/>
+        </w:rPr>
+        <w:t xml:space="preserve"> </w:t>
+      </w:r>
+      <w:r>
+        <w:rPr>
+          <w:rFonts w:ascii="Consolas" w:hAnsi="Consolas"/>
+          <w:sz w:val="18"/>
+          <w:szCs w:val="18"/>
+        </w:rPr>
+        <w:t>토큰</w:t>
+      </w:r>
+      <w:r>
+        <w:rPr>
+          <w:rFonts w:ascii="Consolas" w:hAnsi="Consolas"/>
+          <w:sz w:val="18"/>
+          <w:szCs w:val="18"/>
+        </w:rPr>
+        <w:t xml:space="preserve"> </w:t>
+      </w:r>
+      <w:r>
+        <w:rPr>
+          <w:rFonts w:ascii="Consolas" w:hAnsi="Consolas"/>
+          <w:sz w:val="18"/>
+          <w:szCs w:val="18"/>
+        </w:rPr>
+        <w:t>저장</w:t>
+      </w:r>
+    </w:p>
+    <w:p>
+      <w:pPr>
+        <w:pBdr>
+          <w:left w:val="single" w:sz="18" w:space="6" w:color="C0C0C0"/>
+        </w:pBdr>
+        <w:shd w:val="clear" w:color="auto" w:fill="F4F4F4"/>
+      </w:pPr>
+      <w:r>
+        <w:rPr>
+          <w:rFonts w:ascii="Consolas" w:hAnsi="Consolas"/>
+          <w:sz w:val="18"/>
+          <w:szCs w:val="18"/>
+        </w:rPr>
+        <w:t>http.csrf(csrf -&gt; csrf.csrfTokenRepository(CookieCsrfTokenRepository.withHttpOnlyFalse()));</w:t>
+      </w:r>
+    </w:p>
+    <w:p>
+      <w:pPr>
+        <w:pBdr>
+          <w:left w:val="single" w:sz="18" w:space="6" w:color="C0C0C0"/>
+        </w:pBdr>
+        <w:shd w:val="clear" w:color="auto" w:fill="F4F4F4"/>
+      </w:pPr>
+      <w:r>
+        <w:rPr>
+          <w:rFonts w:ascii="Consolas" w:hAnsi="Consolas"/>
+          <w:sz w:val="18"/>
+          <w:szCs w:val="18"/>
+        </w:rPr>
+        <w:t xml:space="preserve"> </w:t>
+      </w:r>
+    </w:p>
+    <w:p>
+      <w:pPr>
+        <w:pBdr>
+          <w:left w:val="single" w:sz="18" w:space="6" w:color="C0C0C0"/>
+        </w:pBdr>
+        <w:shd w:val="clear" w:color="auto" w:fill="F4F4F4"/>
+      </w:pPr>
+      <w:r>
+        <w:rPr>
+          <w:rFonts w:ascii="Consolas" w:hAnsi="Consolas"/>
+          <w:sz w:val="18"/>
+          <w:szCs w:val="18"/>
+        </w:rPr>
+        <w:t xml:space="preserve">// (4) </w:t>
+      </w:r>
+      <w:r>
+        <w:rPr>
+          <w:rFonts w:ascii="Consolas" w:hAnsi="Consolas"/>
+          <w:sz w:val="18"/>
+          <w:szCs w:val="18"/>
+        </w:rPr>
+        <w:t>특정</w:t>
+      </w:r>
+      <w:r>
+        <w:rPr>
+          <w:rFonts w:ascii="Consolas" w:hAnsi="Consolas"/>
+          <w:sz w:val="18"/>
+          <w:szCs w:val="18"/>
+        </w:rPr>
+        <w:t xml:space="preserve"> </w:t>
+      </w:r>
+      <w:r>
+        <w:rPr>
+          <w:rFonts w:ascii="Consolas" w:hAnsi="Consolas"/>
+          <w:sz w:val="18"/>
+          <w:szCs w:val="18"/>
+        </w:rPr>
+        <w:t>경로만</w:t>
+      </w:r>
+      <w:r>
+        <w:rPr>
+          <w:rFonts w:ascii="Consolas" w:hAnsi="Consolas"/>
+          <w:sz w:val="18"/>
+          <w:szCs w:val="18"/>
+        </w:rPr>
+        <w:t xml:space="preserve"> </w:t>
+      </w:r>
+      <w:r>
+        <w:rPr>
+          <w:rFonts w:ascii="Consolas" w:hAnsi="Consolas"/>
+          <w:sz w:val="18"/>
+          <w:szCs w:val="18"/>
+        </w:rPr>
+        <w:t>예외</w:t>
+      </w:r>
+      <w:r>
+        <w:rPr>
+          <w:rFonts w:ascii="Consolas" w:hAnsi="Consolas"/>
+          <w:sz w:val="18"/>
+          <w:szCs w:val="18"/>
+        </w:rPr>
+        <w:t>(</w:t>
+      </w:r>
+      <w:r>
+        <w:rPr>
+          <w:rFonts w:ascii="Consolas" w:hAnsi="Consolas"/>
+          <w:sz w:val="18"/>
+          <w:szCs w:val="18"/>
+        </w:rPr>
+        <w:t>예</w:t>
+      </w:r>
+      <w:r>
+        <w:rPr>
+          <w:rFonts w:ascii="Consolas" w:hAnsi="Consolas"/>
+          <w:sz w:val="18"/>
+          <w:szCs w:val="18"/>
+        </w:rPr>
+        <w:t xml:space="preserve">: </w:t>
+      </w:r>
+      <w:r>
+        <w:rPr>
+          <w:rFonts w:ascii="Consolas" w:hAnsi="Consolas"/>
+          <w:sz w:val="18"/>
+          <w:szCs w:val="18"/>
+        </w:rPr>
+        <w:t>순수</w:t>
+      </w:r>
+      <w:r>
+        <w:rPr>
+          <w:rFonts w:ascii="Consolas" w:hAnsi="Consolas"/>
+          <w:sz w:val="18"/>
+          <w:szCs w:val="18"/>
+        </w:rPr>
+        <w:t xml:space="preserve"> REST) </w:t>
+      </w:r>
+    </w:p>
+    <w:p>
+      <w:pPr>
+        <w:pBdr>
+          <w:left w:val="single" w:sz="18" w:space="6" w:color="C0C0C0"/>
+          <w:bottom w:val="single" w:sz="4" w:space="3" w:color="D9D9D9"/>
+        </w:pBdr>
+        <w:shd w:val="clear" w:color="auto" w:fill="F4F4F4"/>
+      </w:pPr>
+      <w:r>
+        <w:rPr>
+          <w:rFonts w:ascii="Consolas" w:hAnsi="Consolas"/>
+          <w:sz w:val="18"/>
+          <w:szCs w:val="18"/>
+        </w:rPr>
+        <w:t>http.csrf(csrf -&gt; csrf.ignoringRequestMatchers("/api/**"));</w:t>
+      </w:r>
+    </w:p>
+    <w:p>
+      <w:pPr>
+        <w:spacing w:after="80" w:line="272" w:lineRule="auto"/>
+      </w:pPr>
+      <w:r>
+        <w:t xml:space="preserve">이 앱은 JWT 체인(/api/**)은 csrf.disable(), 세션 </w:t>
+      </w:r>
+      <w:r>
+        <w:rPr>
+          <w:rFonts w:hint="eastAsia"/>
+        </w:rPr>
+        <w:t>체</w:t>
+      </w:r>
+      <w:r>
+        <w:t>인은 기본 활성(disable 제거)로 두어 인증 방식별로 구분했다.</w:t>
+      </w:r>
+    </w:p>
+    <w:p>
+      <w:pPr>
+        <w:pStyle w:val="3"/>
+        <w:spacing w:before="200" w:after="80"/>
+      </w:pPr>
+      <w:r>
+        <w:rPr>
+          <w:b/>
+          <w:bCs/>
+          <w:color w:val="2E5496"/>
+        </w:rPr>
         <w:t>Thymeleaf 폼의 _csrf 자동 삽입 원리</w:t>
       </w:r>
     </w:p>
@@ -2386,7 +3305,7 @@
           <w:color w:val="1F3864"/>
         </w:rPr>
         <w:lastRenderedPageBreak/>
-        <w:t xml:space="preserve">6. 추가 이슈 : 상태 변경 GET (취약 재현 vs 안전)</w:t>
+        <w:t>6. 추가 이슈 : 상태 변경 GET (취약 재현 vs 안전)</w:t>
       </w:r>
     </w:p>
     <w:p>
@@ -2394,7 +3313,7 @@
         <w:spacing w:after="80" w:line="272" w:lineRule="auto"/>
       </w:pPr>
       <w:r>
-        <w:t xml:space="preserve">CSRF 의 두 번째 벡터는 "상태 변경을 GET 으로 받는 것"이다. CSRF 토큰은 GET 요청에는 적용되지 않으므로, CSRF 를 켜도 &lt;img src="http://localhost:8080/users/delete/1"&gt; 한 줄로 삭제가 트리거된다. 이 위험을 직접 눈으로 보기 위해, 이 앱은 같은 경로에 안전(POST)·취약(GET) 삭제를 함께 두었다.</w:t>
+        <w:t>CSRF 의 두 번째 벡터는 "상태 변경을 GET 으로 받는 것"이다. CSRF 토큰은 GET 요청에는 적용되지 않으므로, CSRF 를 켜도 &lt;img src="http://localhost:8080/users/delete/1"&gt; 한 줄로 삭제가 트리거된다. 이 위험을 직접 눈으로 보기 위해, 이 앱은 같은 경로에 안전(POST)·취약(GET) 삭제를 함께 두었다.</w:t>
       </w:r>
     </w:p>
     <w:p>
@@ -2408,7 +3327,7 @@
           <w:bCs/>
           <w:color w:val="2E5496"/>
         </w:rPr>
-        <w:t xml:space="preserve">안전 버전 : 삭제를 POST(+CSRF 토큰)로</w:t>
+        <w:t>안전 버전 : 삭제를 POST(+CSRF 토큰)로</w:t>
       </w:r>
     </w:p>
     <w:p>
@@ -2416,7 +3335,7 @@
         <w:spacing w:after="80" w:line="272" w:lineRule="auto"/>
       </w:pPr>
       <w:r>
-        <w:t xml:space="preserve">삭제는 상태 변경이므로 POST 로 받는다. Thymeleaf 가 _csrf 토큰을 자동 삽입하고, 위조 요청은 토큰이 없어 차단된다.</w:t>
+        <w:t>삭제는 상태 변경이므로 POST 로 받는다. Thymeleaf 가 _csrf 토큰을 자동 삽입하고, 위조 요청은 토큰이 없어 차단된다.</w:t>
       </w:r>
     </w:p>
     <w:p>
@@ -2433,7 +3352,103 @@
           <w:sz w:val="18"/>
           <w:szCs w:val="18"/>
         </w:rPr>
-        <w:t xml:space="preserve">@PostMapping("/delete/{id}")        // 안전 index.html 삭제 폼이 사용 (_csrf 토큰 요구)</w:t>
+        <w:t xml:space="preserve">@PostMapping("/delete/{id}")        // </w:t>
+      </w:r>
+      <w:r>
+        <w:rPr>
+          <w:rFonts w:ascii="Consolas" w:hAnsi="Consolas"/>
+          <w:sz w:val="18"/>
+          <w:szCs w:val="18"/>
+        </w:rPr>
+        <w:t>안전</w:t>
+      </w:r>
+      <w:r>
+        <w:rPr>
+          <w:rFonts w:ascii="Consolas" w:hAnsi="Consolas"/>
+          <w:sz w:val="18"/>
+          <w:szCs w:val="18"/>
+        </w:rPr>
+        <w:t xml:space="preserve"> index.html </w:t>
+      </w:r>
+      <w:r>
+        <w:rPr>
+          <w:rFonts w:ascii="Consolas" w:hAnsi="Consolas"/>
+          <w:sz w:val="18"/>
+          <w:szCs w:val="18"/>
+        </w:rPr>
+        <w:t>삭제</w:t>
+      </w:r>
+      <w:r>
+        <w:rPr>
+          <w:rFonts w:ascii="Consolas" w:hAnsi="Consolas"/>
+          <w:sz w:val="18"/>
+          <w:szCs w:val="18"/>
+        </w:rPr>
+        <w:t xml:space="preserve"> </w:t>
+      </w:r>
+      <w:r>
+        <w:rPr>
+          <w:rFonts w:ascii="Consolas" w:hAnsi="Consolas"/>
+          <w:sz w:val="18"/>
+          <w:szCs w:val="18"/>
+        </w:rPr>
+        <w:t>폼이</w:t>
+      </w:r>
+      <w:r>
+        <w:rPr>
+          <w:rFonts w:ascii="Consolas" w:hAnsi="Consolas"/>
+          <w:sz w:val="18"/>
+          <w:szCs w:val="18"/>
+        </w:rPr>
+        <w:t xml:space="preserve"> </w:t>
+      </w:r>
+      <w:r>
+        <w:rPr>
+          <w:rFonts w:ascii="Consolas" w:hAnsi="Consolas"/>
+          <w:sz w:val="18"/>
+          <w:szCs w:val="18"/>
+        </w:rPr>
+        <w:t>사용</w:t>
+      </w:r>
+      <w:r>
+        <w:rPr>
+          <w:rFonts w:ascii="Consolas" w:hAnsi="Consolas"/>
+          <w:sz w:val="18"/>
+          <w:szCs w:val="18"/>
+        </w:rPr>
+        <w:t xml:space="preserve"> (_csrf </w:t>
+      </w:r>
+      <w:r>
+        <w:rPr>
+          <w:rFonts w:ascii="Consolas" w:hAnsi="Consolas"/>
+          <w:sz w:val="18"/>
+          <w:szCs w:val="18"/>
+        </w:rPr>
+        <w:t>토큰</w:t>
+      </w:r>
+      <w:r>
+        <w:rPr>
+          <w:rFonts w:ascii="Consolas" w:hAnsi="Consolas"/>
+          <w:sz w:val="18"/>
+          <w:szCs w:val="18"/>
+        </w:rPr>
+        <w:t xml:space="preserve"> </w:t>
+      </w:r>
+      <w:r>
+        <w:rPr>
+          <w:rFonts w:ascii="Consolas" w:hAnsi="Consolas"/>
+          <w:sz w:val="18"/>
+          <w:szCs w:val="18"/>
+        </w:rPr>
+        <w:t>요구</w:t>
+      </w:r>
+      <w:r>
+        <w:rPr>
+          <w:rFonts w:ascii="Consolas" w:hAnsi="Consolas"/>
+          <w:sz w:val="18"/>
+          <w:szCs w:val="18"/>
+        </w:rPr>
+        <w:t>)</w:t>
       </w:r>
     </w:p>
     <w:p>
@@ -2464,7 +3479,7 @@
           <w:bCs/>
           <w:color w:val="2E5496"/>
         </w:rPr>
-        <w:t xml:space="preserve">취약 버전(예전 방식) : GET 삭제 — &lt;img&gt; 공격 재현</w:t>
+        <w:t>취약 버전(예전 방식) : GET 삭제 — &lt;img&gt; 공격 재현</w:t>
       </w:r>
     </w:p>
     <w:p>
@@ -2472,7 +3487,7 @@
         <w:spacing w:after="80" w:line="272" w:lineRule="auto"/>
       </w:pPr>
       <w:r>
-        <w:t xml:space="preserve">같은 경로에 GET 핸들러를 함께 둔다. HTTP 메서드가 달라(GET↔POST) 위 POST 와 별도로 매핑되며, GET 은 CSRF 토큰 검증 대상이 아니므로 토큰 없이도 실행된다.</w:t>
+        <w:t>같은 경로에 GET 핸들러를 함께 둔다. HTTP 메서드가 달라(GET↔POST) 위 POST 와 별도로 매핑되며, GET 은 CSRF 토큰 검증 대상이 아니므로 토큰 없이도 실행된다.</w:t>
       </w:r>
     </w:p>
     <w:p>
@@ -2489,7 +3504,143 @@
           <w:sz w:val="18"/>
           <w:szCs w:val="18"/>
         </w:rPr>
-        <w:t xml:space="preserve">//[취약] GET 은 CSRF 토큰 검증을 우회한다 — 공격 재현 실습 전용</w:t>
+        <w:t>//[</w:t>
+      </w:r>
+      <w:r>
+        <w:rPr>
+          <w:rFonts w:ascii="Consolas" w:hAnsi="Consolas"/>
+          <w:sz w:val="18"/>
+          <w:szCs w:val="18"/>
+        </w:rPr>
+        <w:t>취약</w:t>
+      </w:r>
+      <w:r>
+        <w:rPr>
+          <w:rFonts w:ascii="Consolas" w:hAnsi="Consolas"/>
+          <w:sz w:val="18"/>
+          <w:szCs w:val="18"/>
+        </w:rPr>
+        <w:t xml:space="preserve">] GET </w:t>
+      </w:r>
+      <w:r>
+        <w:rPr>
+          <w:rFonts w:ascii="Consolas" w:hAnsi="Consolas"/>
+          <w:sz w:val="18"/>
+          <w:szCs w:val="18"/>
+        </w:rPr>
+        <w:t>은</w:t>
+      </w:r>
+      <w:r>
+        <w:rPr>
+          <w:rFonts w:ascii="Consolas" w:hAnsi="Consolas"/>
+          <w:sz w:val="18"/>
+          <w:szCs w:val="18"/>
+        </w:rPr>
+        <w:t xml:space="preserve"> CSRF </w:t>
+      </w:r>
+      <w:r>
+        <w:rPr>
+          <w:rFonts w:ascii="Consolas" w:hAnsi="Consolas"/>
+          <w:sz w:val="18"/>
+          <w:szCs w:val="18"/>
+        </w:rPr>
+        <w:t>토큰</w:t>
+      </w:r>
+      <w:r>
+        <w:rPr>
+          <w:rFonts w:ascii="Consolas" w:hAnsi="Consolas"/>
+          <w:sz w:val="18"/>
+          <w:szCs w:val="18"/>
+        </w:rPr>
+        <w:t xml:space="preserve"> </w:t>
+      </w:r>
+      <w:r>
+        <w:rPr>
+          <w:rFonts w:ascii="Consolas" w:hAnsi="Consolas"/>
+          <w:sz w:val="18"/>
+          <w:szCs w:val="18"/>
+        </w:rPr>
+        <w:t>검증을</w:t>
+      </w:r>
+      <w:r>
+        <w:rPr>
+          <w:rFonts w:ascii="Consolas" w:hAnsi="Consolas"/>
+          <w:sz w:val="18"/>
+          <w:szCs w:val="18"/>
+        </w:rPr>
+        <w:t xml:space="preserve"> </w:t>
+      </w:r>
+      <w:r>
+        <w:rPr>
+          <w:rFonts w:ascii="Consolas" w:hAnsi="Consolas"/>
+          <w:sz w:val="18"/>
+          <w:szCs w:val="18"/>
+        </w:rPr>
+        <w:t>우회한다</w:t>
+      </w:r>
+      <w:r>
+        <w:rPr>
+          <w:rFonts w:ascii="Consolas" w:hAnsi="Consolas"/>
+          <w:sz w:val="18"/>
+          <w:szCs w:val="18"/>
+        </w:rPr>
+        <w:t xml:space="preserve"> — </w:t>
+      </w:r>
+      <w:r>
+        <w:rPr>
+          <w:rFonts w:ascii="Consolas" w:hAnsi="Consolas"/>
+          <w:sz w:val="18"/>
+          <w:szCs w:val="18"/>
+        </w:rPr>
+        <w:t>공격</w:t>
+      </w:r>
+      <w:r>
+        <w:rPr>
+          <w:rFonts w:ascii="Consolas" w:hAnsi="Consolas"/>
+          <w:sz w:val="18"/>
+          <w:szCs w:val="18"/>
+        </w:rPr>
+        <w:t xml:space="preserve"> </w:t>
+      </w:r>
+      <w:r>
+        <w:rPr>
+          <w:rFonts w:ascii="Consolas" w:hAnsi="Consolas"/>
+          <w:sz w:val="18"/>
+          <w:szCs w:val="18"/>
+        </w:rPr>
+        <w:t>재현</w:t>
+      </w:r>
+      <w:r>
+        <w:rPr>
+          <w:rFonts w:ascii="Consolas" w:hAnsi="Consolas"/>
+          <w:sz w:val="18"/>
+          <w:szCs w:val="18"/>
+        </w:rPr>
+        <w:t xml:space="preserve"> </w:t>
+      </w:r>
+      <w:r>
+        <w:rPr>
+          <w:rFonts w:ascii="Consolas" w:hAnsi="Consolas"/>
+          <w:sz w:val="18"/>
+          <w:szCs w:val="18"/>
+        </w:rPr>
+        <w:t>실습</w:t>
+      </w:r>
+      <w:r>
+        <w:rPr>
+          <w:rFonts w:ascii="Consolas" w:hAnsi="Consolas"/>
+          <w:sz w:val="18"/>
+          <w:szCs w:val="18"/>
+        </w:rPr>
+        <w:t xml:space="preserve"> </w:t>
+      </w:r>
+      <w:r>
+        <w:rPr>
+          <w:rFonts w:ascii="Consolas" w:hAnsi="Consolas"/>
+          <w:sz w:val="18"/>
+          <w:szCs w:val="18"/>
+        </w:rPr>
+        <w:t>전용</w:t>
       </w:r>
     </w:p>
     <w:p>
@@ -2530,7 +3681,7 @@
         <w:spacing w:after="80" w:line="272" w:lineRule="auto"/>
       </w:pPr>
       <w:r>
-        <w:t xml:space="preserve">공격자 페이지(csrf_attack.html)에 아래 한 줄만 있으면, 로그인된 피해자가 그 페이지를 여는 순간 세션 쿠키(JSESSIONID)가 자동 첨부되어 삭제가 실행된다.</w:t>
+        <w:t>공격자 페이지(csrf_attack.html)에 아래 한 줄만 있으면, 로그인된 피해자가 그 페이지를 여는 순간 세션 쿠키(JSESSIONID)가 자동 첨부되어 삭제가 실행된다.</w:t>
       </w:r>
     </w:p>
     <w:p>
@@ -2547,7 +3698,119 @@
           <w:sz w:val="18"/>
           <w:szCs w:val="18"/>
         </w:rPr>
-        <w:t xml:space="preserve">&lt;!-- 이미지 로딩 = GET 요청. _csrf 토큰이 없어도 GET 이라 통과된다 --&gt;</w:t>
+        <w:t xml:space="preserve">&lt;!-- </w:t>
+      </w:r>
+      <w:r>
+        <w:rPr>
+          <w:rFonts w:ascii="Consolas" w:hAnsi="Consolas"/>
+          <w:sz w:val="18"/>
+          <w:szCs w:val="18"/>
+        </w:rPr>
+        <w:t>이미지</w:t>
+      </w:r>
+      <w:r>
+        <w:rPr>
+          <w:rFonts w:ascii="Consolas" w:hAnsi="Consolas"/>
+          <w:sz w:val="18"/>
+          <w:szCs w:val="18"/>
+        </w:rPr>
+        <w:t xml:space="preserve"> </w:t>
+      </w:r>
+      <w:r>
+        <w:rPr>
+          <w:rFonts w:ascii="Consolas" w:hAnsi="Consolas"/>
+          <w:sz w:val="18"/>
+          <w:szCs w:val="18"/>
+        </w:rPr>
+        <w:t>로딩</w:t>
+      </w:r>
+      <w:r>
+        <w:rPr>
+          <w:rFonts w:ascii="Consolas" w:hAnsi="Consolas"/>
+          <w:sz w:val="18"/>
+          <w:szCs w:val="18"/>
+        </w:rPr>
+        <w:t xml:space="preserve"> = GET </w:t>
+      </w:r>
+      <w:r>
+        <w:rPr>
+          <w:rFonts w:ascii="Consolas" w:hAnsi="Consolas"/>
+          <w:sz w:val="18"/>
+          <w:szCs w:val="18"/>
+        </w:rPr>
+        <w:t>요청</w:t>
+      </w:r>
+      <w:r>
+        <w:rPr>
+          <w:rFonts w:ascii="Consolas" w:hAnsi="Consolas"/>
+          <w:sz w:val="18"/>
+          <w:szCs w:val="18"/>
+        </w:rPr>
+        <w:t xml:space="preserve">. _csrf </w:t>
+      </w:r>
+      <w:r>
+        <w:rPr>
+          <w:rFonts w:ascii="Consolas" w:hAnsi="Consolas"/>
+          <w:sz w:val="18"/>
+          <w:szCs w:val="18"/>
+        </w:rPr>
+        <w:t>토큰이</w:t>
+      </w:r>
+      <w:r>
+        <w:rPr>
+          <w:rFonts w:ascii="Consolas" w:hAnsi="Consolas"/>
+          <w:sz w:val="18"/>
+          <w:szCs w:val="18"/>
+        </w:rPr>
+        <w:t xml:space="preserve"> </w:t>
+      </w:r>
+      <w:r>
+        <w:rPr>
+          <w:rFonts w:ascii="Consolas" w:hAnsi="Consolas"/>
+          <w:sz w:val="18"/>
+          <w:szCs w:val="18"/>
+        </w:rPr>
+        <w:t>없어도</w:t>
+      </w:r>
+      <w:r>
+        <w:rPr>
+          <w:rFonts w:ascii="Consolas" w:hAnsi="Consolas"/>
+          <w:sz w:val="18"/>
+          <w:szCs w:val="18"/>
+        </w:rPr>
+        <w:t xml:space="preserve"> GET </w:t>
+      </w:r>
+      <w:r>
+        <w:rPr>
+          <w:rFonts w:ascii="Consolas" w:hAnsi="Consolas"/>
+          <w:sz w:val="18"/>
+          <w:szCs w:val="18"/>
+        </w:rPr>
+        <w:t>이라</w:t>
+      </w:r>
+      <w:r>
+        <w:rPr>
+          <w:rFonts w:ascii="Consolas" w:hAnsi="Consolas"/>
+          <w:sz w:val="18"/>
+          <w:szCs w:val="18"/>
+        </w:rPr>
+        <w:t xml:space="preserve"> </w:t>
+      </w:r>
+      <w:r>
+        <w:rPr>
+          <w:rFonts w:ascii="Consolas" w:hAnsi="Consolas"/>
+          <w:sz w:val="18"/>
+          <w:szCs w:val="18"/>
+        </w:rPr>
+        <w:t>통과된다</w:t>
+      </w:r>
+      <w:r>
+        <w:rPr>
+          <w:rFonts w:ascii="Consolas" w:hAnsi="Consolas"/>
+          <w:sz w:val="18"/>
+          <w:szCs w:val="18"/>
+        </w:rPr>
+        <w:t xml:space="preserve"> --&gt;</w:t>
       </w:r>
     </w:p>
     <w:p>
@@ -2589,7 +3852,7 @@
         <w:spacing w:after="50" w:line="264" w:lineRule="auto"/>
       </w:pPr>
       <w:r>
-        <w:t xml:space="preserve">삭제해도 되는 사용자(예: id=1)를 목록에 준비</w:t>
+        <w:t>삭제해도 되는 사용자(예: id=1)를 목록에 준비</w:t>
       </w:r>
     </w:p>
     <w:p>
@@ -2602,7 +3865,7 @@
         <w:spacing w:after="50" w:line="264" w:lineRule="auto"/>
       </w:pPr>
       <w:r>
-        <w:t xml:space="preserve">피해자가 앱에 폼 로그인 (세션 쿠키 보유)</w:t>
+        <w:t>피해자가 앱에 폼 로그인 (세션 쿠키 보유)</w:t>
       </w:r>
     </w:p>
     <w:p>
@@ -2615,7 +3878,7 @@
         <w:spacing w:after="50" w:line="264" w:lineRule="auto"/>
       </w:pPr>
       <w:r>
-        <w:t xml:space="preserve">같은 브라우저로 csrf_attack.html(file:// 등 다른 오리진) 열기</w:t>
+        <w:t>같은 브라우저로 csrf_attack.html(file:// 등 다른 오리진) 열기</w:t>
       </w:r>
     </w:p>
     <w:p>
@@ -2628,7 +3891,7 @@
         <w:spacing w:after="50" w:line="264" w:lineRule="auto"/>
       </w:pPr>
       <w:r>
-        <w:t xml:space="preserve">이미지 요청이 나가며 → id=1 사용자가 삭제됨 (CSRF 가 켜져 있어도 GET 이라 못 막음)</w:t>
+        <w:t>이미지 요청이 나가며 → id=1 사용자가 삭제됨 (CSRF 가 켜져 있어도 GET 이라 못 막음)</w:t>
       </w:r>
     </w:p>
     <w:p>
@@ -2642,7 +3905,7 @@
           <w:bCs/>
           <w:color w:val="2E5496"/>
         </w:rPr>
-        <w:t xml:space="preserve">진짜 방어 : GET 핸들러 제거</w:t>
+        <w:t>진짜 방어 : GET 핸들러 제거</w:t>
       </w:r>
     </w:p>
     <w:p>
@@ -2650,7 +3913,7 @@
         <w:spacing w:after="80" w:line="272" w:lineRule="auto"/>
       </w:pPr>
       <w:r>
-        <w:t xml:space="preserve">&lt;img&gt; GET 삭제는 CSRF 토큰으로 막을 수 없다. 유일한 방어는 "상태 변경을 GET 으로 받지 않는 것" — GET 핸들러를 제거하고 POST(+_csrf)만 남기는 것이다.</w:t>
+        <w:t>&lt;img&gt; GET 삭제는 CSRF 토큰으로 막을 수 없다. 유일한 방어는 "상태 변경을 GET 으로 받지 않는 것" — GET 핸들러를 제거하고 POST(+_csrf)만 남기는 것이다.</w:t>
       </w:r>
     </w:p>
     <w:tbl>
@@ -2716,7 +3979,7 @@
                 <w:sz w:val="18"/>
                 <w:szCs w:val="18"/>
               </w:rPr>
-              <w:t xml:space="preserve">안전 POST만 있을 때</w:t>
+              <w:t>안전 POST만 있을 때</w:t>
             </w:r>
           </w:p>
         </w:tc>
@@ -2740,7 +4003,7 @@
                 <w:sz w:val="18"/>
                 <w:szCs w:val="18"/>
               </w:rPr>
-              <w:t xml:space="preserve">취약 GET이 있을 때</w:t>
+              <w:t>취약 GET이 있을 때</w:t>
             </w:r>
           </w:p>
         </w:tc>
@@ -2762,7 +4025,7 @@
                 <w:sz w:val="18"/>
                 <w:szCs w:val="18"/>
               </w:rPr>
-              <w:t xml:space="preserve">&lt;img&gt; GET 삭제</w:t>
+              <w:t>&lt;img&gt; GET 삭제</w:t>
             </w:r>
           </w:p>
         </w:tc>
@@ -2826,7 +4089,7 @@
                 <w:sz w:val="18"/>
                 <w:szCs w:val="18"/>
               </w:rPr>
-              <w:t xml:space="preserve">위조 삭제 POST(토큰X)</w:t>
+              <w:t>위조 삭제 POST(토큰X)</w:t>
             </w:r>
           </w:p>
         </w:tc>
@@ -2847,7 +4110,7 @@
                 <w:sz w:val="18"/>
                 <w:szCs w:val="18"/>
               </w:rPr>
-              <w:t xml:space="preserve">403 (CSRF 차단)</w:t>
+              <w:t>403 (CSRF 차단)</w:t>
             </w:r>
           </w:p>
         </w:tc>
@@ -2890,7 +4153,7 @@
                 <w:sz w:val="18"/>
                 <w:szCs w:val="18"/>
               </w:rPr>
-              <w:t xml:space="preserve">정상 삭제 POST(토큰O)</w:t>
+              <w:t>정상 삭제 POST(토큰O)</w:t>
             </w:r>
           </w:p>
         </w:tc>
@@ -2974,8 +4237,6 @@
         </w:rPr>
         <w:t>검증</w:t>
       </w:r>
-      <w:bookmarkStart w:id="0" w:name="_GoBack"/>
-      <w:bookmarkEnd w:id="0"/>
       <w:r>
         <w:rPr>
           <w:rFonts w:hint="eastAsia"/>
@@ -2991,7 +4252,196 @@
         <w:spacing w:after="80" w:line="272" w:lineRule="auto"/>
       </w:pPr>
       <w:r>
-        <w:t xml:space="preserve">아래 curl 로 재현한다. 실제 공격은 마지막 GET 한 줄(5)뿐이고, 앞 단계(1~4)는 그 조건(로그인 세션·삭제 대상)을 curl 로 갖추는 준비다. python -c 는 응답 JSON 에서 값 하나(accessToken/id)를, grep 은 HTML 에서 _csrf 값을 뽑는다.</w:t>
+        <w:t>아래</w:t>
+      </w:r>
+      <w:r>
+        <w:t xml:space="preserve"> curl </w:t>
+      </w:r>
+      <w:r>
+        <w:t>로</w:t>
+      </w:r>
+      <w:r>
+        <w:t xml:space="preserve"> </w:t>
+      </w:r>
+      <w:r>
+        <w:t>재현한다</w:t>
+      </w:r>
+      <w:r>
+        <w:t xml:space="preserve">. </w:t>
+      </w:r>
+      <w:r>
+        <w:t>실제</w:t>
+      </w:r>
+      <w:r>
+        <w:t xml:space="preserve"> </w:t>
+      </w:r>
+      <w:r>
+        <w:t>공격은</w:t>
+      </w:r>
+      <w:r>
+        <w:t xml:space="preserve"> </w:t>
+      </w:r>
+      <w:r>
+        <w:t>마지막</w:t>
+      </w:r>
+      <w:r>
+        <w:t xml:space="preserve"> GET </w:t>
+      </w:r>
+      <w:r>
+        <w:t>한</w:t>
+      </w:r>
+      <w:r>
+        <w:t xml:space="preserve"> </w:t>
+      </w:r>
+      <w:r>
+        <w:t>줄</w:t>
+      </w:r>
+      <w:r>
+        <w:t>(5)</w:t>
+      </w:r>
+      <w:r>
+        <w:t>뿐이고</w:t>
+      </w:r>
+      <w:r>
+        <w:t xml:space="preserve">, </w:t>
+      </w:r>
+      <w:r>
+        <w:t>앞</w:t>
+      </w:r>
+      <w:r>
+        <w:t xml:space="preserve"> </w:t>
+      </w:r>
+      <w:r>
+        <w:t>단계</w:t>
+      </w:r>
+      <w:r>
+        <w:t>(1~4)</w:t>
+      </w:r>
+      <w:r>
+        <w:t>는</w:t>
+      </w:r>
+      <w:r>
+        <w:t xml:space="preserve"> </w:t>
+      </w:r>
+      <w:r>
+        <w:t>그</w:t>
+      </w:r>
+      <w:r>
+        <w:t xml:space="preserve"> </w:t>
+      </w:r>
+      <w:r>
+        <w:t>조건</w:t>
+      </w:r>
+      <w:r>
+        <w:t>(</w:t>
+      </w:r>
+      <w:r>
+        <w:t>로그인</w:t>
+      </w:r>
+      <w:r>
+        <w:t xml:space="preserve"> </w:t>
+      </w:r>
+      <w:r>
+        <w:t>세션</w:t>
+      </w:r>
+      <w:r>
+        <w:t>·</w:t>
+      </w:r>
+      <w:r>
+        <w:t>삭제</w:t>
+      </w:r>
+      <w:r>
+        <w:t xml:space="preserve"> </w:t>
+      </w:r>
+      <w:r>
+        <w:t>대상</w:t>
+      </w:r>
+      <w:r>
+        <w:t>)</w:t>
+      </w:r>
+      <w:r>
+        <w:t>을</w:t>
+      </w:r>
+      <w:r>
+        <w:t xml:space="preserve"> curl </w:t>
+      </w:r>
+      <w:r>
+        <w:t>로</w:t>
+      </w:r>
+      <w:r>
+        <w:t xml:space="preserve"> </w:t>
+      </w:r>
+      <w:r>
+        <w:t>갖추는</w:t>
+      </w:r>
+      <w:r>
+        <w:t xml:space="preserve"> </w:t>
+      </w:r>
+      <w:r>
+        <w:t>준비다</w:t>
+      </w:r>
+      <w:r>
+        <w:t xml:space="preserve">. python -c </w:t>
+      </w:r>
+      <w:r>
+        <w:t>는</w:t>
+      </w:r>
+      <w:r>
+        <w:t xml:space="preserve"> </w:t>
+      </w:r>
+      <w:r>
+        <w:t>응답</w:t>
+      </w:r>
+      <w:r>
+        <w:t xml:space="preserve"> JSON </w:t>
+      </w:r>
+      <w:r>
+        <w:t>에서</w:t>
+      </w:r>
+      <w:r>
+        <w:t xml:space="preserve"> </w:t>
+      </w:r>
+      <w:r>
+        <w:t>값</w:t>
+      </w:r>
+      <w:r>
+        <w:t xml:space="preserve"> </w:t>
+      </w:r>
+      <w:r>
+        <w:t>하나</w:t>
+      </w:r>
+      <w:r>
+        <w:t>(accessToken/id)</w:t>
+      </w:r>
+      <w:r>
+        <w:t>를</w:t>
+      </w:r>
+      <w:r>
+        <w:t xml:space="preserve">, grep </w:t>
+      </w:r>
+      <w:r>
+        <w:t>은</w:t>
+      </w:r>
+      <w:r>
+        <w:t xml:space="preserve"> HTML </w:t>
+      </w:r>
+      <w:r>
+        <w:t>에서</w:t>
+      </w:r>
+      <w:r>
+        <w:t xml:space="preserve"> _csrf </w:t>
+      </w:r>
+      <w:r>
+        <w:t>값을</w:t>
+      </w:r>
+      <w:r>
+        <w:t xml:space="preserve"> </w:t>
+      </w:r>
+      <w:r>
+        <w:t>뽑는다</w:t>
+      </w:r>
+      <w:r>
+        <w:t>.</w:t>
       </w:r>
     </w:p>
     <w:p>
@@ -3008,7 +4458,7 @@
           <w:sz w:val="16"/>
           <w:szCs w:val="16"/>
         </w:rPr>
-        <w:t xml:space="preserve">B=http://localhost:8080; JAR=cookies.txt</w:t>
+        <w:t>B=http://localhost:8080; JAR=cookies.txt</w:t>
       </w:r>
     </w:p>
     <w:p>
@@ -3024,87 +4474,47 @@
           <w:sz w:val="16"/>
           <w:szCs w:val="16"/>
         </w:rPr>
-        <w:t xml:space="preserve"># 1) JWT 발급 (admin) → /api/users 생성에 필요</w:t>
-      </w:r>
-    </w:p>
-    <w:p>
-      <w:pPr>
-        <w:pBdr>
-          <w:left w:val="single" w:sz="18" w:space="6" w:color="C0C0C0"/>
-        </w:pBdr>
-        <w:shd w:val="clear" w:color="auto" w:fill="F4F4F4"/>
-      </w:pPr>
+        <w:t xml:space="preserve"># 1) JWT </w:t>
+      </w:r>
       <w:r>
         <w:rPr>
           <w:rFonts w:ascii="Consolas" w:hAnsi="Consolas"/>
           <w:sz w:val="16"/>
           <w:szCs w:val="16"/>
         </w:rPr>
-        <w:t xml:space="preserve">TOKEN=$(curl -s -X POST "$B/api/userinfos/login" -H "Content-Type: application/json" \</w:t>
-      </w:r>
-    </w:p>
-    <w:p>
-      <w:pPr>
-        <w:pBdr>
-          <w:left w:val="single" w:sz="18" w:space="6" w:color="C0C0C0"/>
-        </w:pBdr>
-        <w:shd w:val="clear" w:color="auto" w:fill="F4F4F4"/>
-      </w:pPr>
+        <w:t>발급</w:t>
+      </w:r>
       <w:r>
         <w:rPr>
           <w:rFonts w:ascii="Consolas" w:hAnsi="Consolas"/>
           <w:sz w:val="16"/>
           <w:szCs w:val="16"/>
         </w:rPr>
-        <w:t xml:space="preserve">  -d '{"email":"admin@aa.com","password":"pwd1"}' | python -c "...['accessToken']")</w:t>
-      </w:r>
-    </w:p>
-    <w:p>
-      <w:pPr>
-        <w:pBdr>
-          <w:left w:val="single" w:sz="18" w:space="6" w:color="C0C0C0"/>
-        </w:pBdr>
-        <w:shd w:val="clear" w:color="auto" w:fill="F4F4F4"/>
-      </w:pPr>
+        <w:t xml:space="preserve"> (admin) → /api/users </w:t>
+      </w:r>
       <w:r>
         <w:rPr>
           <w:rFonts w:ascii="Consolas" w:hAnsi="Consolas"/>
           <w:sz w:val="16"/>
           <w:szCs w:val="16"/>
         </w:rPr>
-        <w:t xml:space="preserve"># 2) 삭제할 테스트 User 생성 → 생성된 id 를 $ID 에</w:t>
-      </w:r>
-    </w:p>
-    <w:p>
-      <w:pPr>
-        <w:pBdr>
-          <w:left w:val="single" w:sz="18" w:space="6" w:color="C0C0C0"/>
-        </w:pBdr>
-        <w:shd w:val="clear" w:color="auto" w:fill="F4F4F4"/>
-      </w:pPr>
+        <w:t>생성에</w:t>
+      </w:r>
       <w:r>
         <w:rPr>
           <w:rFonts w:ascii="Consolas" w:hAnsi="Consolas"/>
           <w:sz w:val="16"/>
           <w:szCs w:val="16"/>
         </w:rPr>
-        <w:t xml:space="preserve">ID=$(curl -s -X POST "$B/api/users" -H "Authorization: Bearer $TOKEN" -H "Content-Type: application/json" \</w:t>
-      </w:r>
-    </w:p>
-    <w:p>
-      <w:pPr>
-        <w:pBdr>
-          <w:left w:val="single" w:sz="18" w:space="6" w:color="C0C0C0"/>
-        </w:pBdr>
-        <w:shd w:val="clear" w:color="auto" w:fill="F4F4F4"/>
-      </w:pPr>
+        <w:t xml:space="preserve"> </w:t>
+      </w:r>
       <w:r>
         <w:rPr>
           <w:rFonts w:ascii="Consolas" w:hAnsi="Consolas"/>
           <w:sz w:val="16"/>
           <w:szCs w:val="16"/>
         </w:rPr>
-        <w:t xml:space="preserve">  -d '{"name":"victim","email":"victim@test.local"}' | python -c "...['id']")</w:t>
+        <w:t>필요</w:t>
       </w:r>
     </w:p>
     <w:p>
@@ -3120,7 +4530,7 @@
           <w:sz w:val="16"/>
           <w:szCs w:val="16"/>
         </w:rPr>
-        <w:t xml:space="preserve"># 3) 로그인용 _csrf 추출 (CSRF 활성이라 로그인에도 필요)</w:t>
+        <w:t>TOKEN=$(curl -s -X POST "$B/api/userinfos/login" -H "Content-Type: application/json" \</w:t>
       </w:r>
     </w:p>
     <w:p>
@@ -3136,7 +4546,7 @@
           <w:sz w:val="16"/>
           <w:szCs w:val="16"/>
         </w:rPr>
-        <w:t xml:space="preserve">CSRF=$(curl -s -c $JAR "$B/login" | grep -oP 'name="_csrf"[^&gt;]*value="\K[^"]+')</w:t>
+        <w:t xml:space="preserve">  -d '{"email":"admin@aa.com","password":"pwd1"}' | python -c "...['accessToken']")</w:t>
       </w:r>
     </w:p>
     <w:p>
@@ -3152,72 +4562,480 @@
           <w:sz w:val="16"/>
           <w:szCs w:val="16"/>
         </w:rPr>
-        <w:t xml:space="preserve"># 4) 세션 로그인 → 응답 쿠키 JSESSIONID 저장(302)</w:t>
-      </w:r>
-    </w:p>
-    <w:p>
-      <w:pPr>
-        <w:pBdr>
-          <w:left w:val="single" w:sz="18" w:space="6" w:color="C0C0C0"/>
-        </w:pBdr>
-        <w:shd w:val="clear" w:color="auto" w:fill="F4F4F4"/>
-      </w:pPr>
+        <w:t xml:space="preserve"># 2) </w:t>
+      </w:r>
       <w:r>
         <w:rPr>
           <w:rFonts w:ascii="Consolas" w:hAnsi="Consolas"/>
           <w:sz w:val="16"/>
           <w:szCs w:val="16"/>
         </w:rPr>
-        <w:t xml:space="preserve">curl -s -b $JAR -c $JAR -X POST "$B/login-process" \</w:t>
-      </w:r>
-    </w:p>
-    <w:p>
-      <w:pPr>
-        <w:pBdr>
-          <w:left w:val="single" w:sz="18" w:space="6" w:color="C0C0C0"/>
-        </w:pBdr>
-        <w:shd w:val="clear" w:color="auto" w:fill="F4F4F4"/>
-      </w:pPr>
+        <w:t>삭제할</w:t>
+      </w:r>
       <w:r>
         <w:rPr>
           <w:rFonts w:ascii="Consolas" w:hAnsi="Consolas"/>
           <w:sz w:val="16"/>
           <w:szCs w:val="16"/>
         </w:rPr>
-        <w:t xml:space="preserve">  --data-urlencode "username=user@aa.com" --data-urlencode "password=pwd2" --data-urlencode "_csrf=$CSRF"</w:t>
-      </w:r>
-    </w:p>
-    <w:p>
-      <w:pPr>
-        <w:pBdr>
-          <w:left w:val="single" w:sz="18" w:space="6" w:color="C0C0C0"/>
-        </w:pBdr>
-        <w:shd w:val="clear" w:color="auto" w:fill="F4F4F4"/>
-      </w:pPr>
+        <w:t xml:space="preserve"> </w:t>
+      </w:r>
       <w:r>
         <w:rPr>
           <w:rFonts w:ascii="Consolas" w:hAnsi="Consolas"/>
           <w:sz w:val="16"/>
           <w:szCs w:val="16"/>
         </w:rPr>
-        <w:t xml:space="preserve"># 5) 세션 쿠키만으로 GET 삭제 = &lt;img&gt; 재현</w:t>
-      </w:r>
-    </w:p>
-    <w:p>
-      <w:pPr>
-        <w:pBdr>
-          <w:left w:val="single" w:sz="18" w:space="6" w:color="C0C0C0"/>
-          <w:bottom w:val="single" w:sz="4" w:space="3" w:color="D9D9D9"/>
-        </w:pBdr>
-        <w:shd w:val="clear" w:color="auto" w:fill="F4F4F4"/>
-      </w:pPr>
+        <w:t>테스트</w:t>
+      </w:r>
       <w:r>
         <w:rPr>
           <w:rFonts w:ascii="Consolas" w:hAnsi="Consolas"/>
           <w:sz w:val="16"/>
           <w:szCs w:val="16"/>
         </w:rPr>
-        <w:t xml:space="preserve">curl -s -o /dev/null -w "GET delete -&gt; %{http_code}\n" -b $JAR "$B/users/delete/$ID"   # 302 = 삭제됨</w:t>
+        <w:t xml:space="preserve"> User </w:t>
+      </w:r>
+      <w:r>
+        <w:rPr>
+          <w:rFonts w:ascii="Consolas" w:hAnsi="Consolas"/>
+          <w:sz w:val="16"/>
+          <w:szCs w:val="16"/>
+        </w:rPr>
+        <w:t>생성</w:t>
+      </w:r>
+      <w:r>
+        <w:rPr>
+          <w:rFonts w:ascii="Consolas" w:hAnsi="Consolas"/>
+          <w:sz w:val="16"/>
+          <w:szCs w:val="16"/>
+        </w:rPr>
+        <w:t xml:space="preserve"> → </w:t>
+      </w:r>
+      <w:r>
+        <w:rPr>
+          <w:rFonts w:ascii="Consolas" w:hAnsi="Consolas"/>
+          <w:sz w:val="16"/>
+          <w:szCs w:val="16"/>
+        </w:rPr>
+        <w:t>생성된</w:t>
+      </w:r>
+      <w:r>
+        <w:rPr>
+          <w:rFonts w:ascii="Consolas" w:hAnsi="Consolas"/>
+          <w:sz w:val="16"/>
+          <w:szCs w:val="16"/>
+        </w:rPr>
+        <w:t xml:space="preserve"> id </w:t>
+      </w:r>
+      <w:r>
+        <w:rPr>
+          <w:rFonts w:ascii="Consolas" w:hAnsi="Consolas"/>
+          <w:sz w:val="16"/>
+          <w:szCs w:val="16"/>
+        </w:rPr>
+        <w:t>를</w:t>
+      </w:r>
+      <w:r>
+        <w:rPr>
+          <w:rFonts w:ascii="Consolas" w:hAnsi="Consolas"/>
+          <w:sz w:val="16"/>
+          <w:szCs w:val="16"/>
+        </w:rPr>
+        <w:t xml:space="preserve"> $ID </w:t>
+      </w:r>
+      <w:r>
+        <w:rPr>
+          <w:rFonts w:ascii="Consolas" w:hAnsi="Consolas"/>
+          <w:sz w:val="16"/>
+          <w:szCs w:val="16"/>
+        </w:rPr>
+        <w:t>에</w:t>
+      </w:r>
+    </w:p>
+    <w:p>
+      <w:pPr>
+        <w:pBdr>
+          <w:left w:val="single" w:sz="18" w:space="6" w:color="C0C0C0"/>
+        </w:pBdr>
+        <w:shd w:val="clear" w:color="auto" w:fill="F4F4F4"/>
+      </w:pPr>
+      <w:r>
+        <w:rPr>
+          <w:rFonts w:ascii="Consolas" w:hAnsi="Consolas"/>
+          <w:sz w:val="16"/>
+          <w:szCs w:val="16"/>
+        </w:rPr>
+        <w:t>ID=$(curl -s -X POST "$B/api/users" -H "Authorization: Bearer $TOKEN" -H "Content-Type: application/json" \</w:t>
+      </w:r>
+    </w:p>
+    <w:p>
+      <w:pPr>
+        <w:pBdr>
+          <w:left w:val="single" w:sz="18" w:space="6" w:color="C0C0C0"/>
+        </w:pBdr>
+        <w:shd w:val="clear" w:color="auto" w:fill="F4F4F4"/>
+      </w:pPr>
+      <w:r>
+        <w:rPr>
+          <w:rFonts w:ascii="Consolas" w:hAnsi="Consolas"/>
+          <w:sz w:val="16"/>
+          <w:szCs w:val="16"/>
+        </w:rPr>
+        <w:t xml:space="preserve">  -d '{"name":"victim","email":"victim@test.local"}' | python -c "...['id']")</w:t>
+      </w:r>
+    </w:p>
+    <w:p>
+      <w:pPr>
+        <w:pBdr>
+          <w:left w:val="single" w:sz="18" w:space="6" w:color="C0C0C0"/>
+        </w:pBdr>
+        <w:shd w:val="clear" w:color="auto" w:fill="F4F4F4"/>
+      </w:pPr>
+      <w:r>
+        <w:rPr>
+          <w:rFonts w:ascii="Consolas" w:hAnsi="Consolas"/>
+          <w:sz w:val="16"/>
+          <w:szCs w:val="16"/>
+        </w:rPr>
+        <w:t xml:space="preserve"># 3) </w:t>
+      </w:r>
+      <w:r>
+        <w:rPr>
+          <w:rFonts w:ascii="Consolas" w:hAnsi="Consolas"/>
+          <w:sz w:val="16"/>
+          <w:szCs w:val="16"/>
+        </w:rPr>
+        <w:t>로그인용</w:t>
+      </w:r>
+      <w:r>
+        <w:rPr>
+          <w:rFonts w:ascii="Consolas" w:hAnsi="Consolas"/>
+          <w:sz w:val="16"/>
+          <w:szCs w:val="16"/>
+        </w:rPr>
+        <w:t xml:space="preserve"> _csrf </w:t>
+      </w:r>
+      <w:r>
+        <w:rPr>
+          <w:rFonts w:ascii="Consolas" w:hAnsi="Consolas"/>
+          <w:sz w:val="16"/>
+          <w:szCs w:val="16"/>
+        </w:rPr>
+        <w:t>추출</w:t>
+      </w:r>
+      <w:r>
+        <w:rPr>
+          <w:rFonts w:ascii="Consolas" w:hAnsi="Consolas"/>
+          <w:sz w:val="16"/>
+          <w:szCs w:val="16"/>
+        </w:rPr>
+        <w:t xml:space="preserve"> (CSRF </w:t>
+      </w:r>
+      <w:r>
+        <w:rPr>
+          <w:rFonts w:ascii="Consolas" w:hAnsi="Consolas"/>
+          <w:sz w:val="16"/>
+          <w:szCs w:val="16"/>
+        </w:rPr>
+        <w:t>활성이라</w:t>
+      </w:r>
+      <w:r>
+        <w:rPr>
+          <w:rFonts w:ascii="Consolas" w:hAnsi="Consolas"/>
+          <w:sz w:val="16"/>
+          <w:szCs w:val="16"/>
+        </w:rPr>
+        <w:t xml:space="preserve"> </w:t>
+      </w:r>
+      <w:r>
+        <w:rPr>
+          <w:rFonts w:ascii="Consolas" w:hAnsi="Consolas"/>
+          <w:sz w:val="16"/>
+          <w:szCs w:val="16"/>
+        </w:rPr>
+        <w:t>로그</w:t>
+      </w:r>
+      <w:r>
+        <w:rPr>
+          <w:rFonts w:ascii="Consolas" w:hAnsi="Consolas"/>
+          <w:sz w:val="16"/>
+          <w:szCs w:val="16"/>
+        </w:rPr>
+        <w:t>인에도</w:t>
+      </w:r>
+      <w:r>
+        <w:rPr>
+          <w:rFonts w:ascii="Consolas" w:hAnsi="Consolas"/>
+          <w:sz w:val="16"/>
+          <w:szCs w:val="16"/>
+        </w:rPr>
+        <w:t xml:space="preserve"> </w:t>
+      </w:r>
+      <w:r>
+        <w:rPr>
+          <w:rFonts w:ascii="Consolas" w:hAnsi="Consolas"/>
+          <w:sz w:val="16"/>
+          <w:szCs w:val="16"/>
+        </w:rPr>
+        <w:t>필요</w:t>
+      </w:r>
+      <w:r>
+        <w:rPr>
+          <w:rFonts w:ascii="Consolas" w:hAnsi="Consolas"/>
+          <w:sz w:val="16"/>
+          <w:szCs w:val="16"/>
+        </w:rPr>
+        <w:t>)</w:t>
+      </w:r>
+    </w:p>
+    <w:p>
+      <w:pPr>
+        <w:pBdr>
+          <w:left w:val="single" w:sz="18" w:space="6" w:color="C0C0C0"/>
+        </w:pBdr>
+        <w:shd w:val="clear" w:color="auto" w:fill="F4F4F4"/>
+      </w:pPr>
+      <w:r>
+        <w:rPr>
+          <w:rFonts w:ascii="Consolas" w:hAnsi="Consolas"/>
+          <w:sz w:val="16"/>
+          <w:szCs w:val="16"/>
+        </w:rPr>
+        <w:t>CSRF=$(curl -s -c $JAR "$B/login" | grep -oP 'name="_csrf"[^&gt;]*value="\K[^"]+')</w:t>
+      </w:r>
+    </w:p>
+    <w:p>
+      <w:pPr>
+        <w:pBdr>
+          <w:left w:val="single" w:sz="18" w:space="6" w:color="C0C0C0"/>
+        </w:pBdr>
+        <w:shd w:val="clear" w:color="auto" w:fill="F4F4F4"/>
+      </w:pPr>
+      <w:r>
+        <w:rPr>
+          <w:rFonts w:ascii="Consolas" w:hAnsi="Consolas"/>
+          <w:sz w:val="16"/>
+          <w:szCs w:val="16"/>
+        </w:rPr>
+        <w:t xml:space="preserve"># 4) </w:t>
+      </w:r>
+      <w:r>
+        <w:rPr>
+          <w:rFonts w:ascii="Consolas" w:hAnsi="Consolas"/>
+          <w:sz w:val="16"/>
+          <w:szCs w:val="16"/>
+        </w:rPr>
+        <w:t>세션</w:t>
+      </w:r>
+      <w:r>
+        <w:rPr>
+          <w:rFonts w:ascii="Consolas" w:hAnsi="Consolas"/>
+          <w:sz w:val="16"/>
+          <w:szCs w:val="16"/>
+        </w:rPr>
+        <w:t xml:space="preserve"> </w:t>
+      </w:r>
+      <w:r>
+        <w:rPr>
+          <w:rFonts w:ascii="Consolas" w:hAnsi="Consolas"/>
+          <w:sz w:val="16"/>
+          <w:szCs w:val="16"/>
+        </w:rPr>
+        <w:t>로그인</w:t>
+      </w:r>
+      <w:r>
+        <w:rPr>
+          <w:rFonts w:ascii="Consolas" w:hAnsi="Consolas"/>
+          <w:sz w:val="16"/>
+          <w:szCs w:val="16"/>
+        </w:rPr>
+        <w:t xml:space="preserve"> → </w:t>
+      </w:r>
+      <w:r>
+        <w:rPr>
+          <w:rFonts w:ascii="Consolas" w:hAnsi="Consolas"/>
+          <w:sz w:val="16"/>
+          <w:szCs w:val="16"/>
+        </w:rPr>
+        <w:t>응답</w:t>
+      </w:r>
+      <w:r>
+        <w:rPr>
+          <w:rFonts w:ascii="Consolas" w:hAnsi="Consolas"/>
+          <w:sz w:val="16"/>
+          <w:szCs w:val="16"/>
+        </w:rPr>
+        <w:t xml:space="preserve"> </w:t>
+      </w:r>
+      <w:r>
+        <w:rPr>
+          <w:rFonts w:ascii="Consolas" w:hAnsi="Consolas"/>
+          <w:sz w:val="16"/>
+          <w:szCs w:val="16"/>
+        </w:rPr>
+        <w:t>쿠키</w:t>
+      </w:r>
+      <w:r>
+        <w:rPr>
+          <w:rFonts w:ascii="Consolas" w:hAnsi="Consolas"/>
+          <w:sz w:val="16"/>
+          <w:szCs w:val="16"/>
+        </w:rPr>
+        <w:t xml:space="preserve"> JSESSIONID </w:t>
+      </w:r>
+      <w:r>
+        <w:rPr>
+          <w:rFonts w:ascii="Consolas" w:hAnsi="Consolas"/>
+          <w:sz w:val="16"/>
+          <w:szCs w:val="16"/>
+        </w:rPr>
+        <w:t>저장</w:t>
+      </w:r>
+      <w:r>
+        <w:rPr>
+          <w:rFonts w:ascii="Consolas" w:hAnsi="Consolas"/>
+          <w:sz w:val="16"/>
+          <w:szCs w:val="16"/>
+        </w:rPr>
+        <w:t>(302)</w:t>
+      </w:r>
+    </w:p>
+    <w:p>
+      <w:pPr>
+        <w:pBdr>
+          <w:left w:val="single" w:sz="18" w:space="6" w:color="C0C0C0"/>
+        </w:pBdr>
+        <w:shd w:val="clear" w:color="auto" w:fill="F4F4F4"/>
+      </w:pPr>
+      <w:r>
+        <w:rPr>
+          <w:rFonts w:ascii="Consolas" w:hAnsi="Consolas"/>
+          <w:sz w:val="16"/>
+          <w:szCs w:val="16"/>
+        </w:rPr>
+        <w:t>curl -s -b $JAR -c $JAR -X POST "$B/login-process" \</w:t>
+      </w:r>
+    </w:p>
+    <w:p>
+      <w:pPr>
+        <w:pBdr>
+          <w:left w:val="single" w:sz="18" w:space="6" w:color="C0C0C0"/>
+        </w:pBdr>
+        <w:shd w:val="clear" w:color="auto" w:fill="F4F4F4"/>
+      </w:pPr>
+      <w:r>
+        <w:rPr>
+          <w:rFonts w:ascii="Consolas" w:hAnsi="Consolas"/>
+          <w:sz w:val="16"/>
+          <w:szCs w:val="16"/>
+        </w:rPr>
+        <w:t xml:space="preserve">  --data-urlencode "username=user@aa.com" --data-urlencode "password=pwd2" -</w:t>
+      </w:r>
+      <w:r>
+        <w:rPr>
+          <w:rFonts w:ascii="Consolas" w:hAnsi="Consolas"/>
+          <w:sz w:val="16"/>
+          <w:szCs w:val="16"/>
+        </w:rPr>
+        <w:t>-data-urlencode "_csrf=$CSRF"</w:t>
+      </w:r>
+    </w:p>
+    <w:p>
+      <w:pPr>
+        <w:pBdr>
+          <w:left w:val="single" w:sz="18" w:space="6" w:color="C0C0C0"/>
+        </w:pBdr>
+        <w:shd w:val="clear" w:color="auto" w:fill="F4F4F4"/>
+      </w:pPr>
+      <w:r>
+        <w:rPr>
+          <w:rFonts w:ascii="Consolas" w:hAnsi="Consolas"/>
+          <w:sz w:val="16"/>
+          <w:szCs w:val="16"/>
+        </w:rPr>
+        <w:t xml:space="preserve"># 5) </w:t>
+      </w:r>
+      <w:r>
+        <w:rPr>
+          <w:rFonts w:ascii="Consolas" w:hAnsi="Consolas"/>
+          <w:sz w:val="16"/>
+          <w:szCs w:val="16"/>
+        </w:rPr>
+        <w:t>세션</w:t>
+      </w:r>
+      <w:r>
+        <w:rPr>
+          <w:rFonts w:ascii="Consolas" w:hAnsi="Consolas"/>
+          <w:sz w:val="16"/>
+          <w:szCs w:val="16"/>
+        </w:rPr>
+        <w:t xml:space="preserve"> </w:t>
+      </w:r>
+      <w:r>
+        <w:rPr>
+          <w:rFonts w:ascii="Consolas" w:hAnsi="Consolas"/>
+          <w:sz w:val="16"/>
+          <w:szCs w:val="16"/>
+        </w:rPr>
+        <w:t>쿠키만으로</w:t>
+      </w:r>
+      <w:r>
+        <w:rPr>
+          <w:rFonts w:ascii="Consolas" w:hAnsi="Consolas"/>
+          <w:sz w:val="16"/>
+          <w:szCs w:val="16"/>
+        </w:rPr>
+        <w:t xml:space="preserve"> GET </w:t>
+      </w:r>
+      <w:r>
+        <w:rPr>
+          <w:rFonts w:ascii="Consolas" w:hAnsi="Consolas"/>
+          <w:sz w:val="16"/>
+          <w:szCs w:val="16"/>
+        </w:rPr>
+        <w:t>삭제</w:t>
+      </w:r>
+      <w:r>
+        <w:rPr>
+          <w:rFonts w:ascii="Consolas" w:hAnsi="Consolas"/>
+          <w:sz w:val="16"/>
+          <w:szCs w:val="16"/>
+        </w:rPr>
+        <w:t xml:space="preserve"> = &lt;img&gt; </w:t>
+      </w:r>
+      <w:r>
+        <w:rPr>
+          <w:rFonts w:ascii="Consolas" w:hAnsi="Consolas"/>
+          <w:sz w:val="16"/>
+          <w:szCs w:val="16"/>
+        </w:rPr>
+        <w:t>재현</w:t>
+      </w:r>
+    </w:p>
+    <w:p>
+      <w:pPr>
+        <w:pBdr>
+          <w:left w:val="single" w:sz="18" w:space="6" w:color="C0C0C0"/>
+          <w:bottom w:val="single" w:sz="4" w:space="3" w:color="D9D9D9"/>
+        </w:pBdr>
+        <w:shd w:val="clear" w:color="auto" w:fill="F4F4F4"/>
+      </w:pPr>
+      <w:r>
+        <w:rPr>
+          <w:rFonts w:ascii="Consolas" w:hAnsi="Consolas"/>
+          <w:sz w:val="16"/>
+          <w:szCs w:val="16"/>
+        </w:rPr>
+        <w:t xml:space="preserve">curl -s -o /dev/null -w "GET delete -&gt; %{http_code}\n" -b $JAR "$B/users/delete/$ID"   # 302 = </w:t>
+      </w:r>
+      <w:r>
+        <w:rPr>
+          <w:rFonts w:ascii="Consolas" w:hAnsi="Consolas"/>
+          <w:sz w:val="16"/>
+          <w:szCs w:val="16"/>
+        </w:rPr>
+        <w:t>삭제됨</w:t>
       </w:r>
     </w:p>
     <w:p>
@@ -3225,7 +5043,16 @@
         <w:spacing w:after="80" w:line="272" w:lineRule="auto"/>
       </w:pPr>
       <w:r>
-        <w:t xml:space="preserve">명령 해설 :</w:t>
+        <w:t>명령</w:t>
+      </w:r>
+      <w:r>
+        <w:t xml:space="preserve"> </w:t>
+      </w:r>
+      <w:r>
+        <w:t>해설</w:t>
+      </w:r>
+      <w:r>
+        <w:t xml:space="preserve"> :</w:t>
       </w:r>
     </w:p>
     <w:tbl>
@@ -3267,7 +5094,7 @@
                 <w:sz w:val="16"/>
                 <w:szCs w:val="16"/>
               </w:rPr>
-              <w:t xml:space="preserve">단계</w:t>
+              <w:t>단계</w:t>
             </w:r>
           </w:p>
         </w:tc>
@@ -3291,7 +5118,7 @@
                 <w:sz w:val="16"/>
                 <w:szCs w:val="16"/>
               </w:rPr>
-              <w:t xml:space="preserve">명령</w:t>
+              <w:t>명령</w:t>
             </w:r>
           </w:p>
         </w:tc>
@@ -3315,7 +5142,47 @@
                 <w:sz w:val="16"/>
                 <w:szCs w:val="16"/>
               </w:rPr>
-              <w:t xml:space="preserve">하는 일 / 이유</w:t>
+              <w:t>하는</w:t>
+            </w:r>
+            <w:r>
+              <w:rPr>
+                <w:b/>
+                <w:bCs/>
+                <w:color w:val="FFFFFF"/>
+                <w:sz w:val="16"/>
+                <w:szCs w:val="16"/>
+              </w:rPr>
+              <w:t xml:space="preserve"> </w:t>
+            </w:r>
+            <w:r>
+              <w:rPr>
+                <w:b/>
+                <w:bCs/>
+                <w:color w:val="FFFFFF"/>
+                <w:sz w:val="16"/>
+                <w:szCs w:val="16"/>
+              </w:rPr>
+              <w:t>일</w:t>
+            </w:r>
+            <w:r>
+              <w:rPr>
+                <w:b/>
+                <w:bCs/>
+                <w:color w:val="FFFFFF"/>
+                <w:sz w:val="16"/>
+                <w:szCs w:val="16"/>
+              </w:rPr>
+              <w:t xml:space="preserve"> / </w:t>
+            </w:r>
+            <w:r>
+              <w:rPr>
+                <w:b/>
+                <w:bCs/>
+                <w:color w:val="FFFFFF"/>
+                <w:sz w:val="16"/>
+                <w:szCs w:val="16"/>
+              </w:rPr>
+              <w:t>이유</w:t>
             </w:r>
           </w:p>
         </w:tc>
@@ -3337,7 +5204,7 @@
                 <w:sz w:val="16"/>
                 <w:szCs w:val="16"/>
               </w:rPr>
-              <w:t xml:space="preserve">1</w:t>
+              <w:t>1</w:t>
             </w:r>
           </w:p>
         </w:tc>
@@ -3358,7 +5225,7 @@
                 <w:sz w:val="16"/>
                 <w:szCs w:val="16"/>
               </w:rPr>
-              <w:t xml:space="preserve">TOKEN=…/login</w:t>
+              <w:t>TOKEN=…/login</w:t>
             </w:r>
           </w:p>
         </w:tc>
@@ -3378,7 +5245,119 @@
                 <w:sz w:val="16"/>
                 <w:szCs w:val="16"/>
               </w:rPr>
-              <w:t xml:space="preserve">관리자 JWT 발급. User 생성 API(/api/users)가 인증을 요구하므로 먼저 토큰을 받는다</w:t>
+              <w:t>관리자</w:t>
+            </w:r>
+            <w:r>
+              <w:rPr>
+                <w:sz w:val="16"/>
+                <w:szCs w:val="16"/>
+              </w:rPr>
+              <w:t xml:space="preserve"> JWT </w:t>
+            </w:r>
+            <w:r>
+              <w:rPr>
+                <w:sz w:val="16"/>
+                <w:szCs w:val="16"/>
+              </w:rPr>
+              <w:t>발급</w:t>
+            </w:r>
+            <w:r>
+              <w:rPr>
+                <w:sz w:val="16"/>
+                <w:szCs w:val="16"/>
+              </w:rPr>
+              <w:t xml:space="preserve">. User </w:t>
+            </w:r>
+            <w:r>
+              <w:rPr>
+                <w:sz w:val="16"/>
+                <w:szCs w:val="16"/>
+              </w:rPr>
+              <w:t>생성</w:t>
+            </w:r>
+            <w:r>
+              <w:rPr>
+                <w:sz w:val="16"/>
+                <w:szCs w:val="16"/>
+              </w:rPr>
+              <w:t xml:space="preserve"> API(/api/users)</w:t>
+            </w:r>
+            <w:r>
+              <w:rPr>
+                <w:sz w:val="16"/>
+                <w:szCs w:val="16"/>
+              </w:rPr>
+              <w:t>가</w:t>
+            </w:r>
+            <w:r>
+              <w:rPr>
+                <w:sz w:val="16"/>
+                <w:szCs w:val="16"/>
+              </w:rPr>
+              <w:t xml:space="preserve"> </w:t>
+            </w:r>
+            <w:r>
+              <w:rPr>
+                <w:sz w:val="16"/>
+                <w:szCs w:val="16"/>
+              </w:rPr>
+              <w:t>인증을</w:t>
+            </w:r>
+            <w:r>
+              <w:rPr>
+                <w:sz w:val="16"/>
+                <w:szCs w:val="16"/>
+              </w:rPr>
+              <w:t xml:space="preserve"> </w:t>
+            </w:r>
+            <w:r>
+              <w:rPr>
+                <w:sz w:val="16"/>
+                <w:szCs w:val="16"/>
+              </w:rPr>
+              <w:t>요구하므로</w:t>
+            </w:r>
+            <w:r>
+              <w:rPr>
+                <w:sz w:val="16"/>
+                <w:szCs w:val="16"/>
+              </w:rPr>
+              <w:t xml:space="preserve"> </w:t>
+            </w:r>
+            <w:r>
+              <w:rPr>
+                <w:sz w:val="16"/>
+                <w:szCs w:val="16"/>
+              </w:rPr>
+              <w:t>먼저</w:t>
+            </w:r>
+            <w:r>
+              <w:rPr>
+                <w:sz w:val="16"/>
+                <w:szCs w:val="16"/>
+              </w:rPr>
+              <w:t xml:space="preserve"> </w:t>
+            </w:r>
+            <w:r>
+              <w:rPr>
+                <w:sz w:val="16"/>
+                <w:szCs w:val="16"/>
+              </w:rPr>
+              <w:t>토큰을</w:t>
+            </w:r>
+            <w:r>
+              <w:rPr>
+                <w:sz w:val="16"/>
+                <w:szCs w:val="16"/>
+              </w:rPr>
+              <w:t xml:space="preserve"> </w:t>
+            </w:r>
+            <w:r>
+              <w:rPr>
+                <w:sz w:val="16"/>
+                <w:szCs w:val="16"/>
+              </w:rPr>
+              <w:t>받는다</w:t>
             </w:r>
           </w:p>
         </w:tc>
@@ -3400,7 +5379,7 @@
                 <w:sz w:val="16"/>
                 <w:szCs w:val="16"/>
               </w:rPr>
-              <w:t xml:space="preserve">2</w:t>
+              <w:t>2</w:t>
             </w:r>
           </w:p>
         </w:tc>
@@ -3421,7 +5400,7 @@
                 <w:sz w:val="16"/>
                 <w:szCs w:val="16"/>
               </w:rPr>
-              <w:t xml:space="preserve">ID=…/api/users</w:t>
+              <w:t>ID=…/api/users</w:t>
             </w:r>
           </w:p>
         </w:tc>
@@ -3441,7 +5420,140 @@
                 <w:sz w:val="16"/>
                 <w:szCs w:val="16"/>
               </w:rPr>
-              <w:t xml:space="preserve">삭제할 테스트 User 생성, 응답 JSON 의 id 를 $ID 에 저장(실데이터 보호)</w:t>
+              <w:t>삭제할</w:t>
+            </w:r>
+            <w:r>
+              <w:rPr>
+                <w:sz w:val="16"/>
+                <w:szCs w:val="16"/>
+              </w:rPr>
+              <w:t xml:space="preserve"> </w:t>
+            </w:r>
+            <w:r>
+              <w:rPr>
+                <w:sz w:val="16"/>
+                <w:szCs w:val="16"/>
+              </w:rPr>
+              <w:t>테스트</w:t>
+            </w:r>
+            <w:r>
+              <w:rPr>
+                <w:sz w:val="16"/>
+                <w:szCs w:val="16"/>
+              </w:rPr>
+              <w:t xml:space="preserve"> User </w:t>
+            </w:r>
+            <w:r>
+              <w:rPr>
+                <w:sz w:val="16"/>
+                <w:szCs w:val="16"/>
+              </w:rPr>
+              <w:t>생성</w:t>
+            </w:r>
+            <w:r>
+              <w:rPr>
+                <w:sz w:val="16"/>
+                <w:szCs w:val="16"/>
+              </w:rPr>
+              <w:t xml:space="preserve">, </w:t>
+            </w:r>
+            <w:r>
+              <w:rPr>
+                <w:sz w:val="16"/>
+                <w:szCs w:val="16"/>
+              </w:rPr>
+              <w:t>응답</w:t>
+            </w:r>
+            <w:r>
+              <w:rPr>
+                <w:sz w:val="16"/>
+                <w:szCs w:val="16"/>
+              </w:rPr>
+              <w:t xml:space="preserve"> JSON </w:t>
+            </w:r>
+            <w:r>
+              <w:rPr>
+                <w:sz w:val="16"/>
+                <w:szCs w:val="16"/>
+              </w:rPr>
+              <w:t>의</w:t>
+            </w:r>
+            <w:r>
+              <w:rPr>
+                <w:sz w:val="16"/>
+                <w:szCs w:val="16"/>
+              </w:rPr>
+              <w:t xml:space="preserve"> id </w:t>
+            </w:r>
+            <w:r>
+              <w:rPr>
+                <w:sz w:val="16"/>
+                <w:szCs w:val="16"/>
+              </w:rPr>
+              <w:t>를</w:t>
+            </w:r>
+            <w:r>
+              <w:rPr>
+                <w:sz w:val="16"/>
+                <w:szCs w:val="16"/>
+              </w:rPr>
+              <w:t xml:space="preserve"> $ID </w:t>
+            </w:r>
+            <w:r>
+              <w:rPr>
+                <w:sz w:val="16"/>
+                <w:szCs w:val="16"/>
+              </w:rPr>
+              <w:t>에</w:t>
+            </w:r>
+            <w:r>
+              <w:rPr>
+                <w:sz w:val="16"/>
+                <w:szCs w:val="16"/>
+              </w:rPr>
+              <w:t xml:space="preserve"> </w:t>
+            </w:r>
+            <w:r>
+              <w:rPr>
+                <w:sz w:val="16"/>
+                <w:szCs w:val="16"/>
+              </w:rPr>
+              <w:t>저장</w:t>
+            </w:r>
+            <w:r>
+              <w:rPr>
+                <w:sz w:val="16"/>
+                <w:szCs w:val="16"/>
+              </w:rPr>
+              <w:t>(</w:t>
+            </w:r>
+            <w:r>
+              <w:rPr>
+                <w:sz w:val="16"/>
+                <w:szCs w:val="16"/>
+              </w:rPr>
+              <w:t>실데이터</w:t>
+            </w:r>
+            <w:r>
+              <w:rPr>
+                <w:sz w:val="16"/>
+                <w:szCs w:val="16"/>
+              </w:rPr>
+              <w:t xml:space="preserve"> </w:t>
+            </w:r>
+            <w:r>
+              <w:rPr>
+                <w:sz w:val="16"/>
+                <w:szCs w:val="16"/>
+              </w:rPr>
+              <w:t>보호</w:t>
+            </w:r>
+            <w:r>
+              <w:rPr>
+                <w:sz w:val="16"/>
+                <w:szCs w:val="16"/>
+              </w:rPr>
+              <w:t>)</w:t>
             </w:r>
           </w:p>
         </w:tc>
@@ -3463,7 +5575,7 @@
                 <w:sz w:val="16"/>
                 <w:szCs w:val="16"/>
               </w:rPr>
-              <w:t xml:space="preserve">3</w:t>
+              <w:t>3</w:t>
             </w:r>
           </w:p>
         </w:tc>
@@ -3484,7 +5596,7 @@
                 <w:sz w:val="16"/>
                 <w:szCs w:val="16"/>
               </w:rPr>
-              <w:t xml:space="preserve">CSRF=…/login</w:t>
+              <w:t>CSRF=…/login</w:t>
             </w:r>
           </w:p>
         </w:tc>
@@ -3504,7 +5616,147 @@
                 <w:sz w:val="16"/>
                 <w:szCs w:val="16"/>
               </w:rPr>
-              <w:t xml:space="preserve">로그인 페이지의 hidden _csrf 값 추출. CSRF 가 켜져 있어 로그인 POST 에도 토큰이 필요</w:t>
+              <w:t>로그인</w:t>
+            </w:r>
+            <w:r>
+              <w:rPr>
+                <w:sz w:val="16"/>
+                <w:szCs w:val="16"/>
+              </w:rPr>
+              <w:t xml:space="preserve"> </w:t>
+            </w:r>
+            <w:r>
+              <w:rPr>
+                <w:sz w:val="16"/>
+                <w:szCs w:val="16"/>
+              </w:rPr>
+              <w:t>페이지의</w:t>
+            </w:r>
+            <w:r>
+              <w:rPr>
+                <w:sz w:val="16"/>
+                <w:szCs w:val="16"/>
+              </w:rPr>
+              <w:t xml:space="preserve"> hidden _csrf </w:t>
+            </w:r>
+            <w:r>
+              <w:rPr>
+                <w:sz w:val="16"/>
+                <w:szCs w:val="16"/>
+              </w:rPr>
+              <w:t>값</w:t>
+            </w:r>
+            <w:r>
+              <w:rPr>
+                <w:sz w:val="16"/>
+                <w:szCs w:val="16"/>
+              </w:rPr>
+              <w:t xml:space="preserve"> </w:t>
+            </w:r>
+            <w:r>
+              <w:rPr>
+                <w:sz w:val="16"/>
+                <w:szCs w:val="16"/>
+              </w:rPr>
+              <w:t>추출</w:t>
+            </w:r>
+            <w:r>
+              <w:rPr>
+                <w:sz w:val="16"/>
+                <w:szCs w:val="16"/>
+              </w:rPr>
+              <w:t xml:space="preserve">. CSRF </w:t>
+            </w:r>
+            <w:r>
+              <w:rPr>
+                <w:sz w:val="16"/>
+                <w:szCs w:val="16"/>
+              </w:rPr>
+              <w:t>가</w:t>
+            </w:r>
+            <w:r>
+              <w:rPr>
+                <w:sz w:val="16"/>
+                <w:szCs w:val="16"/>
+              </w:rPr>
+              <w:t xml:space="preserve"> </w:t>
+            </w:r>
+            <w:r>
+              <w:rPr>
+                <w:sz w:val="16"/>
+                <w:szCs w:val="16"/>
+              </w:rPr>
+              <w:t>켜져</w:t>
+            </w:r>
+            <w:r>
+              <w:rPr>
+                <w:sz w:val="16"/>
+                <w:szCs w:val="16"/>
+              </w:rPr>
+              <w:t xml:space="preserve"> </w:t>
+            </w:r>
+            <w:r>
+              <w:rPr>
+                <w:sz w:val="16"/>
+                <w:szCs w:val="16"/>
+              </w:rPr>
+              <w:t>있어</w:t>
+            </w:r>
+            <w:r>
+              <w:rPr>
+                <w:sz w:val="16"/>
+                <w:szCs w:val="16"/>
+              </w:rPr>
+              <w:t xml:space="preserve"> </w:t>
+            </w:r>
+            <w:r>
+              <w:rPr>
+                <w:sz w:val="16"/>
+                <w:szCs w:val="16"/>
+              </w:rPr>
+              <w:t>로그인</w:t>
+            </w:r>
+            <w:r>
+              <w:rPr>
+                <w:sz w:val="16"/>
+                <w:szCs w:val="16"/>
+              </w:rPr>
+              <w:t xml:space="preserve"> POST </w:t>
+            </w:r>
+            <w:r>
+              <w:rPr>
+                <w:sz w:val="16"/>
+                <w:szCs w:val="16"/>
+              </w:rPr>
+              <w:t>에도</w:t>
+            </w:r>
+            <w:r>
+              <w:rPr>
+                <w:sz w:val="16"/>
+                <w:szCs w:val="16"/>
+              </w:rPr>
+              <w:t xml:space="preserve"> </w:t>
+            </w:r>
+            <w:r>
+              <w:rPr>
+                <w:sz w:val="16"/>
+                <w:szCs w:val="16"/>
+              </w:rPr>
+              <w:t>토큰이</w:t>
+            </w:r>
+            <w:r>
+              <w:rPr>
+                <w:sz w:val="16"/>
+                <w:szCs w:val="16"/>
+              </w:rPr>
+              <w:t xml:space="preserve"> </w:t>
+            </w:r>
+            <w:r>
+              <w:rPr>
+                <w:sz w:val="16"/>
+                <w:szCs w:val="16"/>
+              </w:rPr>
+              <w:t>필요</w:t>
             </w:r>
           </w:p>
         </w:tc>
@@ -3526,7 +5778,7 @@
                 <w:sz w:val="16"/>
                 <w:szCs w:val="16"/>
               </w:rPr>
-              <w:t xml:space="preserve">4</w:t>
+              <w:t>4</w:t>
             </w:r>
           </w:p>
         </w:tc>
@@ -3547,7 +5799,7 @@
                 <w:sz w:val="16"/>
                 <w:szCs w:val="16"/>
               </w:rPr>
-              <w:t xml:space="preserve">…/login-process</w:t>
+              <w:t>…/login-process</w:t>
             </w:r>
           </w:p>
         </w:tc>
@@ -3567,7 +5819,77 @@
                 <w:sz w:val="16"/>
                 <w:szCs w:val="16"/>
               </w:rPr>
-              <w:t xml:space="preserve">username·password·_csrf 로 세션 로그인 → 쿠키 JSESSIONID 획득(302)</w:t>
+              <w:t xml:space="preserve">username·password·_csrf </w:t>
+            </w:r>
+            <w:r>
+              <w:rPr>
+                <w:sz w:val="16"/>
+                <w:szCs w:val="16"/>
+              </w:rPr>
+              <w:t>로</w:t>
+            </w:r>
+            <w:r>
+              <w:rPr>
+                <w:sz w:val="16"/>
+                <w:szCs w:val="16"/>
+              </w:rPr>
+              <w:t xml:space="preserve"> </w:t>
+            </w:r>
+            <w:r>
+              <w:rPr>
+                <w:sz w:val="16"/>
+                <w:szCs w:val="16"/>
+              </w:rPr>
+              <w:t>세션</w:t>
+            </w:r>
+            <w:r>
+              <w:rPr>
+                <w:sz w:val="16"/>
+                <w:szCs w:val="16"/>
+              </w:rPr>
+              <w:t xml:space="preserve"> </w:t>
+            </w:r>
+            <w:r>
+              <w:rPr>
+                <w:sz w:val="16"/>
+                <w:szCs w:val="16"/>
+              </w:rPr>
+              <w:t>로그인</w:t>
+            </w:r>
+            <w:r>
+              <w:rPr>
+                <w:sz w:val="16"/>
+                <w:szCs w:val="16"/>
+              </w:rPr>
+              <w:t xml:space="preserve"> → </w:t>
+            </w:r>
+            <w:r>
+              <w:rPr>
+                <w:sz w:val="16"/>
+                <w:szCs w:val="16"/>
+              </w:rPr>
+              <w:t>쿠키</w:t>
+            </w:r>
+            <w:r>
+              <w:rPr>
+                <w:sz w:val="16"/>
+                <w:szCs w:val="16"/>
+              </w:rPr>
+              <w:t xml:space="preserve"> JSESSIONID </w:t>
+            </w:r>
+            <w:r>
+              <w:rPr>
+                <w:sz w:val="16"/>
+                <w:szCs w:val="16"/>
+              </w:rPr>
+              <w:t>획득</w:t>
+            </w:r>
+            <w:r>
+              <w:rPr>
+                <w:sz w:val="16"/>
+                <w:szCs w:val="16"/>
+              </w:rPr>
+              <w:t>(302)</w:t>
             </w:r>
           </w:p>
         </w:tc>
@@ -3589,7 +5911,7 @@
                 <w:sz w:val="16"/>
                 <w:szCs w:val="16"/>
               </w:rPr>
-              <w:t xml:space="preserve">5</w:t>
+              <w:t>5</w:t>
             </w:r>
           </w:p>
         </w:tc>
@@ -3610,7 +5932,7 @@
                 <w:sz w:val="16"/>
                 <w:szCs w:val="16"/>
               </w:rPr>
-              <w:t xml:space="preserve">…/users/delete/$ID</w:t>
+              <w:t>…/users/delete/$ID</w:t>
             </w:r>
           </w:p>
         </w:tc>
@@ -3630,7 +5952,175 @@
                 <w:sz w:val="16"/>
                 <w:szCs w:val="16"/>
               </w:rPr>
-              <w:t xml:space="preserve">세션 쿠키만(-b $JAR, _csrf 없음) 실어 GET 삭제. GET 이라 토큰 검증을 건너뛰어 302 삭제 = &lt;img&gt; 가 하는 일</w:t>
+              <w:t>세션</w:t>
+            </w:r>
+            <w:r>
+              <w:rPr>
+                <w:sz w:val="16"/>
+                <w:szCs w:val="16"/>
+              </w:rPr>
+              <w:t xml:space="preserve"> </w:t>
+            </w:r>
+            <w:r>
+              <w:rPr>
+                <w:sz w:val="16"/>
+                <w:szCs w:val="16"/>
+              </w:rPr>
+              <w:t>쿠키만</w:t>
+            </w:r>
+            <w:r>
+              <w:rPr>
+                <w:sz w:val="16"/>
+                <w:szCs w:val="16"/>
+              </w:rPr>
+              <w:t xml:space="preserve">(-b $JAR, _csrf </w:t>
+            </w:r>
+            <w:r>
+              <w:rPr>
+                <w:sz w:val="16"/>
+                <w:szCs w:val="16"/>
+              </w:rPr>
+              <w:t>없음</w:t>
+            </w:r>
+            <w:r>
+              <w:rPr>
+                <w:sz w:val="16"/>
+                <w:szCs w:val="16"/>
+              </w:rPr>
+              <w:t xml:space="preserve">) </w:t>
+            </w:r>
+            <w:r>
+              <w:rPr>
+                <w:sz w:val="16"/>
+                <w:szCs w:val="16"/>
+              </w:rPr>
+              <w:t>실어</w:t>
+            </w:r>
+            <w:r>
+              <w:rPr>
+                <w:sz w:val="16"/>
+                <w:szCs w:val="16"/>
+              </w:rPr>
+              <w:t xml:space="preserve"> GET </w:t>
+            </w:r>
+            <w:r>
+              <w:rPr>
+                <w:sz w:val="16"/>
+                <w:szCs w:val="16"/>
+              </w:rPr>
+              <w:t>삭제</w:t>
+            </w:r>
+            <w:r>
+              <w:rPr>
+                <w:sz w:val="16"/>
+                <w:szCs w:val="16"/>
+              </w:rPr>
+              <w:t xml:space="preserve">. GET </w:t>
+            </w:r>
+            <w:r>
+              <w:rPr>
+                <w:sz w:val="16"/>
+                <w:szCs w:val="16"/>
+              </w:rPr>
+              <w:t>이라</w:t>
+            </w:r>
+            <w:r>
+              <w:rPr>
+                <w:sz w:val="16"/>
+                <w:szCs w:val="16"/>
+              </w:rPr>
+              <w:t xml:space="preserve"> </w:t>
+            </w:r>
+            <w:r>
+              <w:rPr>
+                <w:sz w:val="16"/>
+                <w:szCs w:val="16"/>
+              </w:rPr>
+              <w:t>토큰</w:t>
+            </w:r>
+            <w:r>
+              <w:rPr>
+                <w:sz w:val="16"/>
+                <w:szCs w:val="16"/>
+              </w:rPr>
+              <w:t xml:space="preserve"> </w:t>
+            </w:r>
+            <w:r>
+              <w:rPr>
+                <w:sz w:val="16"/>
+                <w:szCs w:val="16"/>
+              </w:rPr>
+              <w:t>검증을</w:t>
+            </w:r>
+            <w:r>
+              <w:rPr>
+                <w:sz w:val="16"/>
+                <w:szCs w:val="16"/>
+              </w:rPr>
+              <w:t xml:space="preserve"> </w:t>
+            </w:r>
+            <w:r>
+              <w:rPr>
+                <w:sz w:val="16"/>
+                <w:szCs w:val="16"/>
+              </w:rPr>
+              <w:t>건너뛰어</w:t>
+            </w:r>
+            <w:r>
+              <w:rPr>
+                <w:sz w:val="16"/>
+                <w:szCs w:val="16"/>
+              </w:rPr>
+              <w:t xml:space="preserve"> 302 </w:t>
+            </w:r>
+            <w:r>
+              <w:rPr>
+                <w:sz w:val="16"/>
+                <w:szCs w:val="16"/>
+              </w:rPr>
+              <w:t>삭제</w:t>
+            </w:r>
+            <w:r>
+              <w:rPr>
+                <w:sz w:val="16"/>
+                <w:szCs w:val="16"/>
+              </w:rPr>
+              <w:t xml:space="preserve"> = &lt;img&gt; </w:t>
+            </w:r>
+            <w:r>
+              <w:rPr>
+                <w:sz w:val="16"/>
+                <w:szCs w:val="16"/>
+              </w:rPr>
+              <w:t>가</w:t>
+            </w:r>
+            <w:r>
+              <w:rPr>
+                <w:sz w:val="16"/>
+                <w:szCs w:val="16"/>
+              </w:rPr>
+              <w:t xml:space="preserve"> </w:t>
+            </w:r>
+            <w:r>
+              <w:rPr>
+                <w:sz w:val="16"/>
+                <w:szCs w:val="16"/>
+              </w:rPr>
+              <w:t>하는</w:t>
+            </w:r>
+            <w:r>
+              <w:rPr>
+                <w:sz w:val="16"/>
+                <w:szCs w:val="16"/>
+              </w:rPr>
+              <w:t xml:space="preserve"> </w:t>
+            </w:r>
+            <w:r>
+              <w:rPr>
+                <w:sz w:val="16"/>
+                <w:szCs w:val="16"/>
+              </w:rPr>
+              <w:t>일</w:t>
             </w:r>
           </w:p>
         </w:tc>
@@ -3646,7 +6136,7 @@
         <w:spacing w:after="80" w:line="272" w:lineRule="auto"/>
       </w:pPr>
       <w:r>
-        <w:t xml:space="preserve">동일하게 세션 쿠키(JSESSIONID)만 보내고 _csrf 토큰은 없이 삭제를 시도한 대비 실험이다. 두 요청은 HTTP 메서드만 다르다.</w:t>
+        <w:t>동일하게 세션 쿠키(JSESSIONID)만 보내고 _csrf 토큰은 없이 삭제를 시도한 대비 실험이다. 두 요청은 HTTP 메서드만 다르다.</w:t>
       </w:r>
     </w:p>
     <w:tbl>
@@ -3778,7 +6268,7 @@
                 <w:sz w:val="18"/>
                 <w:szCs w:val="18"/>
               </w:rPr>
-              <w:t xml:space="preserve">JSESSIONID만 (토큰X)</w:t>
+              <w:t>JSESSIONID만 (토큰X)</w:t>
             </w:r>
           </w:p>
         </w:tc>
@@ -3799,7 +6289,7 @@
                 <w:sz w:val="18"/>
                 <w:szCs w:val="18"/>
               </w:rPr>
-              <w:t xml:space="preserve">302 → 삭제됨 (GET은 CSRF 미검증)</w:t>
+              <w:t>302 → 삭제됨 (GET은 CSRF 미검증)</w:t>
             </w:r>
           </w:p>
         </w:tc>
@@ -3841,7 +6331,7 @@
                 <w:sz w:val="18"/>
                 <w:szCs w:val="18"/>
               </w:rPr>
-              <w:t xml:space="preserve">JSESSIONID만 (토큰X)</w:t>
+              <w:t>JSESSIONID만 (토큰X)</w:t>
             </w:r>
           </w:p>
         </w:tc>
@@ -3862,7 +6352,7 @@
                 <w:sz w:val="18"/>
                 <w:szCs w:val="18"/>
               </w:rPr>
-              <w:t xml:space="preserve">403 → 차단 (POST는 토큰 필수)</w:t>
+              <w:t>403 → 차단 (POST는 토큰 필수)</w:t>
             </w:r>
           </w:p>
         </w:tc>
@@ -3878,7 +6368,7 @@
         <w:spacing w:after="80" w:line="272" w:lineRule="auto"/>
       </w:pPr>
       <w:r>
-        <w:t xml:space="preserve">참고(브라우저 재현) : &lt;img&gt; 자동 공격은 브라우저 방어 계층 때문에 조건이 까다롭다. file:// 는 Origin이 null 이라 CORS 필터가 거부하고, 127.0.0.1:5500 은 localhost:8080 과 다른 site 라 SameSite=Lax 가 쿠키를 막는다. 브라우저에서 성공시키려면 같은 site(호스트명 localhost)에서 서빙해야 한다. 서버 취약점만 명확히 보려면 curl 이 가장 확실하다.</w:t>
+        <w:t>참고(브라우저 재현) : &lt;img&gt; 자동 공격은 브라우저 방어 계층 때문에 조건이 까다롭다. file:// 는 Origin이 null 이라 CORS 필터가 거부하고, 127.0.0.1:5500 은 localhost:8080 과 다른 site 라 SameSite=Lax 가 쿠키를 막는다. 브라우저에서 성공시키려면 같은 site(호스트명 localhost)에서 서빙해야 한다. 서버 취약점만 명확히 보려면 curl 이 가장 확실하다.</w:t>
       </w:r>
     </w:p>
     <w:p>
@@ -3890,10 +6380,11 @@
           <w:b/>
           <w:bCs/>
         </w:rPr>
+        <w:lastRenderedPageBreak/>
         <w:t xml:space="preserve">교육 포인트 — </w:t>
       </w:r>
       <w:r>
-        <w:t xml:space="preserve">"토큰만 켜면 안전"이 아니다. GET 으로 상태를 바꾸는 설계 자체가 CSRF 토큰을 무력화한다. 방어는 토큰 + "상태 변경은 비-GET" 두 가지가 함께여야 한다.</w:t>
+        <w:t>"토큰만 켜면 안전"이 아니다. GET 으로 상태를 바꾸는 설계 자체가 CSRF 토큰을 무력화한다. 방어는 토큰 + "상태 변경은 비-GET" 두 가지가 함께여야 한다.</w:t>
       </w:r>
     </w:p>
     <w:p>
@@ -3908,7 +6399,7 @@
         <w:t xml:space="preserve">참고 — </w:t>
       </w:r>
       <w:r>
-        <w:t xml:space="preserve">GET 삭제를 제거한 뒤 405 가 500 으로 바뀌지 않으려면, #10 예외 하드닝의 catch-all(@ExceptionHandler(Exception.class))이 표준 MVC 예외(405/404 등)를 삼키지 않아야 한다(ErrorResponse 는 재던짐).</w:t>
+        <w:t>GET 삭제를 제거한 뒤 405 가 500 으로 바뀌지 않으려면, #10 예외 하드닝의 catch-all(@ExceptionHandler(Exception.class))이 표준 MVC 예외(405/404 등)를 삼키지 않아야 한다(ErrorResponse 는 재던짐).</w:t>
       </w:r>
     </w:p>
     <w:p>
@@ -4320,11 +6811,16 @@
         <w:spacing w:after="50" w:line="264" w:lineRule="auto"/>
       </w:pPr>
       <w:r>
-        <w:lastRenderedPageBreak/>
         <w:t>상태 변경을 GET 으로 두면 CSRF 토큰이 적용되지 않으니, POST/PUT/DELETE 를 사용한다.</w:t>
       </w:r>
     </w:p>
     <w:sectPr>
+      <w:headerReference w:type="even" r:id="rId7"/>
+      <w:headerReference w:type="default" r:id="rId8"/>
+      <w:footerReference w:type="even" r:id="rId9"/>
+      <w:footerReference w:type="default" r:id="rId10"/>
+      <w:headerReference w:type="first" r:id="rId11"/>
+      <w:footerReference w:type="first" r:id="rId12"/>
       <w:pgSz w:w="11906" w:h="16838"/>
       <w:pgMar w:top="1200" w:right="1200" w:bottom="1200" w:left="1200" w:header="708" w:footer="708" w:gutter="0"/>
       <w:cols w:space="720"/>
@@ -4332,6 +6828,140 @@
     </w:sectPr>
   </w:body>
 </w:document>
+</file>
+
+<file path=word/endnotes.xml><?xml version="1.0" encoding="utf-8"?>
+<w:endnotes xmlns:wpc="http://schemas.microsoft.com/office/word/2010/wordprocessingCanvas" xmlns:cx="http://schemas.microsoft.com/office/drawing/2014/chartex" xmlns:mc="http://schemas.openxmlformats.org/markup-compatibility/2006" xmlns:o="urn:schemas-microsoft-com:office:office" xmlns:r="http://schemas.openxmlformats.org/officeDocument/2006/relationships" xmlns:m="http://schemas.openxmlformats.org/officeDocument/2006/math" xmlns:v="urn:schemas-microsoft-com:vml" xmlns:wp14="http://schemas.microsoft.com/office/word/2010/wordprocessingDrawing" xmlns:wp="http://schemas.openxmlformats.org/drawingml/2006/wordprocessingDrawing" xmlns:w10="urn:schemas-microsoft-com:office:word" xmlns:w="http://schemas.openxmlformats.org/wordprocessingml/2006/main" xmlns:w14="http://schemas.microsoft.com/office/word/2010/wordml" xmlns:w15="http://schemas.microsoft.com/office/word/2012/wordml" xmlns:w16se="http://schemas.microsoft.com/office/word/2015/wordml/symex" xmlns:wpg="http://schemas.microsoft.com/office/word/2010/wordprocessingGroup" xmlns:wpi="http://schemas.microsoft.com/office/word/2010/wordprocessingInk" xmlns:wne="http://schemas.microsoft.com/office/word/2006/wordml" xmlns:wps="http://schemas.microsoft.com/office/word/2010/wordprocessingShape" mc:Ignorable="w14 w15 w16se wp14">
+  <w:endnote w:type="separator" w:id="-1">
+    <w:p>
+      <w:r>
+        <w:separator/>
+      </w:r>
+    </w:p>
+  </w:endnote>
+  <w:endnote w:type="continuationSeparator" w:id="0">
+    <w:p>
+      <w:r>
+        <w:continuationSeparator/>
+      </w:r>
+    </w:p>
+  </w:endnote>
+</w:endnotes>
+</file>
+
+<file path=word/footer1.xml><?xml version="1.0" encoding="utf-8"?>
+<w:ftr xmlns:wpc="http://schemas.microsoft.com/office/word/2010/wordprocessingCanvas" xmlns:cx="http://schemas.microsoft.com/office/drawing/2014/chartex" xmlns:mc="http://schemas.openxmlformats.org/markup-compatibility/2006" xmlns:o="urn:schemas-microsoft-com:office:office" xmlns:r="http://schemas.openxmlformats.org/officeDocument/2006/relationships" xmlns:m="http://schemas.openxmlformats.org/officeDocument/2006/math" xmlns:v="urn:schemas-microsoft-com:vml" xmlns:wp14="http://schemas.microsoft.com/office/word/2010/wordprocessingDrawing" xmlns:wp="http://schemas.openxmlformats.org/drawingml/2006/wordprocessingDrawing" xmlns:w10="urn:schemas-microsoft-com:office:word" xmlns:w="http://schemas.openxmlformats.org/wordprocessingml/2006/main" xmlns:w14="http://schemas.microsoft.com/office/word/2010/wordml" xmlns:w15="http://schemas.microsoft.com/office/word/2012/wordml" xmlns:w16se="http://schemas.microsoft.com/office/word/2015/wordml/symex" xmlns:wpg="http://schemas.microsoft.com/office/word/2010/wordprocessingGroup" xmlns:wpi="http://schemas.microsoft.com/office/word/2010/wordprocessingInk" xmlns:wne="http://schemas.microsoft.com/office/word/2006/wordml" xmlns:wps="http://schemas.microsoft.com/office/word/2010/wordprocessingShape" mc:Ignorable="w14 w15 w16se wp14">
+  <w:p>
+    <w:pPr>
+      <w:pStyle w:val="ab"/>
+    </w:pPr>
+  </w:p>
+</w:ftr>
+</file>
+
+<file path=word/footer2.xml><?xml version="1.0" encoding="utf-8"?>
+<w:ftr xmlns:wpc="http://schemas.microsoft.com/office/word/2010/wordprocessingCanvas" xmlns:cx="http://schemas.microsoft.com/office/drawing/2014/chartex" xmlns:mc="http://schemas.openxmlformats.org/markup-compatibility/2006" xmlns:o="urn:schemas-microsoft-com:office:office" xmlns:r="http://schemas.openxmlformats.org/officeDocument/2006/relationships" xmlns:m="http://schemas.openxmlformats.org/officeDocument/2006/math" xmlns:v="urn:schemas-microsoft-com:vml" xmlns:wp14="http://schemas.microsoft.com/office/word/2010/wordprocessingDrawing" xmlns:wp="http://schemas.openxmlformats.org/drawingml/2006/wordprocessingDrawing" xmlns:w10="urn:schemas-microsoft-com:office:word" xmlns:w="http://schemas.openxmlformats.org/wordprocessingml/2006/main" xmlns:w14="http://schemas.microsoft.com/office/word/2010/wordml" xmlns:w15="http://schemas.microsoft.com/office/word/2012/wordml" xmlns:w16se="http://schemas.microsoft.com/office/word/2015/wordml/symex" xmlns:wpg="http://schemas.microsoft.com/office/word/2010/wordprocessingGroup" xmlns:wpi="http://schemas.microsoft.com/office/word/2010/wordprocessingInk" xmlns:wne="http://schemas.microsoft.com/office/word/2006/wordml" xmlns:wps="http://schemas.microsoft.com/office/word/2010/wordprocessingShape" mc:Ignorable="w14 w15 w16se wp14">
+  <w:p>
+    <w:pPr>
+      <w:pStyle w:val="ab"/>
+    </w:pPr>
+  </w:p>
+</w:ftr>
+</file>
+
+<file path=word/footer3.xml><?xml version="1.0" encoding="utf-8"?>
+<w:ftr xmlns:wpc="http://schemas.microsoft.com/office/word/2010/wordprocessingCanvas" xmlns:cx="http://schemas.microsoft.com/office/drawing/2014/chartex" xmlns:mc="http://schemas.openxmlformats.org/markup-compatibility/2006" xmlns:o="urn:schemas-microsoft-com:office:office" xmlns:r="http://schemas.openxmlformats.org/officeDocument/2006/relationships" xmlns:m="http://schemas.openxmlformats.org/officeDocument/2006/math" xmlns:v="urn:schemas-microsoft-com:vml" xmlns:wp14="http://schemas.microsoft.com/office/word/2010/wordprocessingDrawing" xmlns:wp="http://schemas.openxmlformats.org/drawingml/2006/wordprocessingDrawing" xmlns:w10="urn:schemas-microsoft-com:office:word" xmlns:w="http://schemas.openxmlformats.org/wordprocessingml/2006/main" xmlns:w14="http://schemas.microsoft.com/office/word/2010/wordml" xmlns:w15="http://schemas.microsoft.com/office/word/2012/wordml" xmlns:w16se="http://schemas.microsoft.com/office/word/2015/wordml/symex" xmlns:wpg="http://schemas.microsoft.com/office/word/2010/wordprocessingGroup" xmlns:wpi="http://schemas.microsoft.com/office/word/2010/wordprocessingInk" xmlns:wne="http://schemas.microsoft.com/office/word/2006/wordml" xmlns:wps="http://schemas.microsoft.com/office/word/2010/wordprocessingShape" mc:Ignorable="w14 w15 w16se wp14">
+  <w:p>
+    <w:pPr>
+      <w:pStyle w:val="ab"/>
+    </w:pPr>
+  </w:p>
+</w:ftr>
+</file>
+
+<file path=word/footnotes.xml><?xml version="1.0" encoding="utf-8"?>
+<w:footnotes xmlns:wpc="http://schemas.microsoft.com/office/word/2010/wordprocessingCanvas" xmlns:cx="http://schemas.microsoft.com/office/drawing/2014/chartex" xmlns:mc="http://schemas.openxmlformats.org/markup-compatibility/2006" xmlns:o="urn:schemas-microsoft-com:office:office" xmlns:r="http://schemas.openxmlformats.org/officeDocument/2006/relationships" xmlns:m="http://schemas.openxmlformats.org/officeDocument/2006/math" xmlns:v="urn:schemas-microsoft-com:vml" xmlns:wp14="http://schemas.microsoft.com/office/word/2010/wordprocessingDrawing" xmlns:wp="http://schemas.openxmlformats.org/drawingml/2006/wordprocessingDrawing" xmlns:w10="urn:schemas-microsoft-com:office:word" xmlns:w="http://schemas.openxmlformats.org/wordprocessingml/2006/main" xmlns:w14="http://schemas.microsoft.com/office/word/2010/wordml" xmlns:w15="http://schemas.microsoft.com/office/word/2012/wordml" xmlns:w16se="http://schemas.microsoft.com/office/word/2015/wordml/symex" xmlns:wpg="http://schemas.microsoft.com/office/word/2010/wordprocessingGroup" xmlns:wpi="http://schemas.microsoft.com/office/word/2010/wordprocessingInk" xmlns:wne="http://schemas.microsoft.com/office/word/2006/wordml" xmlns:wps="http://schemas.microsoft.com/office/word/2010/wordprocessingShape" mc:Ignorable="w14 w15 w16se wp14">
+  <w:footnote w:type="separator" w:id="-1">
+    <w:p>
+      <w:r>
+        <w:separator/>
+      </w:r>
+    </w:p>
+  </w:footnote>
+  <w:footnote w:type="continuationSeparator" w:id="0">
+    <w:p>
+      <w:r>
+        <w:continuationSeparator/>
+      </w:r>
+    </w:p>
+  </w:footnote>
+</w:footnotes>
+</file>
+
+<file path=word/header1.xml><?xml version="1.0" encoding="utf-8"?>
+<w:hdr xmlns:wpc="http://schemas.microsoft.com/office/word/2010/wordprocessingCanvas" xmlns:cx="http://schemas.microsoft.com/office/drawing/2014/chartex" xmlns:mc="http://schemas.openxmlformats.org/markup-compatibility/2006" xmlns:o="urn:schemas-microsoft-com:office:office" xmlns:r="http://schemas.openxmlformats.org/officeDocument/2006/relationships" xmlns:m="http://schemas.openxmlformats.org/officeDocument/2006/math" xmlns:v="urn:schemas-microsoft-com:vml" xmlns:wp14="http://schemas.microsoft.com/office/word/2010/wordprocessingDrawing" xmlns:wp="http://schemas.openxmlformats.org/drawingml/2006/wordprocessingDrawing" xmlns:w10="urn:schemas-microsoft-com:office:word" xmlns:w="http://schemas.openxmlformats.org/wordprocessingml/2006/main" xmlns:w14="http://schemas.microsoft.com/office/word/2010/wordml" xmlns:w15="http://schemas.microsoft.com/office/word/2012/wordml" xmlns:w16se="http://schemas.microsoft.com/office/word/2015/wordml/symex" xmlns:wpg="http://schemas.microsoft.com/office/word/2010/wordprocessingGroup" xmlns:wpi="http://schemas.microsoft.com/office/word/2010/wordprocessingInk" xmlns:wne="http://schemas.microsoft.com/office/word/2006/wordml" xmlns:wps="http://schemas.microsoft.com/office/word/2010/wordprocessingShape" mc:Ignorable="w14 w15 w16se wp14">
+  <w:p>
+    <w:pPr>
+      <w:pStyle w:val="aa"/>
+    </w:pPr>
+  </w:p>
+</w:hdr>
+</file>
+
+<file path=word/header2.xml><?xml version="1.0" encoding="utf-8"?>
+<w:hdr xmlns:wpc="http://schemas.microsoft.com/office/word/2010/wordprocessingCanvas" xmlns:cx="http://schemas.microsoft.com/office/drawing/2014/chartex" xmlns:mc="http://schemas.openxmlformats.org/markup-compatibility/2006" xmlns:o="urn:schemas-microsoft-com:office:office" xmlns:r="http://schemas.openxmlformats.org/officeDocument/2006/relationships" xmlns:m="http://schemas.openxmlformats.org/officeDocument/2006/math" xmlns:v="urn:schemas-microsoft-com:vml" xmlns:wp14="http://schemas.microsoft.com/office/word/2010/wordprocessingDrawing" xmlns:wp="http://schemas.openxmlformats.org/drawingml/2006/wordprocessingDrawing" xmlns:w10="urn:schemas-microsoft-com:office:word" xmlns:w="http://schemas.openxmlformats.org/wordprocessingml/2006/main" xmlns:w14="http://schemas.microsoft.com/office/word/2010/wordml" xmlns:w15="http://schemas.microsoft.com/office/word/2012/wordml" xmlns:w16se="http://schemas.microsoft.com/office/word/2015/wordml/symex" xmlns:wpg="http://schemas.microsoft.com/office/word/2010/wordprocessingGroup" xmlns:wpi="http://schemas.microsoft.com/office/word/2010/wordprocessingInk" xmlns:wne="http://schemas.microsoft.com/office/word/2006/wordml" xmlns:wps="http://schemas.microsoft.com/office/word/2010/wordprocessingShape" mc:Ignorable="w14 w15 w16se wp14">
+  <w:sdt>
+    <w:sdtPr>
+      <w:id w:val="1552890466"/>
+      <w:docPartObj>
+        <w:docPartGallery w:val="Page Numbers (Top of Page)"/>
+        <w:docPartUnique/>
+      </w:docPartObj>
+    </w:sdtPr>
+    <w:sdtContent>
+      <w:p>
+        <w:pPr>
+          <w:pStyle w:val="aa"/>
+          <w:jc w:val="right"/>
+        </w:pPr>
+        <w:r>
+          <w:fldChar w:fldCharType="begin"/>
+        </w:r>
+        <w:r>
+          <w:instrText>PAGE   \* MERGEFORMAT</w:instrText>
+        </w:r>
+        <w:r>
+          <w:fldChar w:fldCharType="separate"/>
+        </w:r>
+        <w:r>
+          <w:rPr>
+            <w:noProof/>
+            <w:lang w:val="ko-KR"/>
+          </w:rPr>
+          <w:t>6</w:t>
+        </w:r>
+        <w:r>
+          <w:fldChar w:fldCharType="end"/>
+        </w:r>
+      </w:p>
+    </w:sdtContent>
+  </w:sdt>
+  <w:p>
+    <w:pPr>
+      <w:pStyle w:val="aa"/>
+    </w:pPr>
+  </w:p>
+</w:hdr>
+</file>
+
+<file path=word/header3.xml><?xml version="1.0" encoding="utf-8"?>
+<w:hdr xmlns:wpc="http://schemas.microsoft.com/office/word/2010/wordprocessingCanvas" xmlns:cx="http://schemas.microsoft.com/office/drawing/2014/chartex" xmlns:mc="http://schemas.openxmlformats.org/markup-compatibility/2006" xmlns:o="urn:schemas-microsoft-com:office:office" xmlns:r="http://schemas.openxmlformats.org/officeDocument/2006/relationships" xmlns:m="http://schemas.openxmlformats.org/officeDocument/2006/math" xmlns:v="urn:schemas-microsoft-com:vml" xmlns:wp14="http://schemas.microsoft.com/office/word/2010/wordprocessingDrawing" xmlns:wp="http://schemas.openxmlformats.org/drawingml/2006/wordprocessingDrawing" xmlns:w10="urn:schemas-microsoft-com:office:word" xmlns:w="http://schemas.openxmlformats.org/wordprocessingml/2006/main" xmlns:w14="http://schemas.microsoft.com/office/word/2010/wordml" xmlns:w15="http://schemas.microsoft.com/office/word/2012/wordml" xmlns:w16se="http://schemas.microsoft.com/office/word/2015/wordml/symex" xmlns:wpg="http://schemas.microsoft.com/office/word/2010/wordprocessingGroup" xmlns:wpi="http://schemas.microsoft.com/office/word/2010/wordprocessingInk" xmlns:wne="http://schemas.microsoft.com/office/word/2006/wordml" xmlns:wps="http://schemas.microsoft.com/office/word/2010/wordprocessingShape" mc:Ignorable="w14 w15 w16se wp14">
+  <w:p>
+    <w:pPr>
+      <w:pStyle w:val="aa"/>
+    </w:pPr>
+  </w:p>
+</w:hdr>
 </file>
 
 <file path=word/numbering.xml><?xml version="1.0" encoding="utf-8"?>
@@ -5016,6 +7646,50 @@
       <w:szCs w:val="20"/>
     </w:rPr>
   </w:style>
+  <w:style w:type="paragraph" w:styleId="aa">
+    <w:name w:val="header"/>
+    <w:basedOn w:val="a"/>
+    <w:link w:val="Char1"/>
+    <w:uiPriority w:val="99"/>
+    <w:unhideWhenUsed/>
+    <w:rsid w:val="00BC7BBE"/>
+    <w:pPr>
+      <w:tabs>
+        <w:tab w:val="center" w:pos="4513"/>
+        <w:tab w:val="right" w:pos="9026"/>
+      </w:tabs>
+      <w:snapToGrid w:val="0"/>
+    </w:pPr>
+  </w:style>
+  <w:style w:type="character" w:customStyle="1" w:styleId="Char1">
+    <w:name w:val="머리글 Char"/>
+    <w:basedOn w:val="a0"/>
+    <w:link w:val="aa"/>
+    <w:uiPriority w:val="99"/>
+    <w:rsid w:val="00BC7BBE"/>
+  </w:style>
+  <w:style w:type="paragraph" w:styleId="ab">
+    <w:name w:val="footer"/>
+    <w:basedOn w:val="a"/>
+    <w:link w:val="Char2"/>
+    <w:uiPriority w:val="99"/>
+    <w:unhideWhenUsed/>
+    <w:rsid w:val="00BC7BBE"/>
+    <w:pPr>
+      <w:tabs>
+        <w:tab w:val="center" w:pos="4513"/>
+        <w:tab w:val="right" w:pos="9026"/>
+      </w:tabs>
+      <w:snapToGrid w:val="0"/>
+    </w:pPr>
+  </w:style>
+  <w:style w:type="character" w:customStyle="1" w:styleId="Char2">
+    <w:name w:val="바닥글 Char"/>
+    <w:basedOn w:val="a0"/>
+    <w:link w:val="ab"/>
+    <w:uiPriority w:val="99"/>
+    <w:rsid w:val="00BC7BBE"/>
+  </w:style>
 </w:styles>
 </file>
 

</xml_diff>

<commit_message>
[Docs] CSRF: curl 스크립트의 mktemp/grep/sed 명령 설명 추가
JAR=\$(mktemp)이 쿠키 저장소로 쓰이는 이유와, CSRF 값 추출용
grep -o / sed 치환 명령이 각각 무엇을 하는지 md/docx에 보강
</commit_message>
<xml_diff>
--- a/docs/security/05_CSRF.docx
+++ b/docs/security/05_CSRF.docx
@@ -2576,6 +2576,78 @@
           <w:szCs w:val="18"/>
         </w:rPr>
         <w:t xml:space="preserve">  -D - -o /dev/null | grep -i "^HTTP\|^Location"</w:t>
+      </w:r>
+    </w:p>
+    <w:p>
+      <w:pPr>
+        <w:spacing w:after="90" w:line="272" w:lineRule="auto"/>
+      </w:pPr>
+      <w:r>
+        <w:rPr>
+          <w:b/>
+          <w:bCs/>
+          <w:color w:val="1F3864"/>
+        </w:rPr>
+        <w:t xml:space="preserve">JAR=$(mktemp) — </w:t>
+      </w:r>
+      <w:r>
+        <w:t xml:space="preserve">curl의 쿠키 저장소로 쓸 임시 파일을 하나 만든다. -c "$JAR"(GET /login)로 세션 쿠키(JSESSIONID)를 그 파일에 저장해두고, -b "$JAR"(POST /login-process)로 같은 요청에 다시 실어 보낸다 — 이게 없으면 두 호출이 서로 다른 세션으로 취급돼 토큰이 안 맞는다. 매번 새 임시 파일을 쓰므로 반복 실행해도 이전 세션과 섞이지 않는다.</w:t>
+      </w:r>
+    </w:p>
+    <w:p>
+      <w:pPr>
+        <w:spacing w:after="90" w:line="272" w:lineRule="auto"/>
+      </w:pPr>
+      <w:r>
+        <w:rPr>
+          <w:b/>
+          <w:bCs/>
+          <w:color w:val="1F3864"/>
+        </w:rPr>
+        <w:t xml:space="preserve">CSRF=$(echo "$LOGIN_PAGE" | grep -o ... | sed ...) — </w:t>
+      </w:r>
+      <w:r>
+        <w:t xml:space="preserve">로그인 페이지 HTML에서 토큰 값만 뽑아낸다.</w:t>
+      </w:r>
+    </w:p>
+    <w:p>
+      <w:pPr>
+        <w:spacing w:after="90" w:line="272" w:lineRule="auto"/>
+        <w:ind w:left="284"/>
+      </w:pPr>
+      <w:r>
+        <w:t xml:space="preserve">· </w:t>
+      </w:r>
+      <w:r>
+        <w:rPr>
+          <w:rFonts w:ascii="Consolas" w:eastAsia="Consolas" w:hAnsi="Consolas" w:cs="Consolas"/>
+          <w:sz w:val="18"/>
+          <w:szCs w:val="18"/>
+        </w:rPr>
+        <w:t>grep -o 'name="_csrf" value="[^"]*"'</w:t>
+      </w:r>
+      <w:r>
+        <w:t xml:space="preserve"> : 페이지 전체에서 name="_csrf" value="실제토큰값" 형태로 일치하는 부분만 추출한다(-o는 매치된 부분만 출력)</w:t>
+      </w:r>
+    </w:p>
+    <w:p>
+      <w:pPr>
+        <w:spacing w:after="90" w:line="272" w:lineRule="auto"/>
+        <w:ind w:left="284"/>
+      </w:pPr>
+      <w:r>
+        <w:t xml:space="preserve">· </w:t>
+      </w:r>
+      <w:r>
+        <w:rPr>
+          <w:rFonts w:ascii="Consolas" w:eastAsia="Consolas" w:hAnsi="Consolas" w:cs="Consolas"/>
+          <w:sz w:val="18"/>
+          <w:szCs w:val="18"/>
+        </w:rPr>
+        <w:t>sed 's/.*value="\([^"]*\)".*/\1/'</w:t>
+      </w:r>
+      <w:r>
+        <w:t xml:space="preserve"> : 그 문자열에서 value="와 뒤따르는 닫는 " 사이의 값만 캡처(\(...\))해 나머지는 버리고 그 값(\1)으로 치환한다</w:t>
       </w:r>
     </w:p>
     <w:p>

</xml_diff>

<commit_message>
[Docs] CSRF: CsrfFilter 동작 방식(4-3) 추가
안전한 메서드는 토큰 검사 없이 통과, 상태 변경 메서드는 저장된
토큰과 요청 토큰(파라미터/헤더)을 비교해 불일치 시 컨트롤러 도달
전에 403으로 거부하는 흐름을 md/docx에 반영
</commit_message>
<xml_diff>
--- a/docs/security/05_CSRF.docx
+++ b/docs/security/05_CSRF.docx
@@ -3480,6 +3480,68 @@
       </w:pPr>
       <w:r>
         <w:t>그래서 th:action 폼은 개발자가 토큰을 신경 쓰지 않아도 되고, 공격자 페이지는 이 토큰 값을 알 수 없어 403 이 된다. AJAX/수동 요청은 ${_csrf.token}, ${_csrf.headerName} 으로 토큰을 꺼내 헤더에 넣는다.</w:t>
+      </w:r>
+    </w:p>
+    <w:p>
+      <w:pPr>
+        <w:pStyle w:val="3"/>
+        <w:spacing w:before="200" w:after="80"/>
+      </w:pPr>
+      <w:r>
+        <w:rPr>
+          <w:b/>
+          <w:bCs/>
+          <w:color w:val="2E5496"/>
+        </w:rPr>
+        <w:t xml:space="preserve">4-3. CsrfFilter 동작 방식</w:t>
+      </w:r>
+    </w:p>
+    <w:p>
+      <w:pPr>
+        <w:spacing w:after="80" w:line="272" w:lineRule="auto"/>
+      </w:pPr>
+      <w:r>
+        <w:t xml:space="preserve">Spring Security의 CSRF 보호는 필터 체인에 등록되는 CsrfFilter(OncePerRequestFilter)가 담당한다.</w:t>
+      </w:r>
+    </w:p>
+    <w:p>
+      <w:pPr>
+        <w:spacing w:after="80" w:line="272" w:lineRule="auto"/>
+      </w:pPr>
+      <w:r>
+        <w:t xml:space="preserve">1. 요청이 들어오면 먼저 HTTP 메서드를 확인한다. GET/HEAD/TRACE/OPTIONS처럼 상태를 바꾸지 않는("안전한") 메서드는 토큰 검사 없이 그대로 통과시킨다 — 대신 세션에 토큰이 없으면 이번 요청에서 새로 발급해, 다음에 보여줄 폼에 심을 수 있게 한다.</w:t>
+      </w:r>
+    </w:p>
+    <w:p>
+      <w:pPr>
+        <w:spacing w:after="80" w:line="272" w:lineRule="auto"/>
+      </w:pPr>
+      <w:r>
+        <w:t xml:space="preserve">2. POST/PUT/DELETE/PATCH 같은 상태 변경 메서드는 CsrfTokenRepository(기본은 세션)에 저장된 "기대 토큰"을 가져온다.</w:t>
+      </w:r>
+    </w:p>
+    <w:p>
+      <w:pPr>
+        <w:spacing w:after="80" w:line="272" w:lineRule="auto"/>
+      </w:pPr>
+      <w:r>
+        <w:t xml:space="preserve">3. 요청에 실려 온 토큰을 CsrfTokenRequestHandler로 찾는다 — 기본적으로 파라미터 _csrf 또는 헤더 X-CSRF-TOKEN 둘 다 확인한다.</w:t>
+      </w:r>
+    </w:p>
+    <w:p>
+      <w:pPr>
+        <w:spacing w:after="80" w:line="272" w:lineRule="auto"/>
+      </w:pPr>
+      <w:r>
+        <w:t xml:space="preserve">4. 기대 토큰과 요청 토큰을 비교한다. 토큰이 없으면 MissingCsrfTokenException, 값이 다르면 InvalidCsrfTokenException이 발생해 AccessDeniedHandler가 컨트롤러에 도달하기도 전에 403으로 거부한다. 일치하면 다음 필터로 넘어가 정상적으로 컨트롤러까지 도달한다.</w:t>
+      </w:r>
+    </w:p>
+    <w:p>
+      <w:pPr>
+        <w:spacing w:after="80" w:line="272" w:lineRule="auto"/>
+      </w:pPr>
+      <w:r>
+        <w:t xml:space="preserve">세션 인증(Authentication) 여부와 이 토큰 비교는 서로 다른 필터가 담당하는 별개의 검사다. 그래서 로그인에 성공해 세션이 인증된 뒤에도 매 상태변경 요청마다 토큰 검사를 다시 통과해야 하며, 앞서 확인한 change-password 요청이 토큰 없이 403으로 막힌 것도 이 흐름 그대로다.</w:t>
       </w:r>
     </w:p>
     <w:p>

</xml_diff>

<commit_message>
[Docs] 05_CSRF.docx 사용자 수정 반영
</commit_message>
<xml_diff>
--- a/docs/security/05_CSRF.docx
+++ b/docs/security/05_CSRF.docx
@@ -1945,7 +1945,6 @@
       <w:pPr>
         <w:spacing w:after="80" w:line="272" w:lineRule="auto"/>
       </w:pPr>
-      <w:bookmarkStart w:id="0" w:name="_GoBack"/>
       <w:r>
         <w:t xml:space="preserve">CSRF 활성 시엔 로그인조차 </w:t>
       </w:r>
@@ -1953,11 +1952,7 @@
         <w:t>CSRF</w:t>
       </w:r>
       <w:r>
-        <w:t>토큰이 필요</w:t>
-      </w:r>
-      <w:bookmarkEnd w:id="0"/>
-      <w:r>
-        <w:t>하므로, curl 로 로그인</w:t>
+        <w:t>토큰이 필요하므로, curl 로 로그인</w:t>
       </w:r>
       <w:r>
         <w:rPr>
@@ -2379,7 +2374,63 @@
           <w:bCs/>
           <w:color w:val="2E5496"/>
         </w:rPr>
-        <w:t xml:space="preserve">curl로 CSRF 토큰 받아 로그인하기</w:t>
+        <w:t>curl</w:t>
+      </w:r>
+      <w:r>
+        <w:rPr>
+          <w:b/>
+          <w:bCs/>
+          <w:color w:val="2E5496"/>
+        </w:rPr>
+        <w:t>로</w:t>
+      </w:r>
+      <w:r>
+        <w:rPr>
+          <w:b/>
+          <w:bCs/>
+          <w:color w:val="2E5496"/>
+        </w:rPr>
+        <w:t xml:space="preserve"> CSRF </w:t>
+      </w:r>
+      <w:r>
+        <w:rPr>
+          <w:b/>
+          <w:bCs/>
+          <w:color w:val="2E5496"/>
+        </w:rPr>
+        <w:t>토큰</w:t>
+      </w:r>
+      <w:r>
+        <w:rPr>
+          <w:b/>
+          <w:bCs/>
+          <w:color w:val="2E5496"/>
+        </w:rPr>
+        <w:t xml:space="preserve"> </w:t>
+      </w:r>
+      <w:r>
+        <w:rPr>
+          <w:b/>
+          <w:bCs/>
+          <w:color w:val="2E5496"/>
+        </w:rPr>
+        <w:t>받아</w:t>
+      </w:r>
+      <w:r>
+        <w:rPr>
+          <w:b/>
+          <w:bCs/>
+          <w:color w:val="2E5496"/>
+        </w:rPr>
+        <w:t xml:space="preserve"> </w:t>
+      </w:r>
+      <w:r>
+        <w:rPr>
+          <w:b/>
+          <w:bCs/>
+          <w:color w:val="2E5496"/>
+        </w:rPr>
+        <w:t>로그인하기</w:t>
       </w:r>
     </w:p>
     <w:p>
@@ -2387,7 +2438,211 @@
         <w:spacing w:after="90" w:line="272" w:lineRule="auto"/>
       </w:pPr>
       <w:r>
-        <w:t xml:space="preserve">CSRF가 켜진 상태에서는 curl로 /login-process를 바로 호출하면 토큰이 없어 403으로 거부된다. 브라우저는 Thymeleaf가 폼에 _csrf 히든 필드를 자동으로 넣어주지만, curl은 직접 두 단계를 거쳐야 한다 — ① GET /login으로 세션 쿠키와 _csrf 토큰을 받고, ② 같은 쿠키+토큰으로 POST /login-process를 호출한다.</w:t>
+        <w:t>CSRF</w:t>
+      </w:r>
+      <w:r>
+        <w:t>가</w:t>
+      </w:r>
+      <w:r>
+        <w:t xml:space="preserve"> </w:t>
+      </w:r>
+      <w:r>
+        <w:t>켜진</w:t>
+      </w:r>
+      <w:r>
+        <w:t xml:space="preserve"> </w:t>
+      </w:r>
+      <w:r>
+        <w:t>상태에서는</w:t>
+      </w:r>
+      <w:r>
+        <w:t xml:space="preserve"> curl</w:t>
+      </w:r>
+      <w:r>
+        <w:t>로</w:t>
+      </w:r>
+      <w:r>
+        <w:t xml:space="preserve"> /login-process</w:t>
+      </w:r>
+      <w:r>
+        <w:t>를</w:t>
+      </w:r>
+      <w:r>
+        <w:t xml:space="preserve"> </w:t>
+      </w:r>
+      <w:r>
+        <w:t>바로</w:t>
+      </w:r>
+      <w:r>
+        <w:t xml:space="preserve"> </w:t>
+      </w:r>
+      <w:r>
+        <w:t>호출하면</w:t>
+      </w:r>
+      <w:r>
+        <w:t xml:space="preserve"> </w:t>
+      </w:r>
+      <w:r>
+        <w:t>토큰이</w:t>
+      </w:r>
+      <w:r>
+        <w:t xml:space="preserve"> </w:t>
+      </w:r>
+      <w:r>
+        <w:t>없어</w:t>
+      </w:r>
+      <w:r>
+        <w:t xml:space="preserve"> 403</w:t>
+      </w:r>
+      <w:r>
+        <w:t>으로</w:t>
+      </w:r>
+      <w:r>
+        <w:t xml:space="preserve"> </w:t>
+      </w:r>
+      <w:r>
+        <w:t>거부된다</w:t>
+      </w:r>
+      <w:r>
+        <w:t xml:space="preserve">. </w:t>
+      </w:r>
+      <w:r>
+        <w:t>브라우저는</w:t>
+      </w:r>
+      <w:r>
+        <w:t xml:space="preserve"> Thymeleaf</w:t>
+      </w:r>
+      <w:r>
+        <w:t>가</w:t>
+      </w:r>
+      <w:r>
+        <w:t xml:space="preserve"> </w:t>
+      </w:r>
+      <w:r>
+        <w:t>폼에</w:t>
+      </w:r>
+      <w:r>
+        <w:t xml:space="preserve"> _csrf </w:t>
+      </w:r>
+      <w:r>
+        <w:t>히든</w:t>
+      </w:r>
+      <w:r>
+        <w:t xml:space="preserve"> </w:t>
+      </w:r>
+      <w:r>
+        <w:t>필드를</w:t>
+      </w:r>
+      <w:r>
+        <w:t xml:space="preserve"> </w:t>
+      </w:r>
+      <w:r>
+        <w:t>자동으로</w:t>
+      </w:r>
+      <w:r>
+        <w:t xml:space="preserve"> </w:t>
+      </w:r>
+      <w:r>
+        <w:t>넣어주지만</w:t>
+      </w:r>
+      <w:r>
+        <w:t>, curl</w:t>
+      </w:r>
+      <w:r>
+        <w:t>은</w:t>
+      </w:r>
+      <w:r>
+        <w:t xml:space="preserve"> </w:t>
+      </w:r>
+      <w:r>
+        <w:t>직접</w:t>
+      </w:r>
+      <w:r>
+        <w:t xml:space="preserve"> </w:t>
+      </w:r>
+      <w:r>
+        <w:t>두</w:t>
+      </w:r>
+      <w:r>
+        <w:t xml:space="preserve"> </w:t>
+      </w:r>
+      <w:r>
+        <w:t>단계를</w:t>
+      </w:r>
+      <w:r>
+        <w:t xml:space="preserve"> </w:t>
+      </w:r>
+      <w:r>
+        <w:t>거쳐야</w:t>
+      </w:r>
+      <w:r>
+        <w:t xml:space="preserve"> </w:t>
+      </w:r>
+      <w:r>
+        <w:t>한다</w:t>
+      </w:r>
+      <w:r>
+        <w:t xml:space="preserve"> — ① GET /login</w:t>
+      </w:r>
+      <w:r>
+        <w:t>으로</w:t>
+      </w:r>
+      <w:r>
+        <w:t xml:space="preserve"> </w:t>
+      </w:r>
+      <w:r>
+        <w:t>세션</w:t>
+      </w:r>
+      <w:r>
+        <w:t xml:space="preserve"> </w:t>
+      </w:r>
+      <w:r>
+        <w:t>쿠키와</w:t>
+      </w:r>
+      <w:r>
+        <w:t xml:space="preserve"> _csrf </w:t>
+      </w:r>
+      <w:r>
+        <w:t>토큰을</w:t>
+      </w:r>
+      <w:r>
+        <w:t xml:space="preserve"> </w:t>
+      </w:r>
+      <w:r>
+        <w:t>받고</w:t>
+      </w:r>
+      <w:r>
+        <w:t xml:space="preserve">, ② </w:t>
+      </w:r>
+      <w:r>
+        <w:t>같은</w:t>
+      </w:r>
+      <w:r>
+        <w:t xml:space="preserve"> </w:t>
+      </w:r>
+      <w:r>
+        <w:t>쿠키</w:t>
+      </w:r>
+      <w:r>
+        <w:t>+</w:t>
+      </w:r>
+      <w:r>
+        <w:t>토큰으로</w:t>
+      </w:r>
+      <w:r>
+        <w:t xml:space="preserve"> POST /login-process</w:t>
+      </w:r>
+      <w:r>
+        <w:t>를</w:t>
+      </w:r>
+      <w:r>
+        <w:t xml:space="preserve"> </w:t>
+      </w:r>
+      <w:r>
+        <w:t>호출한다</w:t>
+      </w:r>
+      <w:r>
+        <w:t>.</w:t>
       </w:r>
     </w:p>
     <w:p>
@@ -2404,7 +2659,15 @@
           <w:sz w:val="18"/>
           <w:szCs w:val="18"/>
         </w:rPr>
-        <w:t>EMAIL=admin@aa.com; PASSWORD=pwd1; B=http://localhost:8080; JAR=$(mktemp)</w:t>
+        <w:t>EMAIL=admin@aa.com; PASSWORD=pwd1; B=http://loc</w:t>
+      </w:r>
+      <w:r>
+        <w:rPr>
+          <w:rFonts w:ascii="Consolas" w:eastAsia="Consolas" w:hAnsi="Consolas" w:cs="Consolas"/>
+          <w:sz w:val="18"/>
+          <w:szCs w:val="18"/>
+        </w:rPr>
+        <w:t>alhost:8080; JAR=$(mktemp)</w:t>
       </w:r>
     </w:p>
     <w:p>
@@ -2433,7 +2696,95 @@
           <w:sz w:val="18"/>
           <w:szCs w:val="18"/>
         </w:rPr>
-        <w:t># 1) 로그인 페이지에서 세션 쿠키 + _csrf 토큰 획득</w:t>
+        <w:t xml:space="preserve"># 1) </w:t>
+      </w:r>
+      <w:r>
+        <w:rPr>
+          <w:rFonts w:ascii="Consolas" w:eastAsia="Consolas" w:hAnsi="Consolas" w:cs="Consolas"/>
+          <w:sz w:val="18"/>
+          <w:szCs w:val="18"/>
+        </w:rPr>
+        <w:t>로그인</w:t>
+      </w:r>
+      <w:r>
+        <w:rPr>
+          <w:rFonts w:ascii="Consolas" w:eastAsia="Consolas" w:hAnsi="Consolas" w:cs="Consolas"/>
+          <w:sz w:val="18"/>
+          <w:szCs w:val="18"/>
+        </w:rPr>
+        <w:t xml:space="preserve"> </w:t>
+      </w:r>
+      <w:r>
+        <w:rPr>
+          <w:rFonts w:ascii="Consolas" w:eastAsia="Consolas" w:hAnsi="Consolas" w:cs="Consolas"/>
+          <w:sz w:val="18"/>
+          <w:szCs w:val="18"/>
+        </w:rPr>
+        <w:t>페이지에서</w:t>
+      </w:r>
+      <w:r>
+        <w:rPr>
+          <w:rFonts w:ascii="Consolas" w:eastAsia="Consolas" w:hAnsi="Consolas" w:cs="Consolas"/>
+          <w:sz w:val="18"/>
+          <w:szCs w:val="18"/>
+        </w:rPr>
+        <w:t xml:space="preserve"> </w:t>
+      </w:r>
+      <w:r>
+        <w:rPr>
+          <w:rFonts w:ascii="Consolas" w:eastAsia="Consolas" w:hAnsi="Consolas" w:cs="Consolas"/>
+          <w:sz w:val="18"/>
+          <w:szCs w:val="18"/>
+        </w:rPr>
+        <w:t>세션</w:t>
+      </w:r>
+      <w:r>
+        <w:rPr>
+          <w:rFonts w:ascii="Consolas" w:eastAsia="Consolas" w:hAnsi="Consolas" w:cs="Consolas"/>
+          <w:sz w:val="18"/>
+          <w:szCs w:val="18"/>
+        </w:rPr>
+        <w:t xml:space="preserve"> </w:t>
+      </w:r>
+      <w:r>
+        <w:rPr>
+          <w:rFonts w:ascii="Consolas" w:eastAsia="Consolas" w:hAnsi="Consolas" w:cs="Consolas"/>
+          <w:sz w:val="18"/>
+          <w:szCs w:val="18"/>
+        </w:rPr>
+        <w:t>쿠키</w:t>
+      </w:r>
+      <w:r>
+        <w:rPr>
+          <w:rFonts w:ascii="Consolas" w:eastAsia="Consolas" w:hAnsi="Consolas" w:cs="Consolas"/>
+          <w:sz w:val="18"/>
+          <w:szCs w:val="18"/>
+        </w:rPr>
+        <w:t xml:space="preserve"> + _csrf </w:t>
+      </w:r>
+      <w:r>
+        <w:rPr>
+          <w:rFonts w:ascii="Consolas" w:eastAsia="Consolas" w:hAnsi="Consolas" w:cs="Consolas"/>
+          <w:sz w:val="18"/>
+          <w:szCs w:val="18"/>
+        </w:rPr>
+        <w:t>토큰</w:t>
+      </w:r>
+      <w:r>
+        <w:rPr>
+          <w:rFonts w:ascii="Consolas" w:eastAsia="Consolas" w:hAnsi="Consolas" w:cs="Consolas"/>
+          <w:sz w:val="18"/>
+          <w:szCs w:val="18"/>
+        </w:rPr>
+        <w:t xml:space="preserve"> </w:t>
+      </w:r>
+      <w:r>
+        <w:rPr>
+          <w:rFonts w:ascii="Consolas" w:eastAsia="Consolas" w:hAnsi="Consolas" w:cs="Consolas"/>
+          <w:sz w:val="18"/>
+          <w:szCs w:val="18"/>
+        </w:rPr>
+        <w:t>획득</w:t>
       </w:r>
     </w:p>
     <w:p>
@@ -2494,7 +2845,95 @@
           <w:sz w:val="18"/>
           <w:szCs w:val="18"/>
         </w:rPr>
-        <w:t># 2) 같은 쿠키(세션)로 로그인 시도</w:t>
+        <w:t xml:space="preserve"># 2) </w:t>
+      </w:r>
+      <w:r>
+        <w:rPr>
+          <w:rFonts w:ascii="Consolas" w:eastAsia="Consolas" w:hAnsi="Consolas" w:cs="Consolas"/>
+          <w:sz w:val="18"/>
+          <w:szCs w:val="18"/>
+        </w:rPr>
+        <w:t>같은</w:t>
+      </w:r>
+      <w:r>
+        <w:rPr>
+          <w:rFonts w:ascii="Consolas" w:eastAsia="Consolas" w:hAnsi="Consolas" w:cs="Consolas"/>
+          <w:sz w:val="18"/>
+          <w:szCs w:val="18"/>
+        </w:rPr>
+        <w:t xml:space="preserve"> </w:t>
+      </w:r>
+      <w:r>
+        <w:rPr>
+          <w:rFonts w:ascii="Consolas" w:eastAsia="Consolas" w:hAnsi="Consolas" w:cs="Consolas"/>
+          <w:sz w:val="18"/>
+          <w:szCs w:val="18"/>
+        </w:rPr>
+        <w:t>쿠키</w:t>
+      </w:r>
+      <w:r>
+        <w:rPr>
+          <w:rFonts w:ascii="Consolas" w:eastAsia="Consolas" w:hAnsi="Consolas" w:cs="Consolas"/>
+          <w:sz w:val="18"/>
+          <w:szCs w:val="18"/>
+        </w:rPr>
+        <w:t>(</w:t>
+      </w:r>
+      <w:r>
+        <w:rPr>
+          <w:rFonts w:ascii="Consolas" w:eastAsia="Consolas" w:hAnsi="Consolas" w:cs="Consolas"/>
+          <w:sz w:val="18"/>
+          <w:szCs w:val="18"/>
+        </w:rPr>
+        <w:t>세션</w:t>
+      </w:r>
+      <w:r>
+        <w:rPr>
+          <w:rFonts w:ascii="Consolas" w:eastAsia="Consolas" w:hAnsi="Consolas" w:cs="Consolas"/>
+          <w:sz w:val="18"/>
+          <w:szCs w:val="18"/>
+        </w:rPr>
+        <w:t>)</w:t>
+      </w:r>
+      <w:r>
+        <w:rPr>
+          <w:rFonts w:ascii="Consolas" w:eastAsia="Consolas" w:hAnsi="Consolas" w:cs="Consolas"/>
+          <w:sz w:val="18"/>
+          <w:szCs w:val="18"/>
+        </w:rPr>
+        <w:t>로</w:t>
+      </w:r>
+      <w:r>
+        <w:rPr>
+          <w:rFonts w:ascii="Consolas" w:eastAsia="Consolas" w:hAnsi="Consolas" w:cs="Consolas"/>
+          <w:sz w:val="18"/>
+          <w:szCs w:val="18"/>
+        </w:rPr>
+        <w:t xml:space="preserve"> </w:t>
+      </w:r>
+      <w:r>
+        <w:rPr>
+          <w:rFonts w:ascii="Consolas" w:eastAsia="Consolas" w:hAnsi="Consolas" w:cs="Consolas"/>
+          <w:sz w:val="18"/>
+          <w:szCs w:val="18"/>
+        </w:rPr>
+        <w:t>로그인</w:t>
+      </w:r>
+      <w:r>
+        <w:rPr>
+          <w:rFonts w:ascii="Consolas" w:eastAsia="Consolas" w:hAnsi="Consolas" w:cs="Consolas"/>
+          <w:sz w:val="18"/>
+          <w:szCs w:val="18"/>
+        </w:rPr>
+        <w:t xml:space="preserve"> </w:t>
+      </w:r>
+      <w:r>
+        <w:rPr>
+          <w:rFonts w:ascii="Consolas" w:eastAsia="Consolas" w:hAnsi="Consolas" w:cs="Consolas"/>
+          <w:sz w:val="18"/>
+          <w:szCs w:val="18"/>
+        </w:rPr>
+        <w:t>시도</w:t>
       </w:r>
     </w:p>
     <w:p>
@@ -2510,7 +2949,15 @@
           <w:sz w:val="18"/>
           <w:szCs w:val="18"/>
         </w:rPr>
-        <w:t>curl -s -b "$JAR" -c "$JAR" -X POST "$B/login-process" \</w:t>
+        <w:t xml:space="preserve">curl -s -b "$JAR" -c </w:t>
+      </w:r>
+      <w:r>
+        <w:rPr>
+          <w:rFonts w:ascii="Consolas" w:eastAsia="Consolas" w:hAnsi="Consolas" w:cs="Consolas"/>
+          <w:sz w:val="18"/>
+          <w:szCs w:val="18"/>
+        </w:rPr>
+        <w:t>"$JAR" -X POST "$B/login-process" \</w:t>
       </w:r>
     </w:p>
     <w:p>
@@ -2591,7 +3038,268 @@
         <w:t xml:space="preserve">JAR=$(mktemp) — </w:t>
       </w:r>
       <w:r>
-        <w:t xml:space="preserve">curl의 쿠키 저장소로 쓸 임시 파일을 하나 만든다. -c "$JAR"(GET /login)로 세션 쿠키(JSESSIONID)를 그 파일에 저장해두고, -b "$JAR"(POST /login-process)로 같은 요청에 다시 실어 보낸다 — 이게 없으면 두 호출이 서로 다른 세션으로 취급돼 토큰이 안 맞는다. 매번 새 임시 파일을 쓰므로 반복 실행해도 이전 세션과 섞이지 않는다.</w:t>
+        <w:t>curl</w:t>
+      </w:r>
+      <w:r>
+        <w:t>의</w:t>
+      </w:r>
+      <w:r>
+        <w:t xml:space="preserve"> </w:t>
+      </w:r>
+      <w:r>
+        <w:t>쿠키</w:t>
+      </w:r>
+      <w:r>
+        <w:t xml:space="preserve"> </w:t>
+      </w:r>
+      <w:r>
+        <w:t>저장소로</w:t>
+      </w:r>
+      <w:r>
+        <w:t xml:space="preserve"> </w:t>
+      </w:r>
+      <w:r>
+        <w:t>쓸</w:t>
+      </w:r>
+      <w:r>
+        <w:t xml:space="preserve"> </w:t>
+      </w:r>
+      <w:r>
+        <w:t>임시</w:t>
+      </w:r>
+      <w:r>
+        <w:t xml:space="preserve"> </w:t>
+      </w:r>
+      <w:r>
+        <w:t>파일을</w:t>
+      </w:r>
+      <w:r>
+        <w:t xml:space="preserve"> </w:t>
+      </w:r>
+      <w:r>
+        <w:t>하나</w:t>
+      </w:r>
+      <w:r>
+        <w:t xml:space="preserve"> </w:t>
+      </w:r>
+      <w:r>
+        <w:t>만든다</w:t>
+      </w:r>
+      <w:r>
+        <w:t>. -c "$JAR</w:t>
+      </w:r>
+      <w:r>
+        <w:t>"(GET /login)</w:t>
+      </w:r>
+      <w:r>
+        <w:t>로</w:t>
+      </w:r>
+      <w:r>
+        <w:t xml:space="preserve"> </w:t>
+      </w:r>
+      <w:r>
+        <w:t>세션</w:t>
+      </w:r>
+      <w:r>
+        <w:t xml:space="preserve"> </w:t>
+      </w:r>
+      <w:r>
+        <w:t>쿠키</w:t>
+      </w:r>
+      <w:r>
+        <w:t>(JSESSIONID)</w:t>
+      </w:r>
+      <w:r>
+        <w:t>를</w:t>
+      </w:r>
+      <w:r>
+        <w:t xml:space="preserve"> </w:t>
+      </w:r>
+      <w:r>
+        <w:t>그</w:t>
+      </w:r>
+      <w:r>
+        <w:t xml:space="preserve"> </w:t>
+      </w:r>
+      <w:r>
+        <w:t>파일에</w:t>
+      </w:r>
+      <w:r>
+        <w:t xml:space="preserve"> </w:t>
+      </w:r>
+      <w:r>
+        <w:t>저장해두고</w:t>
+      </w:r>
+      <w:r>
+        <w:t>, -b "$JAR"(POST /login-process)</w:t>
+      </w:r>
+      <w:r>
+        <w:t>로</w:t>
+      </w:r>
+      <w:r>
+        <w:t xml:space="preserve"> </w:t>
+      </w:r>
+      <w:r>
+        <w:t>같은</w:t>
+      </w:r>
+      <w:r>
+        <w:t xml:space="preserve"> </w:t>
+      </w:r>
+      <w:r>
+        <w:t>요청에</w:t>
+      </w:r>
+      <w:r>
+        <w:t xml:space="preserve"> </w:t>
+      </w:r>
+      <w:r>
+        <w:t>다시</w:t>
+      </w:r>
+      <w:r>
+        <w:t xml:space="preserve"> </w:t>
+      </w:r>
+      <w:r>
+        <w:t>실어</w:t>
+      </w:r>
+      <w:r>
+        <w:t xml:space="preserve"> </w:t>
+      </w:r>
+      <w:r>
+        <w:t>보낸다</w:t>
+      </w:r>
+      <w:r>
+        <w:t xml:space="preserve"> — </w:t>
+      </w:r>
+      <w:r>
+        <w:t>이게</w:t>
+      </w:r>
+      <w:r>
+        <w:t xml:space="preserve"> </w:t>
+      </w:r>
+      <w:r>
+        <w:t>없으면</w:t>
+      </w:r>
+      <w:r>
+        <w:t xml:space="preserve"> </w:t>
+      </w:r>
+      <w:r>
+        <w:t>두</w:t>
+      </w:r>
+      <w:r>
+        <w:t xml:space="preserve"> </w:t>
+      </w:r>
+      <w:r>
+        <w:t>호출이</w:t>
+      </w:r>
+      <w:r>
+        <w:t xml:space="preserve"> </w:t>
+      </w:r>
+      <w:r>
+        <w:t>서로</w:t>
+      </w:r>
+      <w:r>
+        <w:t xml:space="preserve"> </w:t>
+      </w:r>
+      <w:r>
+        <w:t>다른</w:t>
+      </w:r>
+      <w:r>
+        <w:t xml:space="preserve"> </w:t>
+      </w:r>
+      <w:r>
+        <w:t>세션으로</w:t>
+      </w:r>
+      <w:r>
+        <w:t xml:space="preserve"> </w:t>
+      </w:r>
+      <w:r>
+        <w:t>취급돼</w:t>
+      </w:r>
+      <w:r>
+        <w:t xml:space="preserve"> </w:t>
+      </w:r>
+      <w:r>
+        <w:t>토큰이</w:t>
+      </w:r>
+      <w:r>
+        <w:t xml:space="preserve"> </w:t>
+      </w:r>
+      <w:r>
+        <w:t>안</w:t>
+      </w:r>
+      <w:r>
+        <w:t xml:space="preserve"> </w:t>
+      </w:r>
+      <w:r>
+        <w:t>맞는다</w:t>
+      </w:r>
+      <w:r>
+        <w:t xml:space="preserve">. </w:t>
+      </w:r>
+      <w:r>
+        <w:t>매번</w:t>
+      </w:r>
+      <w:r>
+        <w:t xml:space="preserve"> </w:t>
+      </w:r>
+      <w:r>
+        <w:t>새</w:t>
+      </w:r>
+      <w:r>
+        <w:t xml:space="preserve"> </w:t>
+      </w:r>
+      <w:r>
+        <w:t>임시</w:t>
+      </w:r>
+      <w:r>
+        <w:t xml:space="preserve"> </w:t>
+      </w:r>
+      <w:r>
+        <w:t>파일을</w:t>
+      </w:r>
+      <w:r>
+        <w:t xml:space="preserve"> </w:t>
+      </w:r>
+      <w:r>
+        <w:t>쓰므로</w:t>
+      </w:r>
+      <w:r>
+        <w:t xml:space="preserve"> </w:t>
+      </w:r>
+      <w:r>
+        <w:t>반복</w:t>
+      </w:r>
+      <w:r>
+        <w:t xml:space="preserve"> </w:t>
+      </w:r>
+      <w:r>
+        <w:t>실행해도</w:t>
+      </w:r>
+      <w:r>
+        <w:t xml:space="preserve"> </w:t>
+      </w:r>
+      <w:r>
+        <w:t>이전</w:t>
+      </w:r>
+      <w:r>
+        <w:t xml:space="preserve"> </w:t>
+      </w:r>
+      <w:r>
+        <w:t>세션과</w:t>
+      </w:r>
+      <w:r>
+        <w:t xml:space="preserve"> </w:t>
+      </w:r>
+      <w:r>
+        <w:t>섞이지</w:t>
+      </w:r>
+      <w:r>
+        <w:t xml:space="preserve"> </w:t>
+      </w:r>
+      <w:r>
+        <w:t>않는다</w:t>
+      </w:r>
+      <w:r>
+        <w:t>.</w:t>
       </w:r>
     </w:p>
     <w:p>
@@ -2607,7 +3315,40 @@
         <w:t xml:space="preserve">CSRF=$(echo "$LOGIN_PAGE" | grep -o ... | sed ...) — </w:t>
       </w:r>
       <w:r>
-        <w:t xml:space="preserve">로그인 페이지 HTML에서 토큰 값만 뽑아낸다.</w:t>
+        <w:t>로그인</w:t>
+      </w:r>
+      <w:r>
+        <w:t xml:space="preserve"> </w:t>
+      </w:r>
+      <w:r>
+        <w:t>페이지</w:t>
+      </w:r>
+      <w:r>
+        <w:t xml:space="preserve"> HTML</w:t>
+      </w:r>
+      <w:r>
+        <w:t>에서</w:t>
+      </w:r>
+      <w:r>
+        <w:t xml:space="preserve"> </w:t>
+      </w:r>
+      <w:r>
+        <w:t>토큰</w:t>
+      </w:r>
+      <w:r>
+        <w:t xml:space="preserve"> </w:t>
+      </w:r>
+      <w:r>
+        <w:t>값만</w:t>
+      </w:r>
+      <w:r>
+        <w:t xml:space="preserve"> </w:t>
+      </w:r>
+      <w:r>
+        <w:t>뽑아낸다</w:t>
+      </w:r>
+      <w:r>
+        <w:t>.</w:t>
       </w:r>
     </w:p>
     <w:p>
@@ -2627,7 +3368,73 @@
         <w:t>grep -o 'name="_csrf" value="[^"]*"'</w:t>
       </w:r>
       <w:r>
-        <w:t xml:space="preserve"> : 페이지 전체에서 name="_csrf" value="실제토큰값" 형태로 일치하는 부분만 추출한다(-o는 매치된 부분만 출력)</w:t>
+        <w:t xml:space="preserve"> : </w:t>
+      </w:r>
+      <w:r>
+        <w:t>페이지</w:t>
+      </w:r>
+      <w:r>
+        <w:t xml:space="preserve"> </w:t>
+      </w:r>
+      <w:r>
+        <w:t>전체에서</w:t>
+      </w:r>
+      <w:r>
+        <w:t xml:space="preserve"> name="_csrf" value="</w:t>
+      </w:r>
+      <w:r>
+        <w:t>실제토큰값</w:t>
+      </w:r>
+      <w:r>
+        <w:t xml:space="preserve">" </w:t>
+      </w:r>
+      <w:r>
+        <w:t>형태로</w:t>
+      </w:r>
+      <w:r>
+        <w:t xml:space="preserve"> </w:t>
+      </w:r>
+      <w:r>
+        <w:t>일치하는</w:t>
+      </w:r>
+      <w:r>
+        <w:t xml:space="preserve"> </w:t>
+      </w:r>
+      <w:r>
+        <w:t>부분만</w:t>
+      </w:r>
+      <w:r>
+        <w:t xml:space="preserve"> </w:t>
+      </w:r>
+      <w:r>
+        <w:t>추출한다</w:t>
+      </w:r>
+      <w:r>
+        <w:t>(-o</w:t>
+      </w:r>
+      <w:r>
+        <w:t>는</w:t>
+      </w:r>
+      <w:r>
+        <w:t xml:space="preserve"> </w:t>
+      </w:r>
+      <w:r>
+        <w:t>매치된</w:t>
+      </w:r>
+      <w:r>
+        <w:t xml:space="preserve"> </w:t>
+      </w:r>
+      <w:r>
+        <w:t>부분만</w:t>
+      </w:r>
+      <w:r>
+        <w:t xml:space="preserve"> </w:t>
+      </w:r>
+      <w:r>
+        <w:t>출력</w:t>
+      </w:r>
+      <w:r>
+        <w:t>)</w:t>
       </w:r>
     </w:p>
     <w:p>
@@ -2647,7 +3454,94 @@
         <w:t>sed 's/.*value="\([^"]*\)".*/\1/'</w:t>
       </w:r>
       <w:r>
-        <w:t xml:space="preserve"> : 그 문자열에서 value="와 뒤따르는 닫는 " 사이의 값만 캡처(\(...\))해 나머지는 버리고 그 값(\1)으로 치환한다</w:t>
+        <w:t xml:space="preserve"> : </w:t>
+      </w:r>
+      <w:r>
+        <w:t>그</w:t>
+      </w:r>
+      <w:r>
+        <w:t xml:space="preserve"> </w:t>
+      </w:r>
+      <w:r>
+        <w:t>문자열에서</w:t>
+      </w:r>
+      <w:r>
+        <w:t xml:space="preserve"> value="</w:t>
+      </w:r>
+      <w:r>
+        <w:t>와</w:t>
+      </w:r>
+      <w:r>
+        <w:t xml:space="preserve"> </w:t>
+      </w:r>
+      <w:r>
+        <w:t>뒤따르는</w:t>
+      </w:r>
+      <w:r>
+        <w:t xml:space="preserve"> </w:t>
+      </w:r>
+      <w:r>
+        <w:t>닫는</w:t>
+      </w:r>
+      <w:r>
+        <w:t xml:space="preserve"> " </w:t>
+      </w:r>
+      <w:r>
+        <w:t>사이의</w:t>
+      </w:r>
+      <w:r>
+        <w:t xml:space="preserve"> </w:t>
+      </w:r>
+      <w:r>
+        <w:t>값만</w:t>
+      </w:r>
+      <w:r>
+        <w:t xml:space="preserve"> </w:t>
+      </w:r>
+      <w:r>
+        <w:t>캡처</w:t>
+      </w:r>
+      <w:r>
+        <w:t>(\(...\))</w:t>
+      </w:r>
+      <w:r>
+        <w:t>해</w:t>
+      </w:r>
+      <w:r>
+        <w:t xml:space="preserve"> </w:t>
+      </w:r>
+      <w:r>
+        <w:t>나머지는</w:t>
+      </w:r>
+      <w:r>
+        <w:t xml:space="preserve"> </w:t>
+      </w:r>
+      <w:r>
+        <w:t>버리고</w:t>
+      </w:r>
+      <w:r>
+        <w:t xml:space="preserve"> </w:t>
+      </w:r>
+      <w:r>
+        <w:t>그</w:t>
+      </w:r>
+      <w:r>
+        <w:t xml:space="preserve"> </w:t>
+      </w:r>
+      <w:r>
+        <w:t>값</w:t>
+      </w:r>
+      <w:r>
+        <w:t>(\1)</w:t>
+      </w:r>
+      <w:r>
+        <w:t>으로</w:t>
+      </w:r>
+      <w:r>
+        <w:t xml:space="preserve"> </w:t>
+      </w:r>
+      <w:r>
+        <w:t>치환한다</w:t>
       </w:r>
     </w:p>
     <w:p>
@@ -2660,26 +3554,21 @@
           <w:bCs/>
           <w:color w:val="1F3864"/>
         </w:rPr>
-        <w:t xml:space="preserve">성공 — </w:t>
-      </w:r>
-      <w:r>
-        <w:t xml:space="preserve">admin@aa.com / pwd1 : 302 → Location: /users/index</w:t>
-      </w:r>
-    </w:p>
-    <w:p>
-      <w:pPr>
-        <w:spacing w:after="90" w:line="272" w:lineRule="auto"/>
-      </w:pPr>
+        <w:t>성공</w:t>
+      </w:r>
       <w:r>
         <w:rPr>
           <w:b/>
           <w:bCs/>
           <w:color w:val="1F3864"/>
         </w:rPr>
-        <w:t xml:space="preserve">실패 — </w:t>
-      </w:r>
-      <w:r>
-        <w:t xml:space="preserve">user@aa.com / 틀린 비밀번호 : 302 → Location: /login?error</w:t>
+        <w:t xml:space="preserve"> — </w:t>
+      </w:r>
+      <w:r>
+        <w:t>admin@aa.com / pwd1 : 302 → Lo</w:t>
+      </w:r>
+      <w:r>
+        <w:t>cation: /users/index</w:t>
       </w:r>
     </w:p>
     <w:p>
@@ -2687,7 +3576,245 @@
         <w:spacing w:after="90" w:line="272" w:lineRule="auto"/>
       </w:pPr>
       <w:r>
-        <w:t xml:space="preserve">두 경우 모두 403이 아니라 302가 나온다는 점이 중요하다 — CSRF 토큰 검증은 통과했고, 그 뒤 아이디·비밀번호 검증 결과에 따라 성공/실패 리다이렉트만 갈리는 것이다. 토큰 자체가 빠지거나 틀리면 이 단계까지 가지도 못하고 403으로 막힌다.</w:t>
+        <w:rPr>
+          <w:b/>
+          <w:bCs/>
+          <w:color w:val="1F3864"/>
+        </w:rPr>
+        <w:t>실패</w:t>
+      </w:r>
+      <w:r>
+        <w:rPr>
+          <w:b/>
+          <w:bCs/>
+          <w:color w:val="1F3864"/>
+        </w:rPr>
+        <w:t xml:space="preserve"> — </w:t>
+      </w:r>
+      <w:r>
+        <w:t xml:space="preserve">user@aa.com / </w:t>
+      </w:r>
+      <w:r>
+        <w:t>틀린</w:t>
+      </w:r>
+      <w:r>
+        <w:t xml:space="preserve"> </w:t>
+      </w:r>
+      <w:r>
+        <w:t>비밀번호</w:t>
+      </w:r>
+      <w:r>
+        <w:t xml:space="preserve"> : 302 → Location: /login?error</w:t>
+      </w:r>
+    </w:p>
+    <w:p>
+      <w:pPr>
+        <w:spacing w:after="90" w:line="272" w:lineRule="auto"/>
+      </w:pPr>
+      <w:r>
+        <w:lastRenderedPageBreak/>
+        <w:t>두</w:t>
+      </w:r>
+      <w:r>
+        <w:t xml:space="preserve"> </w:t>
+      </w:r>
+      <w:r>
+        <w:t>경우</w:t>
+      </w:r>
+      <w:r>
+        <w:t xml:space="preserve"> </w:t>
+      </w:r>
+      <w:r>
+        <w:t>모두</w:t>
+      </w:r>
+      <w:r>
+        <w:t xml:space="preserve"> 403</w:t>
+      </w:r>
+      <w:r>
+        <w:t>이</w:t>
+      </w:r>
+      <w:r>
+        <w:t xml:space="preserve"> </w:t>
+      </w:r>
+      <w:r>
+        <w:t>아니라</w:t>
+      </w:r>
+      <w:r>
+        <w:t xml:space="preserve"> 302</w:t>
+      </w:r>
+      <w:r>
+        <w:t>가</w:t>
+      </w:r>
+      <w:r>
+        <w:t xml:space="preserve"> </w:t>
+      </w:r>
+      <w:r>
+        <w:t>나온다는</w:t>
+      </w:r>
+      <w:r>
+        <w:t xml:space="preserve"> </w:t>
+      </w:r>
+      <w:r>
+        <w:t>점이</w:t>
+      </w:r>
+      <w:r>
+        <w:t xml:space="preserve"> </w:t>
+      </w:r>
+      <w:r>
+        <w:t>중요하다</w:t>
+      </w:r>
+      <w:r>
+        <w:t xml:space="preserve"> — CSRF </w:t>
+      </w:r>
+      <w:r>
+        <w:t>토큰</w:t>
+      </w:r>
+      <w:r>
+        <w:t xml:space="preserve"> </w:t>
+      </w:r>
+      <w:r>
+        <w:t>검증은</w:t>
+      </w:r>
+      <w:r>
+        <w:t xml:space="preserve"> </w:t>
+      </w:r>
+      <w:r>
+        <w:t>통과했고</w:t>
+      </w:r>
+      <w:r>
+        <w:t xml:space="preserve">, </w:t>
+      </w:r>
+      <w:r>
+        <w:t>그</w:t>
+      </w:r>
+      <w:r>
+        <w:t xml:space="preserve"> </w:t>
+      </w:r>
+      <w:r>
+        <w:t>뒤</w:t>
+      </w:r>
+      <w:r>
+        <w:t xml:space="preserve"> </w:t>
+      </w:r>
+      <w:r>
+        <w:t>아이디</w:t>
+      </w:r>
+      <w:r>
+        <w:t>·</w:t>
+      </w:r>
+      <w:r>
+        <w:t>비밀번호</w:t>
+      </w:r>
+      <w:r>
+        <w:t xml:space="preserve"> </w:t>
+      </w:r>
+      <w:r>
+        <w:t>검증</w:t>
+      </w:r>
+      <w:r>
+        <w:t xml:space="preserve"> </w:t>
+      </w:r>
+      <w:r>
+        <w:t>결과에</w:t>
+      </w:r>
+      <w:r>
+        <w:t xml:space="preserve"> </w:t>
+      </w:r>
+      <w:r>
+        <w:t>따라</w:t>
+      </w:r>
+      <w:r>
+        <w:t xml:space="preserve"> </w:t>
+      </w:r>
+      <w:r>
+        <w:t>성공</w:t>
+      </w:r>
+      <w:r>
+        <w:t>/</w:t>
+      </w:r>
+      <w:r>
+        <w:t>실패</w:t>
+      </w:r>
+      <w:r>
+        <w:t xml:space="preserve"> </w:t>
+      </w:r>
+      <w:r>
+        <w:t>리다이렉트만</w:t>
+      </w:r>
+      <w:r>
+        <w:t xml:space="preserve"> </w:t>
+      </w:r>
+      <w:r>
+        <w:t>갈리는</w:t>
+      </w:r>
+      <w:r>
+        <w:t xml:space="preserve"> </w:t>
+      </w:r>
+      <w:r>
+        <w:t>것이다</w:t>
+      </w:r>
+      <w:r>
+        <w:t xml:space="preserve">. </w:t>
+      </w:r>
+      <w:r>
+        <w:t>토큰</w:t>
+      </w:r>
+      <w:r>
+        <w:t xml:space="preserve"> </w:t>
+      </w:r>
+      <w:r>
+        <w:t>자체가</w:t>
+      </w:r>
+      <w:r>
+        <w:t xml:space="preserve"> </w:t>
+      </w:r>
+      <w:r>
+        <w:t>빠지거나</w:t>
+      </w:r>
+      <w:r>
+        <w:t xml:space="preserve"> </w:t>
+      </w:r>
+      <w:r>
+        <w:t>틀리면</w:t>
+      </w:r>
+      <w:r>
+        <w:t xml:space="preserve"> </w:t>
+      </w:r>
+      <w:r>
+        <w:t>이</w:t>
+      </w:r>
+      <w:r>
+        <w:t xml:space="preserve"> </w:t>
+      </w:r>
+      <w:r>
+        <w:t>단계까지</w:t>
+      </w:r>
+      <w:r>
+        <w:t xml:space="preserve"> </w:t>
+      </w:r>
+      <w:r>
+        <w:t>가지도</w:t>
+      </w:r>
+      <w:r>
+        <w:t xml:space="preserve"> </w:t>
+      </w:r>
+      <w:r>
+        <w:t>못하고</w:t>
+      </w:r>
+      <w:r>
+        <w:t xml:space="preserve"> 403</w:t>
+      </w:r>
+      <w:r>
+        <w:t>으로</w:t>
+      </w:r>
+      <w:r>
+        <w:t xml:space="preserve"> </w:t>
+      </w:r>
+      <w:r>
+        <w:t>막힌다</w:t>
+      </w:r>
+      <w:r>
+        <w:t>.</w:t>
       </w:r>
     </w:p>
     <w:p>
@@ -2701,7 +3828,71 @@
           <w:bCs/>
           <w:color w:val="2E5496"/>
         </w:rPr>
-        <w:t xml:space="preserve">로그인 이후에도 요청마다 CSRF 토큰이 필요하다</w:t>
+        <w:t>로그인</w:t>
+      </w:r>
+      <w:r>
+        <w:rPr>
+          <w:b/>
+          <w:bCs/>
+          <w:color w:val="2E5496"/>
+        </w:rPr>
+        <w:t xml:space="preserve"> </w:t>
+      </w:r>
+      <w:r>
+        <w:rPr>
+          <w:b/>
+          <w:bCs/>
+          <w:color w:val="2E5496"/>
+        </w:rPr>
+        <w:t>이후에도</w:t>
+      </w:r>
+      <w:r>
+        <w:rPr>
+          <w:b/>
+          <w:bCs/>
+          <w:color w:val="2E5496"/>
+        </w:rPr>
+        <w:t xml:space="preserve"> </w:t>
+      </w:r>
+      <w:r>
+        <w:rPr>
+          <w:b/>
+          <w:bCs/>
+          <w:color w:val="2E5496"/>
+        </w:rPr>
+        <w:t>요청마다</w:t>
+      </w:r>
+      <w:r>
+        <w:rPr>
+          <w:b/>
+          <w:bCs/>
+          <w:color w:val="2E5496"/>
+        </w:rPr>
+        <w:t xml:space="preserve"> CSRF </w:t>
+      </w:r>
+      <w:r>
+        <w:rPr>
+          <w:b/>
+          <w:bCs/>
+          <w:color w:val="2E5496"/>
+        </w:rPr>
+        <w:t>토큰이</w:t>
+      </w:r>
+      <w:r>
+        <w:rPr>
+          <w:b/>
+          <w:bCs/>
+          <w:color w:val="2E5496"/>
+        </w:rPr>
+        <w:t xml:space="preserve"> </w:t>
+      </w:r>
+      <w:r>
+        <w:rPr>
+          <w:b/>
+          <w:bCs/>
+          <w:color w:val="2E5496"/>
+        </w:rPr>
+        <w:t>필요하다</w:t>
       </w:r>
     </w:p>
     <w:p>
@@ -2709,7 +3900,178 @@
         <w:spacing w:after="90" w:line="272" w:lineRule="auto"/>
       </w:pPr>
       <w:r>
-        <w:t xml:space="preserve">로그인에 성공해 세션이 인증된 상태가 되어도, 이후 상태를 바꾸는 요청은 각각 자신의 _csrf 토큰을 함께 보내야 한다. 인증 여부와 CSRF 토큰 검증은 별개의 단계이며, CsrfFilter는 컨트롤러가 호출되기 전에 토큰 유무부터 확인한다.</w:t>
+        <w:t>로그인에</w:t>
+      </w:r>
+      <w:r>
+        <w:t xml:space="preserve"> </w:t>
+      </w:r>
+      <w:r>
+        <w:t>성공해</w:t>
+      </w:r>
+      <w:r>
+        <w:t xml:space="preserve"> </w:t>
+      </w:r>
+      <w:r>
+        <w:t>세션이</w:t>
+      </w:r>
+      <w:r>
+        <w:t xml:space="preserve"> </w:t>
+      </w:r>
+      <w:r>
+        <w:t>인증된</w:t>
+      </w:r>
+      <w:r>
+        <w:t xml:space="preserve"> </w:t>
+      </w:r>
+      <w:r>
+        <w:t>상태가</w:t>
+      </w:r>
+      <w:r>
+        <w:t xml:space="preserve"> </w:t>
+      </w:r>
+      <w:r>
+        <w:t>되어도</w:t>
+      </w:r>
+      <w:r>
+        <w:t xml:space="preserve">, </w:t>
+      </w:r>
+      <w:r>
+        <w:t>이후</w:t>
+      </w:r>
+      <w:r>
+        <w:t xml:space="preserve"> </w:t>
+      </w:r>
+      <w:r>
+        <w:t>상태를</w:t>
+      </w:r>
+      <w:r>
+        <w:t xml:space="preserve"> </w:t>
+      </w:r>
+      <w:r>
+        <w:t>바꾸는</w:t>
+      </w:r>
+      <w:r>
+        <w:t xml:space="preserve"> </w:t>
+      </w:r>
+      <w:r>
+        <w:t>요청은</w:t>
+      </w:r>
+      <w:r>
+        <w:t xml:space="preserve"> </w:t>
+      </w:r>
+      <w:r>
+        <w:t>각각</w:t>
+      </w:r>
+      <w:r>
+        <w:t xml:space="preserve"> </w:t>
+      </w:r>
+      <w:r>
+        <w:t>자신의</w:t>
+      </w:r>
+      <w:r>
+        <w:t xml:space="preserve"> _csrf </w:t>
+      </w:r>
+      <w:r>
+        <w:t>토큰을</w:t>
+      </w:r>
+      <w:r>
+        <w:t xml:space="preserve"> </w:t>
+      </w:r>
+      <w:r>
+        <w:t>함께</w:t>
+      </w:r>
+      <w:r>
+        <w:t xml:space="preserve"> </w:t>
+      </w:r>
+      <w:r>
+        <w:t>보내야</w:t>
+      </w:r>
+      <w:r>
+        <w:t xml:space="preserve"> </w:t>
+      </w:r>
+      <w:r>
+        <w:t>한다</w:t>
+      </w:r>
+      <w:r>
+        <w:t xml:space="preserve">. </w:t>
+      </w:r>
+      <w:r>
+        <w:t>인증</w:t>
+      </w:r>
+      <w:r>
+        <w:t xml:space="preserve"> </w:t>
+      </w:r>
+      <w:r>
+        <w:t>여부와</w:t>
+      </w:r>
+      <w:r>
+        <w:t xml:space="preserve"> CSRF </w:t>
+      </w:r>
+      <w:r>
+        <w:t>토큰</w:t>
+      </w:r>
+      <w:r>
+        <w:t xml:space="preserve"> </w:t>
+      </w:r>
+      <w:r>
+        <w:t>검증은</w:t>
+      </w:r>
+      <w:r>
+        <w:t xml:space="preserve"> </w:t>
+      </w:r>
+      <w:r>
+        <w:t>별개의</w:t>
+      </w:r>
+      <w:r>
+        <w:t xml:space="preserve"> </w:t>
+      </w:r>
+      <w:r>
+        <w:t>단계이며</w:t>
+      </w:r>
+      <w:r>
+        <w:t>, CsrfFilter</w:t>
+      </w:r>
+      <w:r>
+        <w:t>는</w:t>
+      </w:r>
+      <w:r>
+        <w:t xml:space="preserve"> </w:t>
+      </w:r>
+      <w:r>
+        <w:t>컨트롤러가</w:t>
+      </w:r>
+      <w:r>
+        <w:t xml:space="preserve"> </w:t>
+      </w:r>
+      <w:r>
+        <w:t>호출되기</w:t>
+      </w:r>
+      <w:r>
+        <w:t xml:space="preserve"> </w:t>
+      </w:r>
+      <w:r>
+        <w:t>전에</w:t>
+      </w:r>
+      <w:r>
+        <w:t xml:space="preserve"> </w:t>
+      </w:r>
+      <w:r>
+        <w:t>토큰</w:t>
+      </w:r>
+      <w:r>
+        <w:t xml:space="preserve"> </w:t>
+      </w:r>
+      <w:r>
+        <w:t>유무부터</w:t>
+      </w:r>
+      <w:r>
+        <w:t xml:space="preserve"> </w:t>
+      </w:r>
+      <w:r>
+        <w:t>확인한다</w:t>
+      </w:r>
+      <w:r>
+        <w:t>.</w:t>
       </w:r>
     </w:p>
     <w:p>
@@ -2726,7 +4088,143 @@
           <w:sz w:val="18"/>
           <w:szCs w:val="18"/>
         </w:rPr>
-        <w:t># 로그인된 세션(쿠키 O)으로, CSRF 토큰 없이 비밀번호 변경 시도</w:t>
+        <w:t xml:space="preserve"># </w:t>
+      </w:r>
+      <w:r>
+        <w:rPr>
+          <w:rFonts w:ascii="Consolas" w:eastAsia="Consolas" w:hAnsi="Consolas" w:cs="Consolas"/>
+          <w:sz w:val="18"/>
+          <w:szCs w:val="18"/>
+        </w:rPr>
+        <w:t>로그인된</w:t>
+      </w:r>
+      <w:r>
+        <w:rPr>
+          <w:rFonts w:ascii="Consolas" w:eastAsia="Consolas" w:hAnsi="Consolas" w:cs="Consolas"/>
+          <w:sz w:val="18"/>
+          <w:szCs w:val="18"/>
+        </w:rPr>
+        <w:t xml:space="preserve"> </w:t>
+      </w:r>
+      <w:r>
+        <w:rPr>
+          <w:rFonts w:ascii="Consolas" w:eastAsia="Consolas" w:hAnsi="Consolas" w:cs="Consolas"/>
+          <w:sz w:val="18"/>
+          <w:szCs w:val="18"/>
+        </w:rPr>
+        <w:t>세션</w:t>
+      </w:r>
+      <w:r>
+        <w:rPr>
+          <w:rFonts w:ascii="Consolas" w:eastAsia="Consolas" w:hAnsi="Consolas" w:cs="Consolas"/>
+          <w:sz w:val="18"/>
+          <w:szCs w:val="18"/>
+        </w:rPr>
+        <w:t>(</w:t>
+      </w:r>
+      <w:r>
+        <w:rPr>
+          <w:rFonts w:ascii="Consolas" w:eastAsia="Consolas" w:hAnsi="Consolas" w:cs="Consolas"/>
+          <w:sz w:val="18"/>
+          <w:szCs w:val="18"/>
+        </w:rPr>
+        <w:t>쿠키</w:t>
+      </w:r>
+      <w:r>
+        <w:rPr>
+          <w:rFonts w:ascii="Consolas" w:eastAsia="Consolas" w:hAnsi="Consolas" w:cs="Consolas"/>
+          <w:sz w:val="18"/>
+          <w:szCs w:val="18"/>
+        </w:rPr>
+        <w:t xml:space="preserve"> O)</w:t>
+      </w:r>
+      <w:r>
+        <w:rPr>
+          <w:rFonts w:ascii="Consolas" w:eastAsia="Consolas" w:hAnsi="Consolas" w:cs="Consolas"/>
+          <w:sz w:val="18"/>
+          <w:szCs w:val="18"/>
+        </w:rPr>
+        <w:t>으로</w:t>
+      </w:r>
+      <w:r>
+        <w:rPr>
+          <w:rFonts w:ascii="Consolas" w:eastAsia="Consolas" w:hAnsi="Consolas" w:cs="Consolas"/>
+          <w:sz w:val="18"/>
+          <w:szCs w:val="18"/>
+        </w:rPr>
+        <w:t xml:space="preserve">, CSRF </w:t>
+      </w:r>
+      <w:r>
+        <w:rPr>
+          <w:rFonts w:ascii="Consolas" w:eastAsia="Consolas" w:hAnsi="Consolas" w:cs="Consolas"/>
+          <w:sz w:val="18"/>
+          <w:szCs w:val="18"/>
+        </w:rPr>
+        <w:t>토큰</w:t>
+      </w:r>
+      <w:r>
+        <w:rPr>
+          <w:rFonts w:ascii="Consolas" w:eastAsia="Consolas" w:hAnsi="Consolas" w:cs="Consolas"/>
+          <w:sz w:val="18"/>
+          <w:szCs w:val="18"/>
+        </w:rPr>
+        <w:t xml:space="preserve"> </w:t>
+      </w:r>
+      <w:r>
+        <w:rPr>
+          <w:rFonts w:ascii="Consolas" w:eastAsia="Consolas" w:hAnsi="Consolas" w:cs="Consolas"/>
+          <w:sz w:val="18"/>
+          <w:szCs w:val="18"/>
+        </w:rPr>
+        <w:t>없이</w:t>
+      </w:r>
+      <w:r>
+        <w:rPr>
+          <w:rFonts w:ascii="Consolas" w:eastAsia="Consolas" w:hAnsi="Consolas" w:cs="Consolas"/>
+          <w:sz w:val="18"/>
+          <w:szCs w:val="18"/>
+        </w:rPr>
+        <w:t xml:space="preserve"> </w:t>
+      </w:r>
+      <w:r>
+        <w:rPr>
+          <w:rFonts w:ascii="Consolas" w:eastAsia="Consolas" w:hAnsi="Consolas" w:cs="Consolas"/>
+          <w:sz w:val="18"/>
+          <w:szCs w:val="18"/>
+        </w:rPr>
+        <w:t>비밀번호</w:t>
+      </w:r>
+      <w:r>
+        <w:rPr>
+          <w:rFonts w:ascii="Consolas" w:eastAsia="Consolas" w:hAnsi="Consolas" w:cs="Consolas"/>
+          <w:sz w:val="18"/>
+          <w:szCs w:val="18"/>
+        </w:rPr>
+        <w:t xml:space="preserve"> </w:t>
+      </w:r>
+      <w:r>
+        <w:rPr>
+          <w:rFonts w:ascii="Consolas" w:eastAsia="Consolas" w:hAnsi="Consolas" w:cs="Consolas"/>
+          <w:sz w:val="18"/>
+          <w:szCs w:val="18"/>
+        </w:rPr>
+        <w:t>변경</w:t>
+      </w:r>
+      <w:r>
+        <w:rPr>
+          <w:rFonts w:ascii="Consolas" w:eastAsia="Consolas" w:hAnsi="Consolas" w:cs="Consolas"/>
+          <w:sz w:val="18"/>
+          <w:szCs w:val="18"/>
+        </w:rPr>
+        <w:t xml:space="preserve"> </w:t>
+      </w:r>
+      <w:r>
+        <w:rPr>
+          <w:rFonts w:ascii="Consolas" w:eastAsia="Consolas" w:hAnsi="Consolas" w:cs="Consolas"/>
+          <w:sz w:val="18"/>
+          <w:szCs w:val="18"/>
+        </w:rPr>
+        <w:t>시도</w:t>
       </w:r>
     </w:p>
     <w:p>
@@ -2743,7 +4241,15 @@
           <w:sz w:val="18"/>
           <w:szCs w:val="18"/>
         </w:rPr>
-        <w:t>curl -s -b "$JAR" -X POST "$B/users/change-password" -d "newPassword=attacker_pw_1234"</w:t>
+        <w:t xml:space="preserve">curl -s -b "$JAR" -X POST "$B/users/change-password" -d </w:t>
+      </w:r>
+      <w:r>
+        <w:rPr>
+          <w:rFonts w:ascii="Consolas" w:eastAsia="Consolas" w:hAnsi="Consolas" w:cs="Consolas"/>
+          <w:sz w:val="18"/>
+          <w:szCs w:val="18"/>
+        </w:rPr>
+        <w:t>"newPassword=attacker_pw_1234"</w:t>
       </w:r>
     </w:p>
     <w:p>
@@ -2751,7 +4257,46 @@
         <w:spacing w:after="90" w:line="272" w:lineRule="auto"/>
       </w:pPr>
       <w:r>
-        <w:t xml:space="preserve">결과(검증됨): 403 Forbidden — 세션이 유효해도 토큰이 없으면 차단된다.</w:t>
+        <w:t>결과</w:t>
+      </w:r>
+      <w:r>
+        <w:t>(</w:t>
+      </w:r>
+      <w:r>
+        <w:t>검증됨</w:t>
+      </w:r>
+      <w:r>
+        <w:t xml:space="preserve">): 403 Forbidden — </w:t>
+      </w:r>
+      <w:r>
+        <w:t>세션이</w:t>
+      </w:r>
+      <w:r>
+        <w:t xml:space="preserve"> </w:t>
+      </w:r>
+      <w:r>
+        <w:t>유효해도</w:t>
+      </w:r>
+      <w:r>
+        <w:t xml:space="preserve"> </w:t>
+      </w:r>
+      <w:r>
+        <w:t>토큰이</w:t>
+      </w:r>
+      <w:r>
+        <w:t xml:space="preserve"> </w:t>
+      </w:r>
+      <w:r>
+        <w:t>없으면</w:t>
+      </w:r>
+      <w:r>
+        <w:t xml:space="preserve"> </w:t>
+      </w:r>
+      <w:r>
+        <w:t>차단된다</w:t>
+      </w:r>
+      <w:r>
+        <w:t>.</w:t>
       </w:r>
     </w:p>
     <w:p>
@@ -2759,7 +4304,118 @@
         <w:spacing w:after="90" w:line="272" w:lineRule="auto"/>
       </w:pPr>
       <w:r>
-        <w:t xml:space="preserve">같은 세션 안에서는 로그인 때 받은 토큰을 그대로 재사용할 수 있다(기본 설정은 세션당 토큰 1개, 요청마다 바뀌지 않음):</w:t>
+        <w:t>같은</w:t>
+      </w:r>
+      <w:r>
+        <w:t xml:space="preserve"> </w:t>
+      </w:r>
+      <w:r>
+        <w:t>세션</w:t>
+      </w:r>
+      <w:r>
+        <w:t xml:space="preserve"> </w:t>
+      </w:r>
+      <w:r>
+        <w:t>안에서는</w:t>
+      </w:r>
+      <w:r>
+        <w:t xml:space="preserve"> </w:t>
+      </w:r>
+      <w:r>
+        <w:t>로그인</w:t>
+      </w:r>
+      <w:r>
+        <w:t xml:space="preserve"> </w:t>
+      </w:r>
+      <w:r>
+        <w:t>때</w:t>
+      </w:r>
+      <w:r>
+        <w:t xml:space="preserve"> </w:t>
+      </w:r>
+      <w:r>
+        <w:t>받은</w:t>
+      </w:r>
+      <w:r>
+        <w:t xml:space="preserve"> </w:t>
+      </w:r>
+      <w:r>
+        <w:t>토큰을</w:t>
+      </w:r>
+      <w:r>
+        <w:t xml:space="preserve"> </w:t>
+      </w:r>
+      <w:r>
+        <w:t>그대로</w:t>
+      </w:r>
+      <w:r>
+        <w:t xml:space="preserve"> </w:t>
+      </w:r>
+      <w:r>
+        <w:t>재사용할</w:t>
+      </w:r>
+      <w:r>
+        <w:t xml:space="preserve"> </w:t>
+      </w:r>
+      <w:r>
+        <w:t>수</w:t>
+      </w:r>
+      <w:r>
+        <w:t xml:space="preserve"> </w:t>
+      </w:r>
+      <w:r>
+        <w:t>있다</w:t>
+      </w:r>
+      <w:r>
+        <w:t>(</w:t>
+      </w:r>
+      <w:r>
+        <w:t>기본</w:t>
+      </w:r>
+      <w:r>
+        <w:t xml:space="preserve"> </w:t>
+      </w:r>
+      <w:r>
+        <w:t>설정은</w:t>
+      </w:r>
+      <w:r>
+        <w:t xml:space="preserve"> </w:t>
+      </w:r>
+      <w:r>
+        <w:t>세션당</w:t>
+      </w:r>
+      <w:r>
+        <w:t xml:space="preserve"> </w:t>
+      </w:r>
+      <w:r>
+        <w:t>토큰</w:t>
+      </w:r>
+      <w:r>
+        <w:t xml:space="preserve"> 1</w:t>
+      </w:r>
+      <w:r>
+        <w:t>개</w:t>
+      </w:r>
+      <w:r>
+        <w:t xml:space="preserve">, </w:t>
+      </w:r>
+      <w:r>
+        <w:t>요청마다</w:t>
+      </w:r>
+      <w:r>
+        <w:t xml:space="preserve"> </w:t>
+      </w:r>
+      <w:r>
+        <w:t>바뀌지</w:t>
+      </w:r>
+      <w:r>
+        <w:t xml:space="preserve"> </w:t>
+      </w:r>
+      <w:r>
+        <w:t>않음</w:t>
+      </w:r>
+      <w:r>
+        <w:t>):</w:t>
       </w:r>
     </w:p>
     <w:p>
@@ -2809,7 +4465,15 @@
           <w:sz w:val="18"/>
           <w:szCs w:val="18"/>
         </w:rPr>
-        <w:t xml:space="preserve">  --data-urlencode "_csrf=$CSRF"</w:t>
+        <w:t xml:space="preserve">  --d</w:t>
+      </w:r>
+      <w:r>
+        <w:rPr>
+          <w:rFonts w:ascii="Consolas" w:eastAsia="Consolas" w:hAnsi="Consolas" w:cs="Consolas"/>
+          <w:sz w:val="18"/>
+          <w:szCs w:val="18"/>
+        </w:rPr>
+        <w:t>ata-urlencode "_csrf=$CSRF"</w:t>
       </w:r>
     </w:p>
     <w:p>
@@ -3384,7 +5048,18 @@
         <w:spacing w:after="80" w:line="272" w:lineRule="auto"/>
       </w:pPr>
       <w:r>
-        <w:t>Spring Security 가 RequestDataValueProcessor(CsrfRequestDataValueProcessor)를 제공하고, Thymeleaf 가 th:action 폼을 렌더링할 때 이 프로세서를 호출해 hidden _csrf 필드를 자동으로 추가한다. (thymeleaf-extras-springsecurity6 의존성이 있으면 동작</w:t>
+        <w:t>Spring Security 가 RequestDataValueProcessor(</w:t>
+      </w:r>
+      <w:hyperlink r:id="rId7" w:history="1">
+        <w:r>
+          <w:rPr>
+            <w:rStyle w:val="a5"/>
+          </w:rPr>
+          <w:t>CsrfRequestDataValueProcessor</w:t>
+        </w:r>
+      </w:hyperlink>
+      <w:r>
+        <w:t>)를 제공하고, Thymeleaf 가 th:action 폼을 렌더링할 때 이 프로세서를 호출해 hidden _csrf 필드를 자동으로 추가한다. (thymeleaf-extras-springsecurity6 의존성이 있으면 동작</w:t>
       </w:r>
       <w:r>
         <w:rPr>
@@ -3399,12 +5074,37 @@
     <w:p>
       <w:pPr>
         <w:spacing w:after="80" w:line="272" w:lineRule="auto"/>
-      </w:pPr>
-      <w:r>
+        <w:rPr>
+          <w:sz w:val="16"/>
+          <w:szCs w:val="16"/>
+        </w:rPr>
+      </w:pPr>
+    </w:p>
+    <w:p>
+      <w:pPr>
         <w:rPr>
           <w:b/>
           <w:bCs/>
         </w:rPr>
+      </w:pPr>
+      <w:r>
+        <w:rPr>
+          <w:b/>
+          <w:bCs/>
+        </w:rPr>
+        <w:br w:type="page"/>
+      </w:r>
+    </w:p>
+    <w:p>
+      <w:pPr>
+        <w:spacing w:after="80" w:line="272" w:lineRule="auto"/>
+      </w:pPr>
+      <w:r>
+        <w:rPr>
+          <w:b/>
+          <w:bCs/>
+        </w:rPr>
+        <w:lastRenderedPageBreak/>
         <w:t>렌더링 결과(브라우저가 받는 HTML):</w:t>
       </w:r>
     </w:p>
@@ -3493,7 +5193,31 @@
           <w:bCs/>
           <w:color w:val="2E5496"/>
         </w:rPr>
-        <w:t xml:space="preserve">4-3. CsrfFilter 동작 방식</w:t>
+        <w:t xml:space="preserve">4-3. CsrfFilter </w:t>
+      </w:r>
+      <w:r>
+        <w:rPr>
+          <w:b/>
+          <w:bCs/>
+          <w:color w:val="2E5496"/>
+        </w:rPr>
+        <w:t>동작</w:t>
+      </w:r>
+      <w:r>
+        <w:rPr>
+          <w:b/>
+          <w:bCs/>
+          <w:color w:val="2E5496"/>
+        </w:rPr>
+        <w:t xml:space="preserve"> </w:t>
+      </w:r>
+      <w:r>
+        <w:rPr>
+          <w:b/>
+          <w:bCs/>
+          <w:color w:val="2E5496"/>
+        </w:rPr>
+        <w:t>방식</w:t>
       </w:r>
     </w:p>
     <w:p>
@@ -3501,7 +5225,60 @@
         <w:spacing w:after="80" w:line="272" w:lineRule="auto"/>
       </w:pPr>
       <w:r>
-        <w:t xml:space="preserve">Spring Security의 CSRF 보호는 필터 체인에 등록되는 CsrfFilter(OncePerRequestFilter)가 담당한다.</w:t>
+        <w:t>Spring Security</w:t>
+      </w:r>
+      <w:r>
+        <w:t>의</w:t>
+      </w:r>
+      <w:r>
+        <w:t xml:space="preserve"> CSRF </w:t>
+      </w:r>
+      <w:r>
+        <w:t>보호는</w:t>
+      </w:r>
+      <w:r>
+        <w:t xml:space="preserve"> </w:t>
+      </w:r>
+      <w:r>
+        <w:t>필터</w:t>
+      </w:r>
+      <w:r>
+        <w:t xml:space="preserve"> </w:t>
+      </w:r>
+      <w:r>
+        <w:t>체인에</w:t>
+      </w:r>
+      <w:r>
+        <w:t xml:space="preserve"> </w:t>
+      </w:r>
+      <w:r>
+        <w:t>등록되는</w:t>
+      </w:r>
+      <w:r>
+        <w:t xml:space="preserve"> </w:t>
+      </w:r>
+      <w:hyperlink r:id="rId8" w:history="1">
+        <w:r>
+          <w:rPr>
+            <w:rStyle w:val="a5"/>
+          </w:rPr>
+          <w:t>CsrfFilter</w:t>
+        </w:r>
+      </w:hyperlink>
+      <w:r>
+        <w:t>(OncePerRequestFilter)</w:t>
+      </w:r>
+      <w:r>
+        <w:t>가</w:t>
+      </w:r>
+      <w:r>
+        <w:t xml:space="preserve"> </w:t>
+      </w:r>
+      <w:r>
+        <w:t>담당한다</w:t>
+      </w:r>
+      <w:r>
+        <w:t>.</w:t>
       </w:r>
     </w:p>
     <w:p>
@@ -3509,7 +5286,196 @@
         <w:spacing w:after="80" w:line="272" w:lineRule="auto"/>
       </w:pPr>
       <w:r>
-        <w:t xml:space="preserve">1. 요청이 들어오면 먼저 HTTP 메서드를 확인한다. GET/HEAD/TRACE/OPTIONS처럼 상태를 바꾸지 않는("안전한") 메서드는 토큰 검사 없이 그대로 통과시킨다 — 대신 세션에 토큰이 없으면 이번 요청에서 새로 발급해, 다음에 보여줄 폼에 심을 수 있게 한다.</w:t>
+        <w:t xml:space="preserve">1. </w:t>
+      </w:r>
+      <w:r>
+        <w:t>요청이</w:t>
+      </w:r>
+      <w:r>
+        <w:t xml:space="preserve"> </w:t>
+      </w:r>
+      <w:r>
+        <w:t>들어오면</w:t>
+      </w:r>
+      <w:r>
+        <w:t xml:space="preserve"> </w:t>
+      </w:r>
+      <w:r>
+        <w:t>먼저</w:t>
+      </w:r>
+      <w:r>
+        <w:t xml:space="preserve"> HTTP </w:t>
+      </w:r>
+      <w:r>
+        <w:t>메서드를</w:t>
+      </w:r>
+      <w:r>
+        <w:t xml:space="preserve"> </w:t>
+      </w:r>
+      <w:r>
+        <w:t>확인한다</w:t>
+      </w:r>
+      <w:r>
+        <w:t>. GET/HEAD/TRACE/OPTIONS</w:t>
+      </w:r>
+      <w:r>
+        <w:t>처럼</w:t>
+      </w:r>
+      <w:r>
+        <w:t xml:space="preserve"> </w:t>
+      </w:r>
+      <w:r>
+        <w:t>상태를</w:t>
+      </w:r>
+      <w:r>
+        <w:t xml:space="preserve"> </w:t>
+      </w:r>
+      <w:r>
+        <w:t>바꾸지</w:t>
+      </w:r>
+      <w:r>
+        <w:t xml:space="preserve"> </w:t>
+      </w:r>
+      <w:r>
+        <w:t>않는</w:t>
+      </w:r>
+      <w:r>
+        <w:t>("</w:t>
+      </w:r>
+      <w:r>
+        <w:t>안전한</w:t>
+      </w:r>
+      <w:r>
+        <w:t xml:space="preserve">") </w:t>
+      </w:r>
+      <w:r>
+        <w:t>메서드는</w:t>
+      </w:r>
+      <w:r>
+        <w:t xml:space="preserve"> </w:t>
+      </w:r>
+      <w:r>
+        <w:t>토큰</w:t>
+      </w:r>
+      <w:r>
+        <w:t xml:space="preserve"> </w:t>
+      </w:r>
+      <w:r>
+        <w:t>검사</w:t>
+      </w:r>
+      <w:r>
+        <w:t xml:space="preserve"> </w:t>
+      </w:r>
+      <w:r>
+        <w:t>없이</w:t>
+      </w:r>
+      <w:r>
+        <w:t xml:space="preserve"> </w:t>
+      </w:r>
+      <w:r>
+        <w:t>그대로</w:t>
+      </w:r>
+      <w:r>
+        <w:t xml:space="preserve"> </w:t>
+      </w:r>
+      <w:r>
+        <w:t>통과시킨다</w:t>
+      </w:r>
+      <w:r>
+        <w:t xml:space="preserve"> — </w:t>
+      </w:r>
+      <w:r>
+        <w:t>대신</w:t>
+      </w:r>
+      <w:r>
+        <w:t xml:space="preserve"> </w:t>
+      </w:r>
+      <w:r>
+        <w:t>세션에</w:t>
+      </w:r>
+      <w:r>
+        <w:t xml:space="preserve"> </w:t>
+      </w:r>
+      <w:r>
+        <w:t>Csrf</w:t>
+      </w:r>
+      <w:r>
+        <w:t>토큰이</w:t>
+      </w:r>
+      <w:r>
+        <w:t xml:space="preserve"> </w:t>
+      </w:r>
+      <w:r>
+        <w:t>없으면</w:t>
+      </w:r>
+      <w:r>
+        <w:t xml:space="preserve"> </w:t>
+      </w:r>
+      <w:r>
+        <w:t>이번</w:t>
+      </w:r>
+      <w:r>
+        <w:t xml:space="preserve"> </w:t>
+      </w:r>
+      <w:r>
+        <w:t>요청에서</w:t>
+      </w:r>
+      <w:r>
+        <w:t xml:space="preserve"> </w:t>
+      </w:r>
+      <w:r>
+        <w:t>새로</w:t>
+      </w:r>
+      <w:r>
+        <w:t xml:space="preserve"> </w:t>
+      </w:r>
+      <w:r>
+        <w:t>발급해</w:t>
+      </w:r>
+      <w:r>
+        <w:t xml:space="preserve">, </w:t>
+      </w:r>
+      <w:r>
+        <w:t>다음에</w:t>
+      </w:r>
+      <w:r>
+        <w:t xml:space="preserve"> </w:t>
+      </w:r>
+      <w:r>
+        <w:t>보여줄</w:t>
+      </w:r>
+      <w:r>
+        <w:t xml:space="preserve"> </w:t>
+      </w:r>
+      <w:r>
+        <w:t>폼에</w:t>
+      </w:r>
+      <w:r>
+        <w:t xml:space="preserve"> </w:t>
+      </w:r>
+      <w:r>
+        <w:t>심을</w:t>
+      </w:r>
+      <w:r>
+        <w:t xml:space="preserve"> </w:t>
+      </w:r>
+      <w:r>
+        <w:t>수</w:t>
+      </w:r>
+      <w:r>
+        <w:t xml:space="preserve"> </w:t>
+      </w:r>
+      <w:r>
+        <w:t>있게</w:t>
+      </w:r>
+      <w:r>
+        <w:t xml:space="preserve"> </w:t>
+      </w:r>
+      <w:r>
+        <w:t>한다</w:t>
+      </w:r>
+      <w:r>
+        <w:t>.</w:t>
       </w:r>
     </w:p>
     <w:p>
@@ -3517,7 +5483,79 @@
         <w:spacing w:after="80" w:line="272" w:lineRule="auto"/>
       </w:pPr>
       <w:r>
-        <w:t xml:space="preserve">2. POST/PUT/DELETE/PATCH 같은 상태 변경 메서드는 CsrfTokenRepository(기본은 세션)에 저장된 "기대 토큰"을 가져온다.</w:t>
+        <w:t xml:space="preserve">2. POST/PUT/DELETE/PATCH </w:t>
+      </w:r>
+      <w:r>
+        <w:t>같은</w:t>
+      </w:r>
+      <w:r>
+        <w:t xml:space="preserve"> </w:t>
+      </w:r>
+      <w:r>
+        <w:t>상태</w:t>
+      </w:r>
+      <w:r>
+        <w:t xml:space="preserve"> </w:t>
+      </w:r>
+      <w:r>
+        <w:t>변경</w:t>
+      </w:r>
+      <w:r>
+        <w:t xml:space="preserve"> </w:t>
+      </w:r>
+      <w:r>
+        <w:t>메서드는</w:t>
+      </w:r>
+      <w:r>
+        <w:t xml:space="preserve"> CsrfTokenRepository(</w:t>
+      </w:r>
+      <w:r>
+        <w:t>기본은</w:t>
+      </w:r>
+      <w:r>
+        <w:t xml:space="preserve"> </w:t>
+      </w:r>
+      <w:r>
+        <w:t>세션</w:t>
+      </w:r>
+      <w:r>
+        <w:t>)</w:t>
+      </w:r>
+      <w:r>
+        <w:t>에</w:t>
+      </w:r>
+      <w:r>
+        <w:t xml:space="preserve"> </w:t>
+      </w:r>
+      <w:r>
+        <w:t>저장된</w:t>
+      </w:r>
+      <w:r>
+        <w:t xml:space="preserve"> "</w:t>
+      </w:r>
+      <w:r>
+        <w:t>기대</w:t>
+      </w:r>
+      <w:r>
+        <w:t xml:space="preserve"> </w:t>
+      </w:r>
+      <w:r>
+        <w:t>토큰</w:t>
+      </w:r>
+      <w:r>
+        <w:t>"</w:t>
+      </w:r>
+      <w:r>
+        <w:t>을</w:t>
+      </w:r>
+      <w:r>
+        <w:t xml:space="preserve"> </w:t>
+      </w:r>
+      <w:r>
+        <w:t>가져온다</w:t>
+      </w:r>
+      <w:r>
+        <w:t>.</w:t>
       </w:r>
     </w:p>
     <w:p>
@@ -3525,7 +5563,85 @@
         <w:spacing w:after="80" w:line="272" w:lineRule="auto"/>
       </w:pPr>
       <w:r>
-        <w:t xml:space="preserve">3. 요청에 실려 온 토큰을 CsrfTokenRequestHandler로 찾는다 — 기본적으로 파라미터 _csrf 또는 헤더 X-CSRF-TOKEN 둘 다 확인한다.</w:t>
+        <w:t xml:space="preserve">3. </w:t>
+      </w:r>
+      <w:r>
+        <w:t>요청에</w:t>
+      </w:r>
+      <w:r>
+        <w:t xml:space="preserve"> </w:t>
+      </w:r>
+      <w:r>
+        <w:t>실려</w:t>
+      </w:r>
+      <w:r>
+        <w:t xml:space="preserve"> </w:t>
+      </w:r>
+      <w:r>
+        <w:t>온</w:t>
+      </w:r>
+      <w:r>
+        <w:t xml:space="preserve"> </w:t>
+      </w:r>
+      <w:r>
+        <w:t>토큰을</w:t>
+      </w:r>
+      <w:r>
+        <w:t xml:space="preserve"> CsrfTokenRequestHandler</w:t>
+      </w:r>
+      <w:r>
+        <w:t>로</w:t>
+      </w:r>
+      <w:r>
+        <w:t xml:space="preserve"> </w:t>
+      </w:r>
+      <w:r>
+        <w:t>찾는다</w:t>
+      </w:r>
+      <w:r>
+        <w:t xml:space="preserve"> — </w:t>
+      </w:r>
+      <w:r>
+        <w:t>기본적으로</w:t>
+      </w:r>
+      <w:r>
+        <w:t xml:space="preserve"> </w:t>
+      </w:r>
+      <w:r>
+        <w:t>파라미터</w:t>
+      </w:r>
+      <w:r>
+        <w:t xml:space="preserve"> _csrf </w:t>
+      </w:r>
+      <w:r>
+        <w:t>또는</w:t>
+      </w:r>
+      <w:r>
+        <w:t xml:space="preserve"> </w:t>
+      </w:r>
+      <w:r>
+        <w:t>헤더</w:t>
+      </w:r>
+      <w:r>
+        <w:t xml:space="preserve"> X-CSRF-TOKEN </w:t>
+      </w:r>
+      <w:r>
+        <w:t>둘</w:t>
+      </w:r>
+      <w:r>
+        <w:t xml:space="preserve"> </w:t>
+      </w:r>
+      <w:r>
+        <w:t>다</w:t>
+      </w:r>
+      <w:r>
+        <w:t xml:space="preserve"> </w:t>
+      </w:r>
+      <w:r>
+        <w:t>확인한다</w:t>
+      </w:r>
+      <w:r>
+        <w:t>.</w:t>
       </w:r>
     </w:p>
     <w:p>
@@ -3533,7 +5649,154 @@
         <w:spacing w:after="80" w:line="272" w:lineRule="auto"/>
       </w:pPr>
       <w:r>
-        <w:t xml:space="preserve">4. 기대 토큰과 요청 토큰을 비교한다. 토큰이 없으면 MissingCsrfTokenException, 값이 다르면 InvalidCsrfTokenException이 발생해 AccessDeniedHandler가 컨트롤러에 도달하기도 전에 403으로 거부한다. 일치하면 다음 필터로 넘어가 정상적으로 컨트롤러까지 도달한다.</w:t>
+        <w:t xml:space="preserve">4. </w:t>
+      </w:r>
+      <w:r>
+        <w:t>기대</w:t>
+      </w:r>
+      <w:r>
+        <w:t xml:space="preserve"> </w:t>
+      </w:r>
+      <w:r>
+        <w:t>토큰과</w:t>
+      </w:r>
+      <w:r>
+        <w:t xml:space="preserve"> </w:t>
+      </w:r>
+      <w:r>
+        <w:t>요청</w:t>
+      </w:r>
+      <w:r>
+        <w:t xml:space="preserve"> </w:t>
+      </w:r>
+      <w:r>
+        <w:t>토큰을</w:t>
+      </w:r>
+      <w:r>
+        <w:t xml:space="preserve"> </w:t>
+      </w:r>
+      <w:r>
+        <w:t>비교한다</w:t>
+      </w:r>
+      <w:r>
+        <w:t xml:space="preserve">. </w:t>
+      </w:r>
+      <w:r>
+        <w:t>토큰이</w:t>
+      </w:r>
+      <w:r>
+        <w:t xml:space="preserve"> </w:t>
+      </w:r>
+      <w:r>
+        <w:t>없으면</w:t>
+      </w:r>
+      <w:r>
+        <w:t xml:space="preserve"> MissingCsrfTokenException, </w:t>
+      </w:r>
+      <w:r>
+        <w:t>값이</w:t>
+      </w:r>
+      <w:r>
+        <w:t xml:space="preserve"> </w:t>
+      </w:r>
+      <w:r>
+        <w:t>다르면</w:t>
+      </w:r>
+      <w:r>
+        <w:t xml:space="preserve"> InvalidCsrfTokenException</w:t>
+      </w:r>
+      <w:r>
+        <w:t>이</w:t>
+      </w:r>
+      <w:r>
+        <w:t xml:space="preserve"> </w:t>
+      </w:r>
+      <w:r>
+        <w:t>발생해</w:t>
+      </w:r>
+      <w:r>
+        <w:t xml:space="preserve"> AccessDeniedHandler</w:t>
+      </w:r>
+      <w:r>
+        <w:t>가</w:t>
+      </w:r>
+      <w:r>
+        <w:t xml:space="preserve"> </w:t>
+      </w:r>
+      <w:r>
+        <w:t>컨트롤러에</w:t>
+      </w:r>
+      <w:r>
+        <w:t xml:space="preserve"> </w:t>
+      </w:r>
+      <w:r>
+        <w:t>도달하기도</w:t>
+      </w:r>
+      <w:r>
+        <w:t xml:space="preserve"> </w:t>
+      </w:r>
+      <w:r>
+        <w:t>전에</w:t>
+      </w:r>
+      <w:r>
+        <w:t xml:space="preserve"> 403</w:t>
+      </w:r>
+      <w:r>
+        <w:t>으로</w:t>
+      </w:r>
+      <w:r>
+        <w:t xml:space="preserve"> </w:t>
+      </w:r>
+      <w:r>
+        <w:t>거부한다</w:t>
+      </w:r>
+      <w:r>
+        <w:t xml:space="preserve">. </w:t>
+      </w:r>
+      <w:r>
+        <w:t>일치하면</w:t>
+      </w:r>
+      <w:r>
+        <w:t xml:space="preserve"> </w:t>
+      </w:r>
+      <w:r>
+        <w:t>다음</w:t>
+      </w:r>
+      <w:r>
+        <w:t xml:space="preserve"> </w:t>
+      </w:r>
+      <w:r>
+        <w:t>필터로</w:t>
+      </w:r>
+      <w:r>
+        <w:t xml:space="preserve"> </w:t>
+      </w:r>
+      <w:r>
+        <w:t>넘어가</w:t>
+      </w:r>
+      <w:r>
+        <w:t xml:space="preserve"> </w:t>
+      </w:r>
+      <w:r>
+        <w:t>정상적</w:t>
+      </w:r>
+      <w:r>
+        <w:t>으로</w:t>
+      </w:r>
+      <w:r>
+        <w:t xml:space="preserve"> </w:t>
+      </w:r>
+      <w:r>
+        <w:t>컨트롤러까지</w:t>
+      </w:r>
+      <w:r>
+        <w:t xml:space="preserve"> </w:t>
+      </w:r>
+      <w:r>
+        <w:t>도달한다</w:t>
+      </w:r>
+      <w:r>
+        <w:t>.</w:t>
       </w:r>
     </w:p>
     <w:p>
@@ -3541,7 +5804,237 @@
         <w:spacing w:after="80" w:line="272" w:lineRule="auto"/>
       </w:pPr>
       <w:r>
-        <w:t xml:space="preserve">세션 인증(Authentication) 여부와 이 토큰 비교는 서로 다른 필터가 담당하는 별개의 검사다. 그래서 로그인에 성공해 세션이 인증된 뒤에도 매 상태변경 요청마다 토큰 검사를 다시 통과해야 하며, 앞서 확인한 change-password 요청이 토큰 없이 403으로 막힌 것도 이 흐름 그대로다.</w:t>
+        <w:t>세션</w:t>
+      </w:r>
+      <w:r>
+        <w:t xml:space="preserve"> </w:t>
+      </w:r>
+      <w:r>
+        <w:t>인증</w:t>
+      </w:r>
+      <w:r>
+        <w:t xml:space="preserve">(Authentication) </w:t>
+      </w:r>
+      <w:r>
+        <w:t>여부와</w:t>
+      </w:r>
+      <w:r>
+        <w:t xml:space="preserve"> </w:t>
+      </w:r>
+      <w:r>
+        <w:t>이</w:t>
+      </w:r>
+      <w:r>
+        <w:t xml:space="preserve"> </w:t>
+      </w:r>
+      <w:r>
+        <w:t>토큰</w:t>
+      </w:r>
+      <w:r>
+        <w:t xml:space="preserve"> </w:t>
+      </w:r>
+      <w:r>
+        <w:t>비교는</w:t>
+      </w:r>
+      <w:r>
+        <w:t xml:space="preserve"> </w:t>
+      </w:r>
+      <w:r>
+        <w:t>서로</w:t>
+      </w:r>
+      <w:r>
+        <w:t xml:space="preserve"> </w:t>
+      </w:r>
+      <w:r>
+        <w:t>다른</w:t>
+      </w:r>
+      <w:r>
+        <w:t xml:space="preserve"> </w:t>
+      </w:r>
+      <w:r>
+        <w:t>필터가</w:t>
+      </w:r>
+      <w:r>
+        <w:t xml:space="preserve"> </w:t>
+      </w:r>
+      <w:r>
+        <w:t>담당하는</w:t>
+      </w:r>
+      <w:r>
+        <w:t xml:space="preserve"> </w:t>
+      </w:r>
+      <w:r>
+        <w:t>별개의</w:t>
+      </w:r>
+      <w:r>
+        <w:t xml:space="preserve"> </w:t>
+      </w:r>
+      <w:r>
+        <w:t>검사다</w:t>
+      </w:r>
+      <w:r>
+        <w:t xml:space="preserve">. </w:t>
+      </w:r>
+      <w:r>
+        <w:t>그래서</w:t>
+      </w:r>
+      <w:r>
+        <w:t xml:space="preserve"> </w:t>
+      </w:r>
+      <w:r>
+        <w:t>로그인에</w:t>
+      </w:r>
+      <w:r>
+        <w:t xml:space="preserve"> </w:t>
+      </w:r>
+      <w:r>
+        <w:t>성공해</w:t>
+      </w:r>
+      <w:r>
+        <w:t xml:space="preserve"> </w:t>
+      </w:r>
+      <w:r>
+        <w:t>세션이</w:t>
+      </w:r>
+      <w:r>
+        <w:t xml:space="preserve"> </w:t>
+      </w:r>
+      <w:r>
+        <w:t>인증된</w:t>
+      </w:r>
+      <w:r>
+        <w:t xml:space="preserve"> </w:t>
+      </w:r>
+      <w:r>
+        <w:t>뒤에도</w:t>
+      </w:r>
+      <w:r>
+        <w:t xml:space="preserve"> </w:t>
+      </w:r>
+      <w:r>
+        <w:t>매</w:t>
+      </w:r>
+      <w:r>
+        <w:t xml:space="preserve"> </w:t>
+      </w:r>
+      <w:r>
+        <w:t>상태변경</w:t>
+      </w:r>
+      <w:r>
+        <w:t xml:space="preserve"> </w:t>
+      </w:r>
+      <w:r>
+        <w:t>요청마다</w:t>
+      </w:r>
+      <w:r>
+        <w:t xml:space="preserve"> </w:t>
+      </w:r>
+      <w:r>
+        <w:t>토큰</w:t>
+      </w:r>
+      <w:r>
+        <w:t xml:space="preserve"> </w:t>
+      </w:r>
+      <w:r>
+        <w:t>검사를</w:t>
+      </w:r>
+      <w:r>
+        <w:t xml:space="preserve"> </w:t>
+      </w:r>
+      <w:r>
+        <w:t>다시</w:t>
+      </w:r>
+      <w:r>
+        <w:t xml:space="preserve"> </w:t>
+      </w:r>
+      <w:r>
+        <w:t>통과해야</w:t>
+      </w:r>
+      <w:r>
+        <w:t xml:space="preserve"> </w:t>
+      </w:r>
+      <w:r>
+        <w:t>하며</w:t>
+      </w:r>
+      <w:r>
+        <w:t xml:space="preserve">, </w:t>
+      </w:r>
+      <w:r>
+        <w:t>앞서</w:t>
+      </w:r>
+      <w:r>
+        <w:t xml:space="preserve"> </w:t>
+      </w:r>
+      <w:r>
+        <w:t>확인한</w:t>
+      </w:r>
+      <w:r>
+        <w:t xml:space="preserve"> change-password </w:t>
+      </w:r>
+      <w:r>
+        <w:t>요청이</w:t>
+      </w:r>
+      <w:r>
+        <w:t xml:space="preserve"> </w:t>
+      </w:r>
+      <w:r>
+        <w:t>토큰</w:t>
+      </w:r>
+      <w:r>
+        <w:t xml:space="preserve"> </w:t>
+      </w:r>
+      <w:r>
+        <w:t>없이</w:t>
+      </w:r>
+      <w:r>
+        <w:t xml:space="preserve"> 403</w:t>
+      </w:r>
+      <w:r>
+        <w:t>으로</w:t>
+      </w:r>
+      <w:r>
+        <w:t xml:space="preserve"> </w:t>
+      </w:r>
+      <w:r>
+        <w:t>막힌</w:t>
+      </w:r>
+      <w:r>
+        <w:t xml:space="preserve"> </w:t>
+      </w:r>
+      <w:r>
+        <w:t>것도</w:t>
+      </w:r>
+      <w:r>
+        <w:t xml:space="preserve"> </w:t>
+      </w:r>
+      <w:r>
+        <w:t>이</w:t>
+      </w:r>
+      <w:r>
+        <w:t xml:space="preserve"> </w:t>
+      </w:r>
+      <w:r>
+        <w:t>흐름</w:t>
+      </w:r>
+      <w:r>
+        <w:t xml:space="preserve"> </w:t>
+      </w:r>
+      <w:r>
+        <w:t>그대로</w:t>
+      </w:r>
+      <w:r>
+        <w:rPr>
+          <w:rFonts w:hint="eastAsia"/>
+        </w:rPr>
+        <w:t>이</w:t>
+      </w:r>
+      <w:bookmarkStart w:id="0" w:name="_GoBack"/>
+      <w:bookmarkEnd w:id="0"/>
+      <w:r>
+        <w:t>다</w:t>
+      </w:r>
+      <w:r>
+        <w:t>.</w:t>
       </w:r>
     </w:p>
     <w:p>
@@ -4508,196 +7001,7 @@
         <w:spacing w:after="80" w:line="272" w:lineRule="auto"/>
       </w:pPr>
       <w:r>
-        <w:t>아래</w:t>
-      </w:r>
-      <w:r>
-        <w:t xml:space="preserve"> curl </w:t>
-      </w:r>
-      <w:r>
-        <w:t>로</w:t>
-      </w:r>
-      <w:r>
-        <w:t xml:space="preserve"> </w:t>
-      </w:r>
-      <w:r>
-        <w:t>재현한다</w:t>
-      </w:r>
-      <w:r>
-        <w:t xml:space="preserve">. </w:t>
-      </w:r>
-      <w:r>
-        <w:t>실제</w:t>
-      </w:r>
-      <w:r>
-        <w:t xml:space="preserve"> </w:t>
-      </w:r>
-      <w:r>
-        <w:t>공격은</w:t>
-      </w:r>
-      <w:r>
-        <w:t xml:space="preserve"> </w:t>
-      </w:r>
-      <w:r>
-        <w:t>마지막</w:t>
-      </w:r>
-      <w:r>
-        <w:t xml:space="preserve"> GET </w:t>
-      </w:r>
-      <w:r>
-        <w:t>한</w:t>
-      </w:r>
-      <w:r>
-        <w:t xml:space="preserve"> </w:t>
-      </w:r>
-      <w:r>
-        <w:t>줄</w:t>
-      </w:r>
-      <w:r>
-        <w:t>(5)</w:t>
-      </w:r>
-      <w:r>
-        <w:t>뿐이고</w:t>
-      </w:r>
-      <w:r>
-        <w:t xml:space="preserve">, </w:t>
-      </w:r>
-      <w:r>
-        <w:t>앞</w:t>
-      </w:r>
-      <w:r>
-        <w:t xml:space="preserve"> </w:t>
-      </w:r>
-      <w:r>
-        <w:t>단계</w:t>
-      </w:r>
-      <w:r>
-        <w:t>(1~4)</w:t>
-      </w:r>
-      <w:r>
-        <w:t>는</w:t>
-      </w:r>
-      <w:r>
-        <w:t xml:space="preserve"> </w:t>
-      </w:r>
-      <w:r>
-        <w:t>그</w:t>
-      </w:r>
-      <w:r>
-        <w:t xml:space="preserve"> </w:t>
-      </w:r>
-      <w:r>
-        <w:t>조건</w:t>
-      </w:r>
-      <w:r>
-        <w:t>(</w:t>
-      </w:r>
-      <w:r>
-        <w:t>로그인</w:t>
-      </w:r>
-      <w:r>
-        <w:t xml:space="preserve"> </w:t>
-      </w:r>
-      <w:r>
-        <w:t>세션</w:t>
-      </w:r>
-      <w:r>
-        <w:t>·</w:t>
-      </w:r>
-      <w:r>
-        <w:t>삭제</w:t>
-      </w:r>
-      <w:r>
-        <w:t xml:space="preserve"> </w:t>
-      </w:r>
-      <w:r>
-        <w:t>대상</w:t>
-      </w:r>
-      <w:r>
-        <w:t>)</w:t>
-      </w:r>
-      <w:r>
-        <w:t>을</w:t>
-      </w:r>
-      <w:r>
-        <w:t xml:space="preserve"> curl </w:t>
-      </w:r>
-      <w:r>
-        <w:t>로</w:t>
-      </w:r>
-      <w:r>
-        <w:t xml:space="preserve"> </w:t>
-      </w:r>
-      <w:r>
-        <w:t>갖추는</w:t>
-      </w:r>
-      <w:r>
-        <w:t xml:space="preserve"> </w:t>
-      </w:r>
-      <w:r>
-        <w:t>준비다</w:t>
-      </w:r>
-      <w:r>
-        <w:t xml:space="preserve">. python -c </w:t>
-      </w:r>
-      <w:r>
-        <w:t>는</w:t>
-      </w:r>
-      <w:r>
-        <w:t xml:space="preserve"> </w:t>
-      </w:r>
-      <w:r>
-        <w:t>응답</w:t>
-      </w:r>
-      <w:r>
-        <w:t xml:space="preserve"> JSON </w:t>
-      </w:r>
-      <w:r>
-        <w:t>에서</w:t>
-      </w:r>
-      <w:r>
-        <w:t xml:space="preserve"> </w:t>
-      </w:r>
-      <w:r>
-        <w:t>값</w:t>
-      </w:r>
-      <w:r>
-        <w:t xml:space="preserve"> </w:t>
-      </w:r>
-      <w:r>
-        <w:t>하나</w:t>
-      </w:r>
-      <w:r>
-        <w:t>(accessToken/id)</w:t>
-      </w:r>
-      <w:r>
-        <w:t>를</w:t>
-      </w:r>
-      <w:r>
-        <w:t xml:space="preserve">, grep </w:t>
-      </w:r>
-      <w:r>
-        <w:t>은</w:t>
-      </w:r>
-      <w:r>
-        <w:t xml:space="preserve"> HTML </w:t>
-      </w:r>
-      <w:r>
-        <w:t>에서</w:t>
-      </w:r>
-      <w:r>
-        <w:t xml:space="preserve"> _csrf </w:t>
-      </w:r>
-      <w:r>
-        <w:t>값을</w:t>
-      </w:r>
-      <w:r>
-        <w:t xml:space="preserve"> </w:t>
-      </w:r>
-      <w:r>
-        <w:t>뽑는다</w:t>
-      </w:r>
-      <w:r>
-        <w:t>.</w:t>
+        <w:t>아래 curl 로 재현한다. 실제 공격은 마지막 GET 한 줄(5)뿐이고, 앞 단계(1~4)는 그 조건(로그인 세션·삭제 대상)을 curl 로 갖추는 준비다. python -c 는 응답 JSON 에서 값 하나(accessToken/id)를, grep 은 HTML 에서 _csrf 값을 뽑는다.</w:t>
       </w:r>
     </w:p>
     <w:p>
@@ -5010,15 +7314,7 @@
           <w:sz w:val="16"/>
           <w:szCs w:val="16"/>
         </w:rPr>
-        <w:t>로그</w:t>
-      </w:r>
-      <w:r>
-        <w:rPr>
-          <w:rFonts w:ascii="Consolas" w:hAnsi="Consolas"/>
-          <w:sz w:val="16"/>
-          <w:szCs w:val="16"/>
-        </w:rPr>
-        <w:t>인에도</w:t>
+        <w:t>로그인에도</w:t>
       </w:r>
       <w:r>
         <w:rPr>
@@ -5186,15 +7482,7 @@
           <w:sz w:val="16"/>
           <w:szCs w:val="16"/>
         </w:rPr>
-        <w:t xml:space="preserve">  --data-urlencode "username=user@aa.com" --data-urlencode "password=pwd2" -</w:t>
-      </w:r>
-      <w:r>
-        <w:rPr>
-          <w:rFonts w:ascii="Consolas" w:hAnsi="Consolas"/>
-          <w:sz w:val="16"/>
-          <w:szCs w:val="16"/>
-        </w:rPr>
-        <w:t>-data-urlencode "_csrf=$CSRF"</w:t>
+        <w:t xml:space="preserve">  --data-urlencode "username=user@aa.com" --data-urlencode "password=pwd2" --data-urlencode "_csrf=$CSRF"</w:t>
       </w:r>
     </w:p>
     <w:p>
@@ -5299,16 +7587,7 @@
         <w:spacing w:after="80" w:line="272" w:lineRule="auto"/>
       </w:pPr>
       <w:r>
-        <w:t>명령</w:t>
-      </w:r>
-      <w:r>
-        <w:t xml:space="preserve"> </w:t>
-      </w:r>
-      <w:r>
-        <w:t>해설</w:t>
-      </w:r>
-      <w:r>
-        <w:t xml:space="preserve"> :</w:t>
+        <w:t>명령 해설 :</w:t>
       </w:r>
     </w:p>
     <w:tbl>
@@ -5398,47 +7677,7 @@
                 <w:sz w:val="16"/>
                 <w:szCs w:val="16"/>
               </w:rPr>
-              <w:t>하는</w:t>
-            </w:r>
-            <w:r>
-              <w:rPr>
-                <w:b/>
-                <w:bCs/>
-                <w:color w:val="FFFFFF"/>
-                <w:sz w:val="16"/>
-                <w:szCs w:val="16"/>
-              </w:rPr>
-              <w:t xml:space="preserve"> </w:t>
-            </w:r>
-            <w:r>
-              <w:rPr>
-                <w:b/>
-                <w:bCs/>
-                <w:color w:val="FFFFFF"/>
-                <w:sz w:val="16"/>
-                <w:szCs w:val="16"/>
-              </w:rPr>
-              <w:t>일</w:t>
-            </w:r>
-            <w:r>
-              <w:rPr>
-                <w:b/>
-                <w:bCs/>
-                <w:color w:val="FFFFFF"/>
-                <w:sz w:val="16"/>
-                <w:szCs w:val="16"/>
-              </w:rPr>
-              <w:t xml:space="preserve"> / </w:t>
-            </w:r>
-            <w:r>
-              <w:rPr>
-                <w:b/>
-                <w:bCs/>
-                <w:color w:val="FFFFFF"/>
-                <w:sz w:val="16"/>
-                <w:szCs w:val="16"/>
-              </w:rPr>
-              <w:t>이유</w:t>
+              <w:t>하는 일 / 이유</w:t>
             </w:r>
           </w:p>
         </w:tc>
@@ -5501,119 +7740,7 @@
                 <w:sz w:val="16"/>
                 <w:szCs w:val="16"/>
               </w:rPr>
-              <w:t>관리자</w:t>
-            </w:r>
-            <w:r>
-              <w:rPr>
-                <w:sz w:val="16"/>
-                <w:szCs w:val="16"/>
-              </w:rPr>
-              <w:t xml:space="preserve"> JWT </w:t>
-            </w:r>
-            <w:r>
-              <w:rPr>
-                <w:sz w:val="16"/>
-                <w:szCs w:val="16"/>
-              </w:rPr>
-              <w:t>발급</w:t>
-            </w:r>
-            <w:r>
-              <w:rPr>
-                <w:sz w:val="16"/>
-                <w:szCs w:val="16"/>
-              </w:rPr>
-              <w:t xml:space="preserve">. User </w:t>
-            </w:r>
-            <w:r>
-              <w:rPr>
-                <w:sz w:val="16"/>
-                <w:szCs w:val="16"/>
-              </w:rPr>
-              <w:t>생성</w:t>
-            </w:r>
-            <w:r>
-              <w:rPr>
-                <w:sz w:val="16"/>
-                <w:szCs w:val="16"/>
-              </w:rPr>
-              <w:t xml:space="preserve"> API(/api/users)</w:t>
-            </w:r>
-            <w:r>
-              <w:rPr>
-                <w:sz w:val="16"/>
-                <w:szCs w:val="16"/>
-              </w:rPr>
-              <w:t>가</w:t>
-            </w:r>
-            <w:r>
-              <w:rPr>
-                <w:sz w:val="16"/>
-                <w:szCs w:val="16"/>
-              </w:rPr>
-              <w:t xml:space="preserve"> </w:t>
-            </w:r>
-            <w:r>
-              <w:rPr>
-                <w:sz w:val="16"/>
-                <w:szCs w:val="16"/>
-              </w:rPr>
-              <w:t>인증을</w:t>
-            </w:r>
-            <w:r>
-              <w:rPr>
-                <w:sz w:val="16"/>
-                <w:szCs w:val="16"/>
-              </w:rPr>
-              <w:t xml:space="preserve"> </w:t>
-            </w:r>
-            <w:r>
-              <w:rPr>
-                <w:sz w:val="16"/>
-                <w:szCs w:val="16"/>
-              </w:rPr>
-              <w:t>요구하므로</w:t>
-            </w:r>
-            <w:r>
-              <w:rPr>
-                <w:sz w:val="16"/>
-                <w:szCs w:val="16"/>
-              </w:rPr>
-              <w:t xml:space="preserve"> </w:t>
-            </w:r>
-            <w:r>
-              <w:rPr>
-                <w:sz w:val="16"/>
-                <w:szCs w:val="16"/>
-              </w:rPr>
-              <w:t>먼저</w:t>
-            </w:r>
-            <w:r>
-              <w:rPr>
-                <w:sz w:val="16"/>
-                <w:szCs w:val="16"/>
-              </w:rPr>
-              <w:t xml:space="preserve"> </w:t>
-            </w:r>
-            <w:r>
-              <w:rPr>
-                <w:sz w:val="16"/>
-                <w:szCs w:val="16"/>
-              </w:rPr>
-              <w:t>토큰을</w:t>
-            </w:r>
-            <w:r>
-              <w:rPr>
-                <w:sz w:val="16"/>
-                <w:szCs w:val="16"/>
-              </w:rPr>
-              <w:t xml:space="preserve"> </w:t>
-            </w:r>
-            <w:r>
-              <w:rPr>
-                <w:sz w:val="16"/>
-                <w:szCs w:val="16"/>
-              </w:rPr>
-              <w:t>받는다</w:t>
+              <w:t>관리자 JWT 발급. User 생성 API(/api/users)가 인증을 요구하므로 먼저 토큰을 받는다</w:t>
             </w:r>
           </w:p>
         </w:tc>
@@ -5676,140 +7803,7 @@
                 <w:sz w:val="16"/>
                 <w:szCs w:val="16"/>
               </w:rPr>
-              <w:t>삭제할</w:t>
-            </w:r>
-            <w:r>
-              <w:rPr>
-                <w:sz w:val="16"/>
-                <w:szCs w:val="16"/>
-              </w:rPr>
-              <w:t xml:space="preserve"> </w:t>
-            </w:r>
-            <w:r>
-              <w:rPr>
-                <w:sz w:val="16"/>
-                <w:szCs w:val="16"/>
-              </w:rPr>
-              <w:t>테스트</w:t>
-            </w:r>
-            <w:r>
-              <w:rPr>
-                <w:sz w:val="16"/>
-                <w:szCs w:val="16"/>
-              </w:rPr>
-              <w:t xml:space="preserve"> User </w:t>
-            </w:r>
-            <w:r>
-              <w:rPr>
-                <w:sz w:val="16"/>
-                <w:szCs w:val="16"/>
-              </w:rPr>
-              <w:t>생성</w:t>
-            </w:r>
-            <w:r>
-              <w:rPr>
-                <w:sz w:val="16"/>
-                <w:szCs w:val="16"/>
-              </w:rPr>
-              <w:t xml:space="preserve">, </w:t>
-            </w:r>
-            <w:r>
-              <w:rPr>
-                <w:sz w:val="16"/>
-                <w:szCs w:val="16"/>
-              </w:rPr>
-              <w:t>응답</w:t>
-            </w:r>
-            <w:r>
-              <w:rPr>
-                <w:sz w:val="16"/>
-                <w:szCs w:val="16"/>
-              </w:rPr>
-              <w:t xml:space="preserve"> JSON </w:t>
-            </w:r>
-            <w:r>
-              <w:rPr>
-                <w:sz w:val="16"/>
-                <w:szCs w:val="16"/>
-              </w:rPr>
-              <w:t>의</w:t>
-            </w:r>
-            <w:r>
-              <w:rPr>
-                <w:sz w:val="16"/>
-                <w:szCs w:val="16"/>
-              </w:rPr>
-              <w:t xml:space="preserve"> id </w:t>
-            </w:r>
-            <w:r>
-              <w:rPr>
-                <w:sz w:val="16"/>
-                <w:szCs w:val="16"/>
-              </w:rPr>
-              <w:t>를</w:t>
-            </w:r>
-            <w:r>
-              <w:rPr>
-                <w:sz w:val="16"/>
-                <w:szCs w:val="16"/>
-              </w:rPr>
-              <w:t xml:space="preserve"> $ID </w:t>
-            </w:r>
-            <w:r>
-              <w:rPr>
-                <w:sz w:val="16"/>
-                <w:szCs w:val="16"/>
-              </w:rPr>
-              <w:t>에</w:t>
-            </w:r>
-            <w:r>
-              <w:rPr>
-                <w:sz w:val="16"/>
-                <w:szCs w:val="16"/>
-              </w:rPr>
-              <w:t xml:space="preserve"> </w:t>
-            </w:r>
-            <w:r>
-              <w:rPr>
-                <w:sz w:val="16"/>
-                <w:szCs w:val="16"/>
-              </w:rPr>
-              <w:t>저장</w:t>
-            </w:r>
-            <w:r>
-              <w:rPr>
-                <w:sz w:val="16"/>
-                <w:szCs w:val="16"/>
-              </w:rPr>
-              <w:t>(</w:t>
-            </w:r>
-            <w:r>
-              <w:rPr>
-                <w:sz w:val="16"/>
-                <w:szCs w:val="16"/>
-              </w:rPr>
-              <w:t>실데이터</w:t>
-            </w:r>
-            <w:r>
-              <w:rPr>
-                <w:sz w:val="16"/>
-                <w:szCs w:val="16"/>
-              </w:rPr>
-              <w:t xml:space="preserve"> </w:t>
-            </w:r>
-            <w:r>
-              <w:rPr>
-                <w:sz w:val="16"/>
-                <w:szCs w:val="16"/>
-              </w:rPr>
-              <w:t>보호</w:t>
-            </w:r>
-            <w:r>
-              <w:rPr>
-                <w:sz w:val="16"/>
-                <w:szCs w:val="16"/>
-              </w:rPr>
-              <w:t>)</w:t>
+              <w:t>삭제할 테스트 User 생성, 응답 JSON 의 id 를 $ID 에 저장(실데이터 보호)</w:t>
             </w:r>
           </w:p>
         </w:tc>
@@ -5872,147 +7866,7 @@
                 <w:sz w:val="16"/>
                 <w:szCs w:val="16"/>
               </w:rPr>
-              <w:t>로그인</w:t>
-            </w:r>
-            <w:r>
-              <w:rPr>
-                <w:sz w:val="16"/>
-                <w:szCs w:val="16"/>
-              </w:rPr>
-              <w:t xml:space="preserve"> </w:t>
-            </w:r>
-            <w:r>
-              <w:rPr>
-                <w:sz w:val="16"/>
-                <w:szCs w:val="16"/>
-              </w:rPr>
-              <w:t>페이지의</w:t>
-            </w:r>
-            <w:r>
-              <w:rPr>
-                <w:sz w:val="16"/>
-                <w:szCs w:val="16"/>
-              </w:rPr>
-              <w:t xml:space="preserve"> hidden _csrf </w:t>
-            </w:r>
-            <w:r>
-              <w:rPr>
-                <w:sz w:val="16"/>
-                <w:szCs w:val="16"/>
-              </w:rPr>
-              <w:t>값</w:t>
-            </w:r>
-            <w:r>
-              <w:rPr>
-                <w:sz w:val="16"/>
-                <w:szCs w:val="16"/>
-              </w:rPr>
-              <w:t xml:space="preserve"> </w:t>
-            </w:r>
-            <w:r>
-              <w:rPr>
-                <w:sz w:val="16"/>
-                <w:szCs w:val="16"/>
-              </w:rPr>
-              <w:t>추출</w:t>
-            </w:r>
-            <w:r>
-              <w:rPr>
-                <w:sz w:val="16"/>
-                <w:szCs w:val="16"/>
-              </w:rPr>
-              <w:t xml:space="preserve">. CSRF </w:t>
-            </w:r>
-            <w:r>
-              <w:rPr>
-                <w:sz w:val="16"/>
-                <w:szCs w:val="16"/>
-              </w:rPr>
-              <w:t>가</w:t>
-            </w:r>
-            <w:r>
-              <w:rPr>
-                <w:sz w:val="16"/>
-                <w:szCs w:val="16"/>
-              </w:rPr>
-              <w:t xml:space="preserve"> </w:t>
-            </w:r>
-            <w:r>
-              <w:rPr>
-                <w:sz w:val="16"/>
-                <w:szCs w:val="16"/>
-              </w:rPr>
-              <w:t>켜져</w:t>
-            </w:r>
-            <w:r>
-              <w:rPr>
-                <w:sz w:val="16"/>
-                <w:szCs w:val="16"/>
-              </w:rPr>
-              <w:t xml:space="preserve"> </w:t>
-            </w:r>
-            <w:r>
-              <w:rPr>
-                <w:sz w:val="16"/>
-                <w:szCs w:val="16"/>
-              </w:rPr>
-              <w:t>있어</w:t>
-            </w:r>
-            <w:r>
-              <w:rPr>
-                <w:sz w:val="16"/>
-                <w:szCs w:val="16"/>
-              </w:rPr>
-              <w:t xml:space="preserve"> </w:t>
-            </w:r>
-            <w:r>
-              <w:rPr>
-                <w:sz w:val="16"/>
-                <w:szCs w:val="16"/>
-              </w:rPr>
-              <w:t>로그인</w:t>
-            </w:r>
-            <w:r>
-              <w:rPr>
-                <w:sz w:val="16"/>
-                <w:szCs w:val="16"/>
-              </w:rPr>
-              <w:t xml:space="preserve"> POST </w:t>
-            </w:r>
-            <w:r>
-              <w:rPr>
-                <w:sz w:val="16"/>
-                <w:szCs w:val="16"/>
-              </w:rPr>
-              <w:t>에도</w:t>
-            </w:r>
-            <w:r>
-              <w:rPr>
-                <w:sz w:val="16"/>
-                <w:szCs w:val="16"/>
-              </w:rPr>
-              <w:t xml:space="preserve"> </w:t>
-            </w:r>
-            <w:r>
-              <w:rPr>
-                <w:sz w:val="16"/>
-                <w:szCs w:val="16"/>
-              </w:rPr>
-              <w:t>토큰이</w:t>
-            </w:r>
-            <w:r>
-              <w:rPr>
-                <w:sz w:val="16"/>
-                <w:szCs w:val="16"/>
-              </w:rPr>
-              <w:t xml:space="preserve"> </w:t>
-            </w:r>
-            <w:r>
-              <w:rPr>
-                <w:sz w:val="16"/>
-                <w:szCs w:val="16"/>
-              </w:rPr>
-              <w:t>필요</w:t>
+              <w:t>로그인 페이지의 hidden _csrf 값 추출. CSRF 가 켜져 있어 로그인 POST 에도 토큰이 필요</w:t>
             </w:r>
           </w:p>
         </w:tc>
@@ -6075,77 +7929,7 @@
                 <w:sz w:val="16"/>
                 <w:szCs w:val="16"/>
               </w:rPr>
-              <w:t xml:space="preserve">username·password·_csrf </w:t>
-            </w:r>
-            <w:r>
-              <w:rPr>
-                <w:sz w:val="16"/>
-                <w:szCs w:val="16"/>
-              </w:rPr>
-              <w:t>로</w:t>
-            </w:r>
-            <w:r>
-              <w:rPr>
-                <w:sz w:val="16"/>
-                <w:szCs w:val="16"/>
-              </w:rPr>
-              <w:t xml:space="preserve"> </w:t>
-            </w:r>
-            <w:r>
-              <w:rPr>
-                <w:sz w:val="16"/>
-                <w:szCs w:val="16"/>
-              </w:rPr>
-              <w:t>세션</w:t>
-            </w:r>
-            <w:r>
-              <w:rPr>
-                <w:sz w:val="16"/>
-                <w:szCs w:val="16"/>
-              </w:rPr>
-              <w:t xml:space="preserve"> </w:t>
-            </w:r>
-            <w:r>
-              <w:rPr>
-                <w:sz w:val="16"/>
-                <w:szCs w:val="16"/>
-              </w:rPr>
-              <w:t>로그인</w:t>
-            </w:r>
-            <w:r>
-              <w:rPr>
-                <w:sz w:val="16"/>
-                <w:szCs w:val="16"/>
-              </w:rPr>
-              <w:t xml:space="preserve"> → </w:t>
-            </w:r>
-            <w:r>
-              <w:rPr>
-                <w:sz w:val="16"/>
-                <w:szCs w:val="16"/>
-              </w:rPr>
-              <w:t>쿠키</w:t>
-            </w:r>
-            <w:r>
-              <w:rPr>
-                <w:sz w:val="16"/>
-                <w:szCs w:val="16"/>
-              </w:rPr>
-              <w:t xml:space="preserve"> JSESSIONID </w:t>
-            </w:r>
-            <w:r>
-              <w:rPr>
-                <w:sz w:val="16"/>
-                <w:szCs w:val="16"/>
-              </w:rPr>
-              <w:t>획득</w:t>
-            </w:r>
-            <w:r>
-              <w:rPr>
-                <w:sz w:val="16"/>
-                <w:szCs w:val="16"/>
-              </w:rPr>
-              <w:t>(302)</w:t>
+              <w:t>username·password·_csrf 로 세션 로그인 → 쿠키 JSESSIONID 획득(302)</w:t>
             </w:r>
           </w:p>
         </w:tc>
@@ -6208,175 +7992,7 @@
                 <w:sz w:val="16"/>
                 <w:szCs w:val="16"/>
               </w:rPr>
-              <w:t>세션</w:t>
-            </w:r>
-            <w:r>
-              <w:rPr>
-                <w:sz w:val="16"/>
-                <w:szCs w:val="16"/>
-              </w:rPr>
-              <w:t xml:space="preserve"> </w:t>
-            </w:r>
-            <w:r>
-              <w:rPr>
-                <w:sz w:val="16"/>
-                <w:szCs w:val="16"/>
-              </w:rPr>
-              <w:t>쿠키만</w:t>
-            </w:r>
-            <w:r>
-              <w:rPr>
-                <w:sz w:val="16"/>
-                <w:szCs w:val="16"/>
-              </w:rPr>
-              <w:t xml:space="preserve">(-b $JAR, _csrf </w:t>
-            </w:r>
-            <w:r>
-              <w:rPr>
-                <w:sz w:val="16"/>
-                <w:szCs w:val="16"/>
-              </w:rPr>
-              <w:t>없음</w:t>
-            </w:r>
-            <w:r>
-              <w:rPr>
-                <w:sz w:val="16"/>
-                <w:szCs w:val="16"/>
-              </w:rPr>
-              <w:t xml:space="preserve">) </w:t>
-            </w:r>
-            <w:r>
-              <w:rPr>
-                <w:sz w:val="16"/>
-                <w:szCs w:val="16"/>
-              </w:rPr>
-              <w:t>실어</w:t>
-            </w:r>
-            <w:r>
-              <w:rPr>
-                <w:sz w:val="16"/>
-                <w:szCs w:val="16"/>
-              </w:rPr>
-              <w:t xml:space="preserve"> GET </w:t>
-            </w:r>
-            <w:r>
-              <w:rPr>
-                <w:sz w:val="16"/>
-                <w:szCs w:val="16"/>
-              </w:rPr>
-              <w:t>삭제</w:t>
-            </w:r>
-            <w:r>
-              <w:rPr>
-                <w:sz w:val="16"/>
-                <w:szCs w:val="16"/>
-              </w:rPr>
-              <w:t xml:space="preserve">. GET </w:t>
-            </w:r>
-            <w:r>
-              <w:rPr>
-                <w:sz w:val="16"/>
-                <w:szCs w:val="16"/>
-              </w:rPr>
-              <w:t>이라</w:t>
-            </w:r>
-            <w:r>
-              <w:rPr>
-                <w:sz w:val="16"/>
-                <w:szCs w:val="16"/>
-              </w:rPr>
-              <w:t xml:space="preserve"> </w:t>
-            </w:r>
-            <w:r>
-              <w:rPr>
-                <w:sz w:val="16"/>
-                <w:szCs w:val="16"/>
-              </w:rPr>
-              <w:t>토큰</w:t>
-            </w:r>
-            <w:r>
-              <w:rPr>
-                <w:sz w:val="16"/>
-                <w:szCs w:val="16"/>
-              </w:rPr>
-              <w:t xml:space="preserve"> </w:t>
-            </w:r>
-            <w:r>
-              <w:rPr>
-                <w:sz w:val="16"/>
-                <w:szCs w:val="16"/>
-              </w:rPr>
-              <w:t>검증을</w:t>
-            </w:r>
-            <w:r>
-              <w:rPr>
-                <w:sz w:val="16"/>
-                <w:szCs w:val="16"/>
-              </w:rPr>
-              <w:t xml:space="preserve"> </w:t>
-            </w:r>
-            <w:r>
-              <w:rPr>
-                <w:sz w:val="16"/>
-                <w:szCs w:val="16"/>
-              </w:rPr>
-              <w:t>건너뛰어</w:t>
-            </w:r>
-            <w:r>
-              <w:rPr>
-                <w:sz w:val="16"/>
-                <w:szCs w:val="16"/>
-              </w:rPr>
-              <w:t xml:space="preserve"> 302 </w:t>
-            </w:r>
-            <w:r>
-              <w:rPr>
-                <w:sz w:val="16"/>
-                <w:szCs w:val="16"/>
-              </w:rPr>
-              <w:t>삭제</w:t>
-            </w:r>
-            <w:r>
-              <w:rPr>
-                <w:sz w:val="16"/>
-                <w:szCs w:val="16"/>
-              </w:rPr>
-              <w:t xml:space="preserve"> = &lt;img&gt; </w:t>
-            </w:r>
-            <w:r>
-              <w:rPr>
-                <w:sz w:val="16"/>
-                <w:szCs w:val="16"/>
-              </w:rPr>
-              <w:t>가</w:t>
-            </w:r>
-            <w:r>
-              <w:rPr>
-                <w:sz w:val="16"/>
-                <w:szCs w:val="16"/>
-              </w:rPr>
-              <w:t xml:space="preserve"> </w:t>
-            </w:r>
-            <w:r>
-              <w:rPr>
-                <w:sz w:val="16"/>
-                <w:szCs w:val="16"/>
-              </w:rPr>
-              <w:t>하는</w:t>
-            </w:r>
-            <w:r>
-              <w:rPr>
-                <w:sz w:val="16"/>
-                <w:szCs w:val="16"/>
-              </w:rPr>
-              <w:t xml:space="preserve"> </w:t>
-            </w:r>
-            <w:r>
-              <w:rPr>
-                <w:sz w:val="16"/>
-                <w:szCs w:val="16"/>
-              </w:rPr>
-              <w:t>일</w:t>
+              <w:t>세션 쿠키만(-b $JAR, _csrf 없음) 실어 GET 삭제. GET 이라 토큰 검증을 건너뛰어 302 삭제 = &lt;img&gt; 가 하는 일</w:t>
             </w:r>
           </w:p>
         </w:tc>
@@ -7071,12 +8687,12 @@
       </w:r>
     </w:p>
     <w:sectPr>
-      <w:headerReference w:type="even" r:id="rId7"/>
-      <w:headerReference w:type="default" r:id="rId8"/>
-      <w:footerReference w:type="even" r:id="rId9"/>
-      <w:footerReference w:type="default" r:id="rId10"/>
-      <w:headerReference w:type="first" r:id="rId11"/>
-      <w:footerReference w:type="first" r:id="rId12"/>
+      <w:headerReference w:type="even" r:id="rId9"/>
+      <w:headerReference w:type="default" r:id="rId10"/>
+      <w:footerReference w:type="even" r:id="rId11"/>
+      <w:footerReference w:type="default" r:id="rId12"/>
+      <w:headerReference w:type="first" r:id="rId13"/>
+      <w:footerReference w:type="first" r:id="rId14"/>
       <w:pgSz w:w="11906" w:h="16838"/>
       <w:pgMar w:top="1200" w:right="1200" w:bottom="1200" w:left="1200" w:header="708" w:footer="708" w:gutter="0"/>
       <w:cols w:space="720"/>
@@ -7174,6 +8790,7 @@
         <w:docPartUnique/>
       </w:docPartObj>
     </w:sdtPr>
+    <w:sdtEndPr/>
     <w:sdtContent>
       <w:p>
         <w:pPr>
@@ -7194,7 +8811,7 @@
             <w:noProof/>
             <w:lang w:val="ko-KR"/>
           </w:rPr>
-          <w:t>6</w:t>
+          <w:t>8</w:t>
         </w:r>
         <w:r>
           <w:fldChar w:fldCharType="end"/>

</xml_diff>